<commit_message>
Proofcheck Flour Play Turkish: SIGNIFICANT (77 edits)
Co-Authored-By: Claude Opus 5.5 <noreply@anthropic.com>
Claude-Session: https://claude.ai/code/session_012Cm8JxdqzjuttdUSdkQCUg
</commit_message>
<xml_diff>
--- a/translated/corrected/Flour Play - ASSEMBLED - FORMATTED_Turkish.docx
+++ b/translated/corrected/Flour Play - ASSEMBLED - FORMATTED_Turkish.docx
@@ -114,7 +114,7 @@
     <w:p/>
     <w:p>
       <w:r>
-        <w:t xml:space="preserve">Greta kırk yıldır aynı tarçınlı çörekten yapıyordu. Kocasının cenazesinden sonraki sabah da o çörekten yapmıştı, çünkü elleriyle başka ne yapacağını bilememişti. Bu hafta fırınından çıkan çörek ekşi oluyor, sonraki parti de öyle, ondan sonraki de.</w:t>
+        <w:t xml:space="preserve">Greta kırk yıldır aynı tarçınlı çörekten yapıyor. Kocasının cenazesinden sonraki sabah da o çörekten yapmıştı, çünkü elleriyle başka ne yapacağını bilememişti. Bu hafta fırınından çıkan çörek ekşi oluyor, sonraki parti de öyle, ondan sonraki de.</w:t>
       </w:r>
     </w:p>
     <w:p/>
@@ -197,7 +197,7 @@
     <w:p/>
     <w:p>
       <w:r>
-        <w:t xml:space="preserve">Dot, çelengi herkesten bir buçuk kat daha büyük ve iki kat daha sıkı olmasına rağmen çelenginden gözünü hiç ayırmadan, o kısa ve kuru gülüşüyle çemberin öbür ucundan güldü. — Sen buraya ilk adımını attığın günden beri numaranın peşinde. Seksenli yıllarda da benimkini çalmaya çalışmıştı. — Dot iri yarı, kır saçlı biriydi ve pek az sözle çok şey anlatırdı. Onlarca yıldır o dükkânda çelenk yapıyordu. Bunu ellerinden anlamak mümkündü. Elleri hiç durmaz ve asla bocalamazdı.</w:t>
+        <w:t xml:space="preserve">Dot, herkesinkinden şimdiden bir buçuk kat büyük ve iki kat sık olan çelenginden gözünü hiç ayırmadan, o kısa ve kuru gülüşüyle çemberin öbür ucundan güldü. — Sen buraya ilk adımını attığın günden beri numaranın peşinde. Seksenli yıllarda da benimkini çalmaya çalışmıştı. — Dot iri yarı, kır saçlı biriydi ve pek az sözle çok şey anlatırdı. Onlarca yıldır o dükkânda çelenk yapıyordu. Bunu ellerinden anlamak mümkündü. Elleri hiç durmaz ve asla bocalamazdı.</w:t>
       </w:r>
     </w:p>
     <w:p/>
@@ -251,7 +251,7 @@
     <w:p/>
     <w:p>
       <w:r>
-        <w:t xml:space="preserve">— Kimse kalkmasın, diye duyurdu ki zaten hiç kimse kılını bile kıpırdatmaya niyetli görünmüyordu. Şapka kutusu büyüklüğünde bir pastane kutusunu kozalaklarla kurdelenin arasına, masanın üzerine bıraktı ve bizi süzmek için ellerini beline koydu. Greta caddenin ilerisindeki Holly Jolly Bakery’nin sahibiydi ve donutları gibi yuvarlak hatlı, baştan aşağı un içinde kalmış biriydi. Bu sabah önlüğünün üzerinde fırçalamaya zahmet etmediği unlar duruyordu. — Daha bir saat önce fırından çikolatalı cevizli kek tepsisi çıkardım ve kendi kendime dedim ki, Greta, bu sabah soğuk bir dükkânda oturup kendilerini yararlı kılan kimler var acaba, cevap da hepiniz oldunuz, buyurun.</w:t>
+        <w:t xml:space="preserve">— Kimse kalkmasın, diye duyurdu ki zaten hiç kimse kılını bile kıpırdatmaya niyetli görünmüyordu. Şapka kutusu büyüklüğünde bir fırın kutusunu kozalaklarla kurdelenin arasına, masanın üzerine bıraktı ve bizi süzmek için ellerini beline koydu. Greta caddenin ilerisindeki Holly Jolly Bakery’nin sahibiydi ve donutları gibi yuvarlak hatlı, baştan aşağı un içinde kalmış biriydi. Bu sabah önlüğünün üzerinde fırçalamaya zahmet etmediği unlar duruyordu. — Daha bir saat önce fırından çikolatalı pekanlı kek tepsisi çıkardım ve kendi kendime dedim ki, Greta, bu sabah soğuk bir dükkânda oturup kendilerini yararlı kılan kimler var acaba, cevap da hepiniz oldunuz, buyurun.</w:t>
       </w:r>
     </w:p>
     <w:p/>
@@ -359,7 +359,7 @@
     <w:p/>
     <w:p>
       <w:r>
-        <w:t xml:space="preserve">— Bu da tuhaf doğrusu, dedi o yumuşak tonuyla ve sesindeki o hafiflik hepimizin başını kaldırmasına neden oldu. — Dün çocukların kardan adamları yola bakmıyordu sanki?</w:t>
+        <w:t xml:space="preserve">— Bu da tuhaf doğrusu, dedi o yumuşak tonuyla ve sesindeki o hafiflik hepimizin başını kaldırmasına neden oldu. — Dün çocukların kardan adamları hep yola bakmıyor muydu?</w:t>
       </w:r>
     </w:p>
     <w:p/>
@@ -431,7 +431,7 @@
     <w:p/>
     <w:p>
       <w:r>
-        <w:t xml:space="preserve">Ama bunların hiçbirini çembere söylemedim. Bir zencefilli kurabiye aldım, kırıntılarını kesen Pip’e hayır dedim ve çelengime dönmek için yeniden oturdum. Köknarı kökünden bağladım, dal dal üstüne, hepsi aynı yönü gösterecek şekilde. Arkamda sobanın içinde bir odun çıtırdadı ve kadınlar konuştu. Kar, meydanın üzerinde, içinde yanlış yönü dönmüş tek bir kardan adamla birlikte pırıl pırıl parlıyordu. Ensemde hissettiğim o serin karıncalanmaya güvendim ve o his bütün sabah benimle kaldı.</w:t>
+        <w:t xml:space="preserve">Ama bunların hiçbirini çembere söylemedim. Bir zencefilli kurabiye aldım, kırıntılarını kesen Pip’e hayır dedim ve çelengime dönmek için yeniden oturdum. Köknarı sımsıkı yerine bağladım, dal dal üstüne, hepsi aynı yönü gösterecek şekilde. Arkamda sobanın içinde bir odun çıtırdadı ve kadınlar konuştu. Kar, meydanın üzerinde, içinde yanlış yönü dönmüş tek bir kardan adamla birlikte pırıl pırıl parlıyordu. Ensemde hissettiğim o serin karıncalanmaya güvendim ve o his bütün sabah benimle kaldı.</w:t>
       </w:r>
     </w:p>
     <w:p>
@@ -876,7 +876,7 @@
         <w:t xml:space="preserve">Financier’lerin</w:t>
       </w:r>
       <w:r>
-        <w:t xml:space="preserve"> kalanını Starlight’a geri götürdüm, çünkü Kelly bahşişi hak ediyordu. Onu hâlâ tezgâhının başında buldum; Hal Thompson da tezgâha yaslanmıştı, ikisi Hal’in getirdiği bir kâğıdın üzerine baş başa eğilmişlerdi.</w:t>
+        <w:t xml:space="preserve"> kalanını Starlight’a geri götürdüm, çünkü Kelly verdiği haber için bir şeyi hak ediyordu. Onu hâlâ tezgâhının başında buldum; Hal Thompson da tezgâha yaslanmıştı, ikisi Hal’in getirdiği bir kâğıdın üzerine baş başa eğilmişlerdi.</w:t>
       </w:r>
     </w:p>
     <w:p/>
@@ -1014,7 +1014,7 @@
     <w:p/>
     <w:p>
       <w:r>
-        <w:t xml:space="preserve">Evergreen’den saptığım köşede arkama baktım. Caddenin yukarı başlarında, Sugarplum’un yeni vitrini caddedeki diğer tüm dükkanlardan daha parlak, altın rengiyle parlıyordu. Aşağı uçta ise Holly Jolly karanlıktaydı.</w:t>
+        <w:t xml:space="preserve">Evergreen’den saptığım köşede arkama baktım. Caddenin yukarı başlarında, Sugarplum’ın yeni vitrini caddedeki diğer tüm dükkanlardan daha parlak, altın rengiyle parlıyordu. Aşağı uçta ise Holly Jolly karanlıktaydı.</w:t>
       </w:r>
     </w:p>
     <w:p>
@@ -1528,7 +1528,7 @@
     <w:p/>
     <w:p>
       <w:r>
-        <w:t xml:space="preserve">— Çikolatalı-cevizli turta, dedi Ellie biraz hüzünlü bir sesle. — Joyce o tarifin kendisine ait olduğunu söyler dururdu.</w:t>
+        <w:t xml:space="preserve">— Çikolatalı-pekanlı turta, dedi Ellie biraz hüzünlü bir sesle. — Joyce o tarifin kendisine ait olduğunu söyler dururdu.</w:t>
       </w:r>
     </w:p>
     <w:p/>
@@ -1774,7 +1774,7 @@
     <w:p/>
     <w:p>
       <w:r>
-        <w:t xml:space="preserve">Bahçe kapısında durup sundurma korkuluğundan düşmüş bir buz sarkıtını inceledi, bunun balık olmadığına karar verip yoluna devam etti.</w:t>
+        <w:t xml:space="preserve">Bahçe kapısında durup veranda korkuluğundan düşmüş bir buz sarkıtını inceledi, bunun balık olmadığına karar verip yoluna devam etti.</w:t>
       </w:r>
     </w:p>
     <w:p/>
@@ -1809,7 +1809,7 @@
     <w:p/>
     <w:p>
       <w:r>
-        <w:t xml:space="preserve">Beni başta duymadı. Önünde çatlak çerçeveli eski bir çizim duruyordu ve hakkındaki her şeyi bilmeme rağmen beni bile şaşırtan bir özenle resmi birbirinden ayırıyordu. Küçük çivilerin her birini zorla değil, bir kuyumcu tornavidasıyla çevirerek çıkarıyordu. Dirseğinin yanındaki ahşap bir tepside bunun gibi yüzlerce küçük parça duruyordu: çiviler, köşe korumaları, boyuta göre kesilmiş asitsiz kağıt şeritleri. Cemiyeti her seferinde bir çiviyle, bunun ne kadar süreceğini bilen ve sürenin uzunluğuyla barışmış bir adamın sabırlı, kambur duruşuyla onarıyordu.</w:t>
+        <w:t xml:space="preserve">Beni başta duymadı. Önünde çatlak çerçeveli eski bir çizim duruyordu ve hakkındaki her şeyi bilmeme rağmen beni bile şaşırtan bir özenle resmi birbirinden ayırıyordu. Küçük çivilerin her birini zorla değil, bir kuyumcu tornavidasıyla çevirerek çıkarıyordu. Dirseğinin yanındaki ahşap bir tepside bunun gibi yüzlerce küçük parça duruyordu: çiviler, köşe korumaları, boyuta göre kesilmiş asitsiz kağıt şeritleri. Cemiyet'i her seferinde bir çiviyle, bunun ne kadar süreceğini bilen ve sürenin uzunluğuyla barışmış bir adamın sabırlı, kambur duruşuyla onarıyordu.</w:t>
       </w:r>
     </w:p>
     <w:p/>
@@ -1857,7 +1857,7 @@
     <w:p/>
     <w:p>
       <w:r>
-        <w:t xml:space="preserve">Cevap vermesi biraz sürdü ve cevap dolambaçlı yoldan geldi. Zeminini dikkatle hazırlıyordu. O bela başına geldiğinden beri her gün arşivdeydi. Cemiyetin evrakları geçen ayki kötü olay yüzünden birbirine girmişti.</w:t>
+        <w:t xml:space="preserve">Cevap vermesi biraz sürdü ve cevap dolambaçlı yoldan geldi. Zeminini dikkatle hazırlıyordu. O bela başına geldiğinden beri her gün arşivdeydi. Cemiyet'in evrakları geçen ayki kötü olay yüzünden birbirine girmişti.</w:t>
       </w:r>
     </w:p>
     <w:p/>
@@ -1944,7 +1944,7 @@
     <w:p/>
     <w:p>
       <w:r>
-        <w:t xml:space="preserve">Çizimi tepsisine yerleştirdi; bir süre ikimiz de ses çıkartmadık ve o sessizlik içinde etrafımızdaki o soğuk ön odanın farkına yeniden vardım. Arkamızda, Cemiyetin başköşeye oturttuğu ön pencerede bakır zaman kapsülü duruyordu.</w:t>
+        <w:t xml:space="preserve">Çizimi tepsisine yerleştirdi; bir süre ikimiz de ses çıkartmadık ve o sessizlik içinde etrafımızdaki o soğuk ön odanın farkına yeniden vardım. Arkamızda, Cemiyet'in başköşeye oturttuğu ön pencerede bakır zaman kapsülü duruyordu.</w:t>
       </w:r>
     </w:p>
     <w:p/>
@@ -1983,7 +1983,7 @@
     <w:p/>
     <w:p>
       <w:r>
-        <w:t xml:space="preserve">Alçakgönüllülüğünü kabullendim, çünkü bu gerçekti. Ancak açıkça kendisine ait olmayan tek bir karış toprağı bile nasıl kabul etmeyeceğini gördüm. Ekim ayında Theo Hussein kendisine ait olmayana uzanmış ve neredeyse haklı bir gerekçeyle, ama tamamen yanlış bir yolla başkasının payını almıştı. Bu hareket ona çok sevdiği Cemiyetin başındaki yerini mal olmuş ve neredeyse kasabanın tüm saygısını kaybetmesine yol açmıştı. Şimdi ise şanslı bir keşfin küçük, dürüst övgüsünü bile kabul etmiyordu. Tek bir yanlış adımın insanı nereye götürebileceğini çok iyi biliyordu ve bu yüzden adımlarını dikkatli atıyordu. Övgüde bulunmadan geçmesine izin verdim. İstemediğini, istemeden de olsa belli etmişti.</w:t>
+        <w:t xml:space="preserve">Alçakgönüllülüğünü kabullendim, çünkü bu gerçekti. Ancak açıkça kendisine ait olmayan tek bir karış toprağı bile nasıl kabul etmeyeceğini gördüm. Ekim ayında Theo Hussein kendisine ait olmayana uzanmış ve neredeyse haklı bir gerekçeyle, ama tamamen yanlış bir yolla başkasının payını almıştı. Bu hareket ona çok sevdiği Cemiyet'in başındaki yerini mal olmuş ve neredeyse kasabanın tüm saygısını kaybetmesine yol açmıştı. Şimdi ise şanslı bir keşfin küçük, dürüst övgüsünü bile kabul etmiyordu. Tek bir yanlış adımın insanı nereye götürebileceğini çok iyi biliyordu ve bu yüzden adımlarını dikkatli atıyordu. Övgüde bulunmadan geçmesine izin verdim. İstemediğini, istemeden de olsa belli etmişti.</w:t>
       </w:r>
     </w:p>
     <w:p/>
@@ -2016,7 +2016,7 @@
     <w:p/>
     <w:p>
       <w:r>
-        <w:t xml:space="preserve">Ve ardından, yavaş yavaş, insanlar akıllarını Cemiyete çevirmeye başladılar.</w:t>
+        <w:t xml:space="preserve">Ve ardından, yavaş yavaş, insanlar akıllarını Cemiyet'e çevirmeye başladılar.</w:t>
       </w:r>
     </w:p>
     <w:p/>
@@ -2055,7 +2055,7 @@
     <w:p/>
     <w:p>
       <w:r>
-        <w:t xml:space="preserve">— Hayır, diye onayladı, hem memnun hem de ciddi bir ifadeyle. — Ama insanların kazan vuruşunu duyması için onları kapıdan içeri sokar. Ve o kutunun önünde durup o vuruşu bir kez duydular mı, bir daha duyulmamış sayamayacaklar. — Kağıdı mantosunun cebine koydu.</w:t>
+        <w:t xml:space="preserve">— Hayır, diye onayladı, hem memnun hem de ciddi bir ifadeyle. — Ama insanların kazan vuruşunu duyması için onları kapıdan içeri sokar. Ve o kutunun önünde durup o vuruşu bir kez duydular mı, bir daha duyulmamış sayamayacaklar. — Kağıdı paltosunun cebine koydu.</w:t>
       </w:r>
     </w:p>
     <w:p/>
@@ -2073,7 +2073,7 @@
     <w:p/>
     <w:p>
       <w:r>
-        <w:t xml:space="preserve">Arkamda, Cemiyetin ön penceresinde tek bir lamba hâlâ yanıyordu: Çivileriyle uğraşan Theo ve kapının yanındaki masada anahtarı muhafaza eden yönetim kurulundan biri. Soğukta, mantıklı olan herkes evine çekildikten sonra bile.</w:t>
+        <w:t xml:space="preserve">Arkamda, Cemiyet'in ön penceresinde tek bir lamba hâlâ yanıyordu: Çivileriyle uğraşan Theo ve kapının yanındaki masada anahtarı muhafaza eden yönetim kurulundan biri. Soğukta, mantıklı olan herkes evine çekildikten sonra bile.</w:t>
       </w:r>
     </w:p>
     <w:p>
@@ -2084,7 +2084,7 @@
     <w:p/>
     <w:p>
       <w:r>
-        <w:t xml:space="preserve">Cemiyete gittiğim perşembe günü, ikindi vaktinin sonuna doğru ve dükkânı kapatmadan hemen önce, aklımda bir rosto ve arkamda Greta’nın derdiyle Pete Garcia’ya gittim. Rostoyu bütün bahanem sanmasına izin verdim.</w:t>
+        <w:t xml:space="preserve">Cemiyet’e gittiğim perşembe günü, ikindi vaktinin sonuna doğru ve dükkânı kapatmadan hemen önce, aklımda bir rosto ve arkamda Greta’nın derdiyle Pete Garcia’ya gittim. Rostoyu bütün bahanem sanmasına izin verdim.</w:t>
       </w:r>
     </w:p>
     <w:p/>
@@ -2144,7 +2144,7 @@
     <w:p/>
     <w:p>
       <w:r>
-        <w:t xml:space="preserve">— Ha, tabii ya. — Sıkı bir ilmik attı. — Ve bütün mahalle faturayı kime keseceğine karar verdi. Yeşil alanın öbür yanında adı kapısında yazan adamınkine. — Bunu düz bir şekilde söyledi; kırgınlığı üstünde sırıtarak, canı yanmış ve yüksek sesle, öğle vakti caddenin ortasında içine atmaktansa taşıyacağı bir acıyla. — Hadi ama. Duymuşsunuzdur. Pete Garcia ve yükleme rampası, kapıdaki zincir, yazdan beri ona gıcık oluyormuş. Başka kim olacak.</w:t>
+        <w:t xml:space="preserve">— Ha, tabii ya. — Sıkı bir ilmik attı. — Ve bütün mahalle faturayı kime keseceğine karar verdi. Meydanın öbür yanında adı kapısında yazan adamınkine. — Bunu düz bir şekilde söyledi; kırgınlığı üstünde sırıtarak, canı yanmış ve yüksek sesle, öğle vakti caddenin ortasında içine atmaktansa taşıyacağı bir acıyla. — Hadi ama. Duymuşsunuzdur. Pete Garcia ve yükleme rampası, kapıdaki zincir, yazdan beri ona gıcık oluyormuş. Başka kim olacak.</w:t>
       </w:r>
     </w:p>
     <w:p/>
@@ -2547,7 +2547,7 @@
     <w:p/>
     <w:p>
       <w:r>
-        <w:t xml:space="preserve">— Buldunuz. — Greta ellerindeki unları silkeleyerek tezgâhın arkasından dolaşıp yanına geldi; yüzü hâlâ ışıl ışıldı, henüz olan biteni idrak etmemişti. — Sizin için ne yapabilirdim?</w:t>
+        <w:t xml:space="preserve">— Buldunuz. — Greta ellerindeki unları silkeleyerek tezgâhın arkasından dolaşıp yanına geldi; yüzü hâlâ ışıl ışıldı, henüz olan biteni idrak etmemişti. — Sizin için ne yapabilirim?</w:t>
       </w:r>
     </w:p>
     <w:p/>
@@ -2589,7 +2589,7 @@
     <w:p/>
     <w:p>
       <w:r>
-        <w:t xml:space="preserve">Varney acımasız bir adam değildi. Kuralları kelimesi kelimesine uygulayan yorgun bir adamdı; çünkü kitap, onunla işi duygularına göre yapmak arasındaki tek engeldi. Soğutmalı vitrinine bir termometre soktu ve okuduğu değeri bir kâğıda yazdı. Depodaki malzemelerin kapaklarını birer birer kaldırdı. Pip vitrinin altındaki kırıntılarla ilgilenmeye devam etti ve adamın işini yapmasına izin verdi. Temizlik defterini ve sıcaklık kayıt defterini inceledi; Hal’in el yazısı kadar düzgün bir el yazısıyla tutulmuş kırk yıllık kayıtları okurken, her şeyin yolunda olduğunu gördüğünde içinde beliren o küçük, huzursuz kıpırtıyı fark ettim. Pis bir mutfakla karşılaşmaya hazırdı ancak tertemiz bir mutfak bulmuştu ve boşuna zahmet edip buraya gönderildiğini biliyordu. Yine de işini bitirmek zorundaydı.</w:t>
+        <w:t xml:space="preserve">Varney acımasız bir adam değildi. Kuralları kelimesi kelimesine uygulayan yorgun bir adamdı; çünkü kurallar, onunla işi duygularına göre yapmak arasındaki tek engeldi. Soğutmalı vitrinine bir termometre soktu ve okuduğu değeri bir kâğıda yazdı. Depodaki malzemelerin kapaklarını birer birer kaldırdı. Pip vitrinin altındaki kırıntılarla ilgilenmeye devam etti ve adamın işini yapmasına izin verdi. Temizlik defterini ve sıcaklık kayıt defterini inceledi; Hal’in el yazısı kadar düzgün bir el yazısıyla tutulmuş kırk yıllık kayıtları okurken, her şeyin yolunda olduğunu gördüğünde içinde beliren o küçük, huzursuz kıpırtıyı fark ettim. Pis bir mutfakla karşılaşmaya hazırdı ancak tertemiz bir mutfak bulmuştu ve boşuna zahmet edip buraya gönderildiğini biliyordu. Yine de işini bitirmek zorundaydı.</w:t>
       </w:r>
     </w:p>
     <w:p/>
@@ -2625,7 +2625,7 @@
     <w:p/>
     <w:p>
       <w:r>
-        <w:t xml:space="preserve">— Geçici ruhsat iptali için yeterli bir sebep, dedi ve Greta’nın bu kelimeyi bilmeyip hemen ardından öğrendiğine tanık oldum. — Eksikler giderilip ben tekrar gelerek onay verene kadar ruhsatınızı askıya almak zorundayım. Elimden geldiğince hızlı davranacağım, ancak yazılan maddelere uymak zorundayım. — Listesine gerekenden biraz daha uzun süre baktı. — Bir hafta. Lavabonun parçaları gelmezse belki daha uzun.</w:t>
+        <w:t xml:space="preserve">— Geçici bir askıya alma için yeterli bir sebep, dedi ve Greta’nın bu kelimeyi bilmeyip hemen ardından öğrendiğine tanık oldum. — Eksikler giderilip ben tekrar gelerek onay verene kadar ruhsatınızı askıya almak zorundayım. Elimden geldiğince hızlı davranacağım, ancak yazılan maddelere uymak zorundayım. — Listesine gerekenden biraz daha uzun süre baktı. — Bir hafta. Lavabonun parçaları gelmezse belki daha uzun.</w:t>
       </w:r>
     </w:p>
     <w:p/>
@@ -2649,7 +2649,7 @@
     <w:p/>
     <w:p>
       <w:r>
-        <w:t xml:space="preserve">O, mantosunu giyerken kapıya kadar ona eşlik ettim; Pip de gözünü adamın çantasının pirinç tokasına dikmiş arkamızdan geliyordu. — Şikâyet eden kimmiş? diye sordum, yaşlı bir kadının öylesine laf lafı açsın diye sorduğu hafif bir tonda. Tabii ki söylemeyecekti. Ama çantasını koltuğunun altına sıkıştırıp başını salladı; bu, hak ettiğinden çok daha zeki biri tarafından nahoş bir iş yapmaya zorlanmış bir adamın ekşi mi ekşi hâliydi.</w:t>
+        <w:t xml:space="preserve">O, paltosunu giyerken kapıya kadar ona eşlik ettim; Pip de gözünü adamın çantasının pirinç tokasına dikmiş arkamızdan geliyordu. — Şikâyet eden kimmiş? diye sordum, yaşlı bir kadının öylesine laf lafı açsın diye sorduğu hafif bir tonda. Tabii ki söylemeyecekti. Ama çantasını koltuğunun altına sıkıştırıp başını iki yana salladı; bu, hak ettiğinden çok daha zeki biri tarafından nahoş bir iş yapmaya zorlanmış bir adamın ekşi mi ekşi hâliydi.</w:t>
       </w:r>
     </w:p>
     <w:p>
@@ -2757,7 +2757,7 @@
         <w:t xml:space="preserve">ateş olmayan yerden duman çıkmaz</w:t>
       </w:r>
       <w:r>
-        <w:t xml:space="preserve"> deyip bunu söylerken de gayet mantıklı hissetmesini sağlıyordu. Tom duvardaki bir kelimeyi silip süpürebilirdi. Hiç kimse mührü silip atamazdı. İçeriye sızmıştı ve fırının tüm hayatı boyunca barındırdığı tek yerde, yani ekmeğini yiyen insanların güveninde kalmaya devam edecekti.</w:t>
+        <w:t xml:space="preserve"> deyip bunu söylerken de gayet mantıklı hissetmesini sağlıyordu. Tom duvardaki bir kelimeyi silip süpürebilirdi. Hiç kimse mührü silip atamazdı. İçeriye sızmıştı ve bir fırının bütün hayatını sakladığı o tek yerde, yani ekmeğini yiyen insanların güveninde kalmaya devam edecekti.</w:t>
       </w:r>
     </w:p>
     <w:p>
@@ -2987,7 +2987,7 @@
     </w:p>
     <w:p>
       <w:r>
-        <w:t xml:space="preserve">Greta değil. Göremeyecek kadar konunun içindeydi ve yarası çok tazeydi. İlçe de değil; adamı ona yardım etmeye değil, dükkânını kapatmaya çoktan gönderilmişti. Dürüst, yalın bir göz ve unu altına koyabileceğim bir tezgâh istiyordum. Frost Falls'un, Maple Sokağı'ndan açılan bir çıkmazın sonundaki Doktor Mitchell'ın muayenehanesinde, bu ikisinden tam olarak birer tane vardı.</w:t>
+        <w:t xml:space="preserve">Greta değil. Göremeyecek kadar konunun içindeydi ve yarası çok tazeydi. İlçe de değil; adamı ona yardım etmeye değil, dükkânını kapatmaya çoktan gönderilmişti. Dürüst, yalın bir göz ve unu inceleyebileceğim bir tezgâh istiyordum. Frost Falls'un, Maple Sokağı'ndan açılan bir çıkmazın sonundaki Doktor Mitchell'ın muayenehanesinde, bu ikisinden tam olarak birer tane vardı.</w:t>
       </w:r>
     </w:p>
     <w:p>
@@ -3002,7 +3002,7 @@
     </w:p>
     <w:p>
       <w:r>
-        <w:t xml:space="preserve">— Greta'nın derdi. Bir kavanozun içinde. — Kavanozu tezgâhına bıraktım. — Bunun bozulma olduğunu söyleyin, Doktor. Nemli bir deponun ve sıcak bir haftanın unu bu hâle getirdiğini söyleyin de eve gidip sevineyim; duvarlarını mühürleyip kapılarını açalım ve bir daha asla bunu düşünmeyelim.</w:t>
+        <w:t xml:space="preserve">— Greta'nın derdi. Bir kavanozun içinde. — Kavanozu tezgâhına bıraktım. — Bunun bozulma olduğunu söyleyin, Doktor. Nemli bir deponun ve sıcak bir haftanın unu bu hâle getirdiğini söyleyin de eve gidip sevineyim; duvarlarının derzini kapatıp kapılarını açalım ve bir daha asla bunu düşünmeyelim.</w:t>
       </w:r>
     </w:p>
     <w:p>
@@ -3389,7 +3389,7 @@
     <w:p/>
     <w:p>
       <w:r>
-        <w:t>Çaydanlığı ocaktan aldım. Kapısına kadar uzanan o soğuk çizgiyi sadece erişim mesafesine bakarak çizmiştim; sokakta kendi kendime söylediğim gibi, erişim dediğin şey bir hüküm değil, sadece bir kapı eşiğiydi. Evet, tam da eşikte duruyordu. Ama kapının ardındaki oda, onda bulunmayan bir öfkeye ve bilmediği bir zanaata ev sahipliği yapıyordu.</w:t>
+        <w:t xml:space="preserve">Çaydanlığı ocaktan aldım. Kapısına kadar uzanan o soğuk çizgiyi sadece erişim mesafesine bakarak çizmiştim; sokakta kendi kendime söylediğim gibi, erişim dediğin şey bir hüküm değil, sadece bir kapı eşiğiydi. Evet, tam da eşikte duruyordu. Ama kapının ardındaki oda, onda bulunmayan bir mizaca ve bilmediği bir zanaata ev sahipliği yapıyordu.</w:t>
       </w:r>
     </w:p>
     <w:p/>
@@ -3449,7 +3449,7 @@
     <w:p/>
     <w:p>
       <w:r>
-        <w:t xml:space="preserve">— Size bahsettiğim o siluet, dedi, istemediğim pirzolayı paketlerken. Karanlıkta arka kapısının önündeki hani. Şimdi bana inandığınıza göre, hepsini bilmek istersiniz. — Geniş ellerini kütüğün üzerine düz basarak pencereden meydanın karşısındaki Evergreen dükkânlarına baktı; sanki oraları delip geçerek avluyu görebilecekmiş gibiydi. — Yetişkin biri. Kasabanın boya kutulu bir veledin üzerine yıkmak istediği gibi bir çocuk değil. Greta'dan uzun ve kararlı hareket ediyordu. Oyalanmadan. Ellerini ısıtmaya çalışmadan. Neden orada olduğunu biliyordu. Ve örtünmüştü. Uzun bir palto ya da iş kıyafeti; bol, üzerinde leke kalmasın diye çalışırken giyilen türden. Rengini karanlık yutmuş olsa da soluk renkli diyebilirim neredeyse. Teslimatların yapıldığı ve dürüst işi olan hiç kimsenin uğramadığı, tam duvarının dibinde. Ve farlarım oraya döndüğünde yok olup gitti; hızlı ve sessizce, telaşla kaçarak değil, oradan ayrılarak. Hiç acele etmeden. İşini bitirip gitmişti. — Gri başını salladı. — Yüzü yoktu. Hiçbir zaman bir yüzü olmamıştı. Sadece görünmemeye özen gösteren, Greta'nın saatlerini bir yabancının bilmesi gerekenden daha iyi bilen iş başındaki bir siluet. — Kâğıdın ucunu bağladı. — O minibüs de bir sabah yine oradaydı. Eczanenin yanına park etmiş, motoru tıkırdıyordu. Tavanı yüksekti, bir minibüsün gereğinden de yüksek, arka kapılarında kırmızı bir reflektör bandı vardı. Farlarım üzerine vurduğunda Noel ağacı gibi parladı.</w:t>
+        <w:t xml:space="preserve">— Size bahsettiğim o siluet, dedi, istemediğim pirzolayı paketlerken. Karanlıkta arka kapısının önündeki hani. Şimdi bana inandığınıza göre, hepsini bilmek istersiniz. — Geniş ellerini kütüğün üzerine düz basarak pencereden meydanın karşısındaki Evergreen dükkânlarına baktı; sanki oraları delip geçerek avluyu görebilecekmiş gibiydi. — Yetişkin biri. Kasabanın boya kutulu bir veledin üzerine yıkmak istediği gibi bir çocuk değil. Greta'dan uzun ve kararlı hareket ediyordu. Oyalanmadan. Ellerini ısıtmaya çalışmadan. Neden orada olduğunu biliyordu. Ve örtünmüştü. Uzun bir palto ya da iş kıyafeti; bol, üzerinde leke kalmasın diye çalışırken giyilen türden. Rengini karanlık yutmuş olsa da soluk renkli diyebilirim neredeyse. Teslimatların yapıldığı ve dürüst işi olan hiç kimsenin uğramadığı, tam duvarının dibinde. Ve farlarım oraya döndüğünde yok olup gitti; hızlı ve sessizce, telaşla kaçarak değil, oradan ayrılarak. Hiç acele etmeden. İşini bitirip gitmişti. — Gri başını iki yana salladı. — Yüzü yoktu. Hiçbir zaman bir yüzü olmamıştı. Sadece görünmemeye özen gösteren, Greta'nın saatlerini bir yabancının bilmesi gerekenden daha iyi bilen iş başındaki bir siluet. — Kâğıdın ucunu bağladı. — O minibüs de bir sabah yine oradaydı. Eczanenin yanına park etmiş, motoru tıkırdıyordu. Tavanı yüksekti, bir minibüsün gereğinden de yüksek, arka kapılarında kırmızı bir reflektör bandı vardı. Farlarım üzerine vurduğunda Noel ağacı gibi parladı.</w:t>
       </w:r>
     </w:p>
     <w:p/>
@@ -3862,7 +3862,7 @@
     <w:p/>
     <w:p>
       <w:r>
-        <w:t xml:space="preserve">Martha'nın şişleri yavaşladı. — Ona Şükran Günü için iki çikolatalı-cevizli turta ve bir düzine çörek istediğimi söylersin. Her zamanki gibi. Ona bunu söylediğimi ve onları almak için kapısında olacağımı ilet.</w:t>
+        <w:t xml:space="preserve">Martha'nın şişleri yavaşladı. — Ona Şükran Günü için iki çikolatalı-pekanlı turta ve bir düzine çörek istediğimi söylersin. Her zamanki gibi. Ona bunu söylediğimi ve onları almak için kapısında olacağımı ilet.</w:t>
       </w:r>
     </w:p>
     <w:p/>
@@ -3939,7 +3939,7 @@
     <w:p/>
     <w:p>
       <w:r>
-        <w:t xml:space="preserve">— İki tane al. Daha fazlası da var. — Arkasını dönüp dirseğimin dibinde beni buldu. — Jessica. Nasıl gidiyor?</w:t>
+        <w:t xml:space="preserve">— İki tane al. Daha fazlası da var. — Arkasını dönüp dirseğimin dibinde beni buldu. — Jessica. O nasıl?</w:t>
       </w:r>
     </w:p>
     <w:p/>
@@ -3963,7 +3963,7 @@
     <w:p/>
     <w:p>
       <w:r>
-        <w:t>Kapıya doğru yürürken birkaç kadının arasında soluk renkli yün paltosuyla duran Renée Duval'in yanında durdu ve ona bir şeyler söyledi. Renée kısa bir baş hareketiyle onay verip tekrar sohbetine döndü. Ardından minibüs otoparktan çıkıp gitti ve Hal de sahneden boş bir varili sürükleyerek getirdi.</w:t>
+        <w:t xml:space="preserve">Kapıya doğru yürürken birkaç kadının arasında soluk renkli yün paltosuyla duran Renée Duval'ın yanında durdu ve ona bir şeyler söyledi. Renée kısa bir baş hareketiyle onay verip tekrar sohbetine döndü. Ardından minibüs otoparktan çıkıp gitti ve Hal de sahneden boş bir varili sürükleyerek getirdi.</w:t>
       </w:r>
     </w:p>
     <w:p/>
@@ -3975,7 +3975,7 @@
     <w:p/>
     <w:p>
       <w:r>
-        <w:t xml:space="preserve">Aslında bu hiç kimse için yeni değildi. Cemiyet'in sedir ağacından yapılma kutusu, dibinde birkaç erken sunuyla ekim ayından beri yan masada açık duruyordu: saat kulesinin bir çocuğun çizdiği resmi, preslenmiş bir akçaağaç yaprağı, Greta'nın çikolatalı cevizli tarif kartı, Bram'ın başparmak büyüklüğündeki iki mini eldiveni. O sabah Theo kutuyu aşağıya, Grange'a taşımış ve üzerini el yazısıyla yazılmış bir kartın altına yerleştirmişti: </w:t>
+        <w:t xml:space="preserve">Aslında bu hiç kimse için yeni değildi. Cemiyet'in sedir ağacından yapılma kutusu, dibinde birkaç erken sunuyla ekim ayından beri yan masada açık duruyordu: saat kulesinin bir çocuğun çizdiği resmi, preslenmiş bir akçaağaç yaprağı, Greta'nın çikolatalı-pekanlı tarif kartı, Bram'ın başparmak büyüklüğündeki iki mini eldiveni. O sabah Theo kutuyu aşağıya, Grange'a taşımış ve üzerini el yazısıyla yazılmış bir kartın altına yerleştirmişti: </w:t>
       </w:r>
       <w:r>
         <w:rPr>
@@ -4062,7 +4062,7 @@
     <w:p/>
     <w:p>
       <w:r>
-        <w:t xml:space="preserve">Çünkü o haftayı diğer tarafından da biliyordum. Greta'nın dükkânının mühürlendiğini, kakaolu çöreklerin arasına konulmuş sarı renkli ilçe evrakı üzerinde Varney'in yorgun el yazısıyla okumuş ve onun ağzından dinlemiştim. </w:t>
+        <w:t xml:space="preserve">Çünkü o haftayı diğer tarafından da biliyordum. Greta'nın dükkânının mühürlendiğini, kakaolu çöreklerin arasına konulmuş sarı renkli ilçe evrakı üzerinde Varney'nin yorgun el yazısıyla okumuş ve onun ağzından dinlemiştim. </w:t>
       </w:r>
       <w:r>
         <w:rPr>
@@ -4077,7 +4077,7 @@
     <w:p/>
     <w:p>
       <w:r>
-        <w:t>Ve bu, Renée Duval'in kapılarını açmak için seçtiği haftaydı.</w:t>
+        <w:t xml:space="preserve">Ve bu, Renée Duval'ın kapılarını açmak için seçtiği haftaydı.</w:t>
       </w:r>
     </w:p>
     <w:p/>
@@ -4446,7 +4446,7 @@
     <w:p/>
     <w:p>
       <w:r>
-        <w:t xml:space="preserve">— Kesildi, dedi ben sormaya fırsat bulamadan. Şu bakışlar. Bayan Bennett’a her ne söylediyseniz, kulaktan kulağa yayıldı. Okuldaki kadının biri anneme bunun kesinlikle ben olamayacağımı pat diye söylemiş. — Bana değil, bal damlalarına baktı. — Öyle işte. Teşekkürler. Sizin sayenizde olduğunu biliyorum.</w:t>
+        <w:t xml:space="preserve">— Kesildi, dedi ben sormaya fırsat bulamadan. Şu bakışlar. Bayan Bennett’e her ne söylediyseniz, kulaktan kulağa yayıldı. Okuldaki kadının biri anneme bunun kesinlikle ben olamayacağımı pat diye söylemiş. — Bana değil, bal damlalarına baktı. — Öyle işte. Teşekkürler. Sizin sayenizde olduğunu biliyorum.</w:t>
       </w:r>
     </w:p>
     <w:p/>
@@ -4638,7 +4638,7 @@
     <w:p/>
     <w:p>
       <w:r>
-        <w:t xml:space="preserve">Pip, Renée’nin kuralı gereği o sabah ve ilk gün beklediği Sugarplum’un tertemiz süpürülmüş basamağında durdu. Doktor botlarındaki karları silkelemek için bir an onun yanında durdu, Pip ise gagasıyla adamın botunun bağcığının ucunu tutup yavaşça çözdü. Doktor aşağıya doğru ona baktı ama dokunmadı.</w:t>
+        <w:t xml:space="preserve">Pip, Renée’nin kuralı gereği o sabah ve ilk gün beklediği Sugarplum’ın tertemiz süpürülmüş basamağında durdu. Doktor botlarındaki karları silkelemek için bir an onun yanında durdu, Pip ise gagasıyla adamın botunun bağcığının ucunu tutup yavaşça çözdü. Doktor aşağıya doğru ona baktı ama dokunmadı.</w:t>
       </w:r>
     </w:p>
     <w:p/>
@@ -4866,7 +4866,7 @@
     <w:p/>
     <w:p>
       <w:r>
-        <w:t xml:space="preserve">Evde çelenk bıraktığım masanın üzerinde duruyordu. Paltom sırtımdayken masaya oturdum, teli çözdüm ve köknar dallarını kasnaktan birer birer, önümde çıplak çelik iskeletten başka bir şey kalmayana kadar söktüm. Pip altın rengi kurdelenin boştaki ucunu gagasından kaptığı gibi masanın altına doğru geri çekildi, ben de onu serbest bıraktım. Sonra yığındaki ilk dalı alıp kasnağın üzerine yerleştirdim.</w:t>
+        <w:t xml:space="preserve">Evde çelenk bıraktığım masanın üzerinde duruyordu. Paltom sırtımdayken masaya oturdum, teli çözdüm ve köknar dallarını kasnaktan birer birer, önümde çıplak çelik iskeletten başka bir şey kalmayana kadar söktüm. Pip altın rengi kurdelenin boştaki ucunu gagasından kaptığı gibi masanın altına doğru geri çekildi, ben de kurdeleyi ona bıraktım. Sonra yığındaki ilk dalı alıp kasnağın üzerine yerleştirdim.</w:t>
       </w:r>
     </w:p>
     <w:p>
@@ -4877,7 +4877,7 @@
     <w:p/>
     <w:p>
       <w:r>
-        <w:t xml:space="preserve">Ayaz havada önceden hiçbir belirti göstermeden bastırmıştı; Dot’ın en sert olanların hep böyle geleceğini söylediği gibi. Sadece durgun bir gökyüzü ve gece boyunca düşen bir sıcaklık; elden bırakılmış bir taş gibi. Pencereler köşelerine kadar beyaz buz çiçekleriyle kaplanmış, duvarların içindeki borular soğuktan tıkırdarken uyandım ve başka hiçbir şey düşünmeden önce, meydandaki Cemiyet’in dar tuğla binasını ve bodrum katında takırdayan eski kazanı düşündüm. Havalar yumuşadığında bile zor ısınan bir kazan, bu kadar sert bir geceye her zaman dayanamazdı.</w:t>
+        <w:t xml:space="preserve">Ayaz havada önceden hiçbir belirti göstermeden bastırmıştı; Dot’un en sert olanların hep böyle geleceğini söylediği gibi. Sadece durgun bir gökyüzü ve gece boyunca düşen bir sıcaklık; elden bırakılmış bir taş gibi. Pencereler köşelerine kadar beyaz buz çiçekleriyle kaplanmış, duvarların içindeki borular soğuktan tıkırdarken uyandım ve başka hiçbir şey düşünmeden önce, meydandaki Cemiyet’in dar tuğla binasını ve bodrum katında takırdayan eski kazanı düşündüm. Havalar yumuşadığında bile zor ısınan bir kazan, bu kadar sert bir geceye her zaman dayanamazdı.</w:t>
       </w:r>
     </w:p>
     <w:p>
@@ -4922,7 +4922,7 @@
     </w:p>
     <w:p>
       <w:r>
-        <w:t xml:space="preserve">Bağış kampanyasının o güzel havası, Grange’da dolup taşan sedir kutusu, her pencerede kurucunun o cümlesi ve bunun çok yazık olacağını söyleyen tutumlu kadınlar… Bunların hiçbiri yok olup gitmemişti. O kadar ucuz değildi. Ama bir düşüş yaşandı. Odada bu düşüşü izledim, derneğin kurtarılmış sayılmasını sırf istedikleri için onun kurtarıldığına inanmayı seçmiş insanlarda umudun tutunmasının zorlaşmasını seyrettim. Cemiyetin en eski bağışçısı olan ve haftalar önce iş o noktaya varırsa tüm meblağı tek bir çekle ödeyeceğini söyleyen Bay Worthington’ı düşündüm. Ondan bunu yedekte tutmasını istemiştim ve öyle de bırakmıştım. Önce kasabanın elini taşın altına koyması gerekiyordu.</w:t>
+        <w:t xml:space="preserve">Bağış kampanyasının o güzel havası, Grange’da dolup taşan sedir kutusu, her pencerede kurucunun o cümlesi ve bunun çok yazık olacağını söyleyen temkinli kadınlar… Bunların hiçbiri yok olup gitmemişti. O kadar ucuz değildi. Ama bir düşüş yaşandı. Odada bu düşüşü izledim, Cemiyet’in kurtarılmış sayılmasını sırf istedikleri için onun kurtarıldığına inanmayı seçmiş insanlarda umudun tutunmasının zorlaşmasını seyrettim. Cemiyet’in en eski bağışçısı olan ve haftalar önce iş o noktaya varırsa tüm meblağı tek bir çekle ödeyeceğini söyleyen Bay Worthington’ı düşündüm. Ondan bunu yedekte tutmasını istemiştim ve öyle de bırakmıştım. Önce kasabanın elini taşın altına koyması gerekiyordu.</w:t>
       </w:r>
     </w:p>
     <w:p>
@@ -4932,7 +4932,7 @@
     </w:p>
     <w:p>
       <w:r>
-        <w:t xml:space="preserve">Fakat o gece, Pip evde uyurken, tek başıma geri döndüm. Nedenini söyleyemezdim. Cemiyetin, ilk soğuk gecesinde, başında kimse nöbet tutmadan karanlık ve boş kalmasını istememiş olmam dışında.</w:t>
+        <w:t xml:space="preserve">Fakat o gece, Pip evde uyurken, tek başıma geri döndüm. Nedenini söyleyemezdim. Cemiyet'in, ilk soğuk gecesinde, başında kimse nöbet tutmadan karanlık ve boş kalmasını istememiş olmam dışında.</w:t>
       </w:r>
     </w:p>
     <w:p>
@@ -4972,7 +4972,7 @@
     </w:p>
     <w:p>
       <w:r>
-        <w:t>Saati biliyordum. Onu tanıdığım günden beri her gün takmıştı; sade ve titiz bir adamın üzerindeki tek zarif parça olan, eskimiş bir zincire bağlı eski bir altın cep saati. Şimdi katlanmış küçük bir kâğıt parçasının yanında duruyordu ve ne anlama geldiğini anlamak için kâğıdı okumama gerek yoktu. İki kasaba ötede bu tür şeyleri satın alan bir kuyumcu vardı. İyi durumdaki altın bir cep saati hatırı sayılır bir miktar ederdi. Çatıyı değil. Çatının yarısını bile değil. Ama bir başlangıç. Eriyen karların temizliği, kurutma kâğıtları, bir sonraki ayaza kadar sızıntı yerini mühürleyecek adamlar. Tek bir sert haftada hiçbir kasaba komitesinin hızla karşılayamayacağı o küçük, acil ihtiyaçlar.</w:t>
+        <w:t xml:space="preserve">Saati biliyordum. Onu tanıdığım günden beri her gün takmıştı; sade ve titiz bir adamın üzerindeki tek zarif parça olan, eskimiş bir zincire bağlı eski bir altın cep saati. Şimdi katlanmış küçük bir kâğıt parçasının yanında duruyordu ve ne anlama geldiğini anlamak için kâğıdı okumama gerek yoktu. İki kasaba ötede bu tür şeyleri satın alan bir kuyumcu vardı. İyi durumdaki altın bir cep saati hatırı sayılır bir miktar ederdi. Çatıyı değil. Çatının yarısını bile değil. Ama bir başlangıç. Eriyen karların temizliği, kurutma kâğıtları, bir sonraki ayaza kadar sızıntı yerini kapatacak adamlar. Tek bir sert haftada hiçbir kasaba komitesinin hızla karşılayamayacağı o küçük, acil ihtiyaçlar.</w:t>
       </w:r>
     </w:p>
     <w:p>
@@ -5128,7 +5128,7 @@
     </w:p>
     <w:p>
       <w:r>
-        <w:t xml:space="preserve">— Taşımış olabilir. Bir penguenin bile eşiğinden içeri girmesine izin vermeyen bir kadın, işi için gerekli tozunu dükkânının adı kenarında yazılı bir kutu içinde taşıyor demek bu. — Bu manzarayı kafamda canlandırarak başımı salladım. — Dikkatsiz bir kadından bunu beklerdim. Ama o öyle biri değil.</w:t>
+        <w:t xml:space="preserve">— Taşımış olabilir. Bir penguenin bile eşiğinden içeri girmesine izin vermeyen bir kadın, işi için gerekli tozunu dükkânının adı kenarında yazılı bir kutu içinde taşıyor demek bu. — Bu manzarayı kafamda canlandırarak başımı iki yana salladım. — Dikkatsiz bir kadından bunu beklerdim. Ama o öyle biri değil.</w:t>
       </w:r>
     </w:p>
     <w:p>
@@ -5153,7 +5153,7 @@
     </w:p>
     <w:p>
       <w:r>
-        <w:t xml:space="preserve">— Hiç üzerinde durmadım. Şoför şekerleme yapmak için durmuştur, dedim. Ama Pete o avluya giren her kamyonu bilir; et tedarikçisininki değil dedi, ben de bunu kimseninki değil diye duydum. — Parmağımı kaşığın üzerinden biberliğe doğru kaydırdım. — Bir de Danny’nin sureti. İnce ve çevik bir siluet, fırınları yanmadan önce Greta’nın eşiğindeydi ve yukarılara doğru, uzak uca doğru uzaklaşıverdi. Altın dükkânını duydum. Hiçbir zaman Sugarplum’un içine girdiğini söylemedi. Uzak uca gittiğini söyledi. Dükkânı oraya kendim yerleştirdim.</w:t>
+        <w:t xml:space="preserve">— Hiç üzerinde durmadım. Şoför şekerleme yapmak için durmuştur, dedim. Ama Pete o avluya giren her kamyonu bilir; et tedarikçisininki değil dedi, ben de bunu kimseninki değil diye duydum. — Parmağımı kaşığın üzerinden biberliğe doğru kaydırdım. — Bir de Danny’nin gördüğü siluet. İnce ve çevik, fırınları yanmadan önce Greta’nın eşiğindeydi ve yukarılara doğru, uzak uca doğru uzaklaşıverdi. Ben bunu altın dükkânı diye duydum. Hiçbir zaman Sugarplum’ın içine girdiğini söylemedi. Uzak uca gittiğini söyledi. Dükkânı oraya kendim yerleştirdim.</w:t>
       </w:r>
     </w:p>
     <w:p>
@@ -5289,7 +5289,7 @@
     </w:p>
     <w:p>
       <w:r>
-        <w:t xml:space="preserve">— Aklımı kaçırdığımı asla söylemedim, dedi Martha. Tuhaf dedim sadece. — Telefonu bana doğru çevirdi, böylece aydınlık ekrandaki arama kaydını görebildim. — Dün akşamüstü bir kadın aradı beni. Hoş sohbet, işine bağlı biri gibiydi. Bridgton'daki Wendt's Bakehouse'dan aradığını, Holly Jolly kapalı olduğundan Holly Jolly siparişimi seve seve temin edebileceklerini söyledi. İki çikolatalı-cevizli turta ve bir düzine çörek, Şükran Günü'nden önceki çarşamba hazır olacakmış. — Telefonu indirdi. — Siparişimin aynısı. Çöreğine kadar.</w:t>
+        <w:t xml:space="preserve">— Aklımı kaçırdığımı asla söylemedim, dedi Martha. Tuhaf dedim sadece. — Telefonu bana doğru çevirdi, böylece aydınlık ekrandaki arama kaydını görebildim. — Dün akşamüstü bir kadın aradı beni. Hoş sohbet, işine bağlı biri gibiydi. Bridgton'daki Wendt's Bakehouse'dan aradığını, Holly Jolly kapalı olduğundan Holly Jolly siparişimi seve seve temin edebileceklerini söyledi. İki çikolatalı-pekanlı turta ve bir düzine çörek, Şükran Günü'nden önceki çarşamba hazır olacakmış. — Telefonu indirdi. — Siparişimin aynısı. Çöreğine kadar.</w:t>
       </w:r>
     </w:p>
     <w:p>
@@ -5304,7 +5304,7 @@
     </w:p>
     <w:p>
       <w:r>
-        <w:t xml:space="preserve">— Aynı telefon bana da geldi, dedi Ivy bana. Martha'nkiden hemen sonra. Büyük ihtimalle aynı kadındı. Adım, numaram ve üç bal kabaklı turtam kadında kayıtlıydı. Greta'dan çörekleri fırına verilmemiş hamur hâlinde istediğimi bile biliyordu ki o gün taze taze pişirebileyim. — Kupasının kenarına üfledi. — Greta'nın listesini Joyce'a verdiğini düşündüm. Kimse mahrum kalmasın diye. Joyce pazartesi günü Greta'ya güveç götürmüş, minibüsü kapının önünde gördüm. Belki de ikisi sonunda aralarındaki buzları eritmişlerdir.</w:t>
+        <w:t xml:space="preserve">— Aynı telefon bana da geldi, dedi Ivy bana. Martha'nınkinden hemen sonra. Büyük ihtimalle aynı kadındı. Adım, numaram ve üç bal kabaklı turtam kadında kayıtlıydı. Greta'dan çörekleri fırına verilmemiş hamur hâlinde istediğimi bile biliyordu ki o gün taze taze pişirebileyim. — Kupasının kenarına üfledi. — Greta'nın listesini Joyce'a verdiğini düşündüm. Kimse mahrum kalmasın diye. Joyce pazartesi günü Greta'ya güveç götürmüş, minibüsü kapının önünde gördüm. Belki de ikisi sonunda aralarındaki buzları eritmişlerdir.</w:t>
       </w:r>
     </w:p>
     <w:p>
@@ -5414,7 +5414,7 @@
     </w:p>
     <w:p>
       <w:r>
-        <w:t xml:space="preserve">— Martha'yı dün akşam aramışlar, Holly Jolly siparişini temin edebileceklerini söylemişler. İki çikolatalı-cevizli turta ve bir düzine çörek. Ivy'yi de aramışlar, üç bal kabaklı turtasıyla birlikte.</w:t>
+        <w:t xml:space="preserve">— Martha'yı dün akşam aramışlar, Holly Jolly siparişini temin edebileceklerini söylemişler. İki çikolatalı-pekanlı turta ve bir düzine çörek. Ivy'yi de aramışlar, üç bal kabaklı turtasıyla birlikte.</w:t>
       </w:r>
     </w:p>
     <w:p>
@@ -6243,7 +6243,7 @@
     <w:p/>
     <w:p>
       <w:r>
-        <w:t>Ön masaya bir kese kâğıdı dolusu çörek bırakan Joyce Wendt, saat ikide içeri girdi; kapı arkasından kapanmadan önce bile yüzü gülüyordu.</w:t>
+        <w:t xml:space="preserve">Joyce Wendt saat ikide, ön masa için getirdiği beyaz bir kese kâğıdı dolusu çörekle içeri girdi; kapı arkasından kapanmadan önce bile yüzü gülüyordu.</w:t>
       </w:r>
     </w:p>
     <w:p/>
@@ -6267,13 +6267,13 @@
     <w:p/>
     <w:p>
       <w:r>
-        <w:t>Sanki kollarını boynuna dolayacakmış gibi masanın ucundan dolaştı ama Greta ayağa kalkmadı. Joyce, Greta’nın sandalyesinin arkasında tek eliyle durup hafifçe sırtına vurduktan sonra, baştan beri planı buymuş gibi karşımızdaki boş koltuğa geri döndü.</w:t>
-      </w:r>
-    </w:p>
-    <w:p/>
-    <w:p>
-      <w:r>
-        <w:t xml:space="preserve">— Elimden ne gelirse, dedi parkasını açarak. Gerçekten. Ona yardım etmeye geldim. İzin verseydi iki haftadır yardım etmeye çalışıyordum zaten. — Anahtarlarını kesenin yanına, masaya bıraktı; aralarında minibüsün anahtarı da bulunan, pirinç ve çelikten ağır bir anahtarlıktı.</w:t>
+        <w:t xml:space="preserve">Sanki kollarını boynuna dolayacakmış gibi masanın ucundan dolaştı ama Greta ayağa kalkmadı. Joyce, Greta’nın sandalyesinin arkasında tek eliyle durup sandalyeyi hafifçe okşadıktan sonra, baştan beri planı buymuş gibi karşımızdaki boş koltuğa geri döndü.</w:t>
+      </w:r>
+    </w:p>
+    <w:p/>
+    <w:p>
+      <w:r>
+        <w:t xml:space="preserve">— Elimden ne gelirse, dedi parkasını açarak. Gerçekten. Ona yardım etmeye geldim. İki haftadır ona yardım etmeye çalışıyorum zaten, kimseye izin verse ya. — Anahtarlarını kesenin yanına, masaya bıraktı; aralarında minibüsün anahtarı da bulunan, pirinç ve çelikten ağır bir anahtarlıktı.</w:t>
       </w:r>
     </w:p>
     <w:p/>
@@ -6405,7 +6405,7 @@
     <w:p/>
     <w:p>
       <w:r>
-        <w:t xml:space="preserve">— Yirmi beş yıl, dedi Greta’ya bakarak. Hiç değiştirmedin. Tanrım, Gret.</w:t>
+        <w:t xml:space="preserve">— Yirmi beş yıl, dedi Greta’ya bakarak. Kilidi hiç değiştirmedin. Tanrım, Gret.</w:t>
       </w:r>
     </w:p>
     <w:p/>
@@ -6441,7 +6441,7 @@
     <w:p/>
     <w:p>
       <w:r>
-        <w:t xml:space="preserve">— Turta benimdi. O tezgâhta ilk kış, annemin cevizli turtası ve paramızın yetmediği yarım kilo çikolatayla uğraşıp durdum. Dükkânın yarısı benimdi. Daha kapıyı açmadan o yerleri dizlerimin üstünde ovdum. On beş yıl, omuz omuza. Ve hepsini o tuttu. Kapının üstündeki ismi. Turtayı. — Sesi baştan sona aynı tonda kaldı. — Yirmi beş yıldır her Şükran Günü’nde insanlar Greta’nın çikolatalı-cevizli turtası için kapının dışında kuyrukta bekliyor. Grange’daki o kutunun içinde tarifin yazılı olduğu bir kart var. Onu toprağa veriyorlar. Hal için ekmek indirirken okudum. Greta’nın. Senin el yazınla.</w:t>
+        <w:t xml:space="preserve">— Turta benimdi. O tezgâhta ilk kış, annemin pekanlı turtası ve paramızın yetmediği yarım kilo çikolatayla uğraşıp durdum. Dükkânın yarısı benimdi. Daha kapıyı açmadan o yerleri dizlerimin üstünde ovdum. On beş yıl, omuz omuza. Ve hepsini o tuttu. Kapının üstündeki ismi. Turtayı. — Sesi baştan sona aynı tonda kaldı. — Yirmi beş yıldır her Şükran Günü’nde insanlar Greta’nın çikolatalı-pekanlı turtası için kapının dışında kuyrukta bekliyor. Grange’daki o kutunun içinde tarifin yazılı olduğu bir kart var. Onu toprağa veriyorlar. Hal için ekmek indirirken okudum. Greta’nın. Senin el yazınla.</w:t>
       </w:r>
     </w:p>
     <w:p/>
@@ -6507,7 +6507,7 @@
     <w:p/>
     <w:p>
       <w:r>
-        <w:t xml:space="preserve">— Ve suçun ellerimde olduğunu sanmama izin verdin. — Greta’nın sesi alçaldı. — Dört parti. Mutfakta durup kendi kendime, Greta, işte bu, o hüner parmaklarından gitti, sen de bunu fark edemeyecek kadar yaşlısın dedim. Böyle düşüneceğimi biliyordun. Beni on beş yıldır tanıyordun. İnanacağım tek şeyin bu olduğunu biliyordun.</w:t>
+        <w:t xml:space="preserve">— Ve suçun ellerimde olduğunu sanmama izin verdin. — Greta’nın sesi alçaldı. — Dört parti. Mutfakta durup kendi kendime, Greta, işte bu, o hüner parmaklarından gitti, sen de bunu fark edemeyecek kadar yaşlısın dedim. Böyle düşüneceğimi biliyordun. Beni on beş yıl boyunca tanıdın. İnanacağım tek şeyin bu olduğunu biliyordun.</w:t>
       </w:r>
     </w:p>
     <w:p/>
@@ -6641,7 +6641,7 @@
     <w:p/>
     <w:p>
       <w:r>
-        <w:t>Her şey, daha önce söylediği gibi sessiz sedasız halledilmişti. Ne bir kalabalık vardı ne de gürültü. Doktor’un kilitli dolabından un kavanozumu, yanında kendi imzalı notuyla birlikte bizzat o almış, Danny’nin ifadesini de usulca bir kenara çekip aldığı her adımı kaydetmişti.</w:t>
+        <w:t xml:space="preserve">Her şey, daha önce söylediği gibi sessiz sedasız halledilmişti. Ne bir kalabalık vardı ne de gürültü. Doktor’un kilitli dolabından un kavanozumu, yanında kendi imzalı notuyla birlikte bizzat o almış, Danny’nin ifadesini de usulca, bir kenarda almış ve attığı her adımı o anda kaydetmişti.</w:t>
       </w:r>
     </w:p>
     <w:p/>
@@ -6940,7 +6940,7 @@
     <w:p/>
     <w:p>
       <w:r>
-        <w:t xml:space="preserve">Greta ellerini önünde kavuşturup uzun süre kağıda baktı. İlçeden gelen son kağıt sarı renkteydi. Sonra vitrinin altından uzanıp ona çikolatalı-cevizli turtanın bir köşesini kesti ve eline tutuşturdu. Ortada affedilecek bir husus yoktu. O sadece kendilerinin gönderdiği bir adamdı. Gitmeden önce, sırtını soğuğa vererek kapı eşiğinde durdu ve her bir kırıntısını yedi.</w:t>
+        <w:t xml:space="preserve">Greta ellerini önünde kavuşturup uzun süre kağıda baktı. İlçeden gelen son kağıt sarı renkteydi. Sonra vitrinin altından uzanıp ona çikolatalı-pekanlı turtanın bir köşesini kesti ve eline tutuşturdu. Ortada affedilecek bir husus yoktu. O sadece kendilerinin gönderdiği bir adamdı. Gitmeden önce, sırtını soğuğa vererek kapı eşiğinde durdu ve her bir kırıntısını yedi.</w:t>
       </w:r>
     </w:p>
     <w:p/>
@@ -7048,7 +7048,7 @@
     <w:p/>
     <w:p>
       <w:r>
-        <w:t xml:space="preserve">Pete'in yüzü bir an kasıldı ama sonra duruldu. Eski bir husumetin diğer ucundan gelen aynı el ona da haksızlık etmişti. Tezgahın önüne yaklaştı, belli ki istemediği çikolatalı-cevizli bir turta satın aldı ve kasap titizliğiyle camın kenarında yiyerek dikildi. Arkasındaki adamlardan biri "Şey, Pete, o yükleme rampası hakkında…" diye lafa başlayacak olduğunda Pete arkasını dönüp ona öyle bir baktı ki, adam kendine başka meşguliyetler buldu.</w:t>
+        <w:t xml:space="preserve">Pete'in yüzü bir an kasıldı ama sonra duruldu. Eski bir husumetin diğer ucundan gelen aynı el ona da haksızlık etmişti. Tezgahın önüne yaklaştı, belli ki istemediği çikolatalı-pekanlı bir turta satın aldı ve kasap titizliğiyle camın kenarında yiyerek dikildi. Arkasındaki adamlardan biri "Şey, Pete, o yükleme rampası hakkında…" diye lafa başlayacak olduğunda Pete arkasını dönüp ona öyle bir baktı ki, adam kendine başka meşguliyetler buldu.</w:t>
       </w:r>
     </w:p>
     <w:p/>
@@ -7066,13 +7066,13 @@
     <w:p/>
     <w:p>
       <w:r>
-        <w:t xml:space="preserve">Kuyruk azaldığında beni tezgahın arkasına, fırınların tıkırtılarla çalıştığı sıcacık köşeye çekti ve kasa çekmecesini gösterdi. Çekmece kapanmıyordu. — Şuna bak, dedi. Zafer sarhoşu değildi. Birikimlerini iyi una yatırmış, sarı kâğıt tezgâhında dururken parti parti unun bozulmasını çaresizce izlemişti, şimdi ise sadece hayrete düşmüş gibi görünüyordu. — Tek bir öğleden sonra, Jessica. Üstelik mahkeme parası da kuralına uygun olarak üstüne eklenecek, onun mahvettiğinin dolarına dolarına karşılığı. Şef isteyecekleri miktarı bana okudu. — Elinin ayasıyla çekmeceyi itmeye çalıştı ama sonunda vazgeçti. — Zor durumdaydım. Değildim diyemem. Gözümü kırpmadan hesap kitap yaparak sabahlardım, kasaba ise bunu tek bir öğleden sonra geri ödedi; kimse de buna sadaka demedi. Pazartesi dediler. — Şimdiden yenisini yoğurmaya başladığı tarçınlı çörekler için soğukta hâlâ kuyrukta bekleyenlere buğulu camdan baktı.</w:t>
-      </w:r>
-    </w:p>
-    <w:p/>
-    <w:p>
-      <w:r>
-        <w:t xml:space="preserve">Şükran Günü sipariş defteri duvar telefonunun altındaki arka masada açıktı ve ben daha tek kelime edemeden ahizeyi eline almış, parmağını sütunun başındaki ilk isme götürmüştü. — Martha? Ben Greta. Listede seni iki çikolatalı-cevizli turta ve bir düzine çörekle kaydetmişim, bunları alacağını söylemek için arıyorum. — Kısa bir duraklama. Dudakları önce gerildi, sonra yumuşadı. — Hayır, tatlım. O işi benden başkası yapmıyor. — Telefonu kapattı, parmağını bir satır aşağı kaydırıp diğer numarayı tuşladı.</w:t>
+        <w:t xml:space="preserve">Kuyruk azaldığında beni tezgahın arkasına, fırınların tıkırtılarla çalıştığı sıcacık köşeye çekti ve kasa çekmecesini gösterdi. Çekmece kapanmıyordu. — Şuna bak, dedi. Zafer sarhoşu değildi. Birikimlerini iyi una yatırmış, sarı kâğıt tezgâhında dururken parti parti unun bozulmasını çaresizce izlemişti, şimdi ise sadece hayrete düşmüş gibi görünüyordu. — Tek bir öğleden sonra, Jessica. Üstelik mahkeme parası da kuralına uygun olarak üstüne eklenecek, onun mahvettiğinin doları dolarına karşılığı. Şef isteyecekleri miktarı bana okudu. — Elinin ayasıyla çekmeceyi itmeye çalıştı ama sonunda vazgeçti. — Zor durumdaydım. Değildim diyemem. Gözümü kırpmadan hesap kitap yaparak sabahlardım, kasaba ise bunu tek bir öğleden sonra geri ödedi; kimse de buna sadaka demedi. Pazartesi dediler. — Şimdiden yenisini yoğurmaya başladığı tarçınlı çörekler için soğukta hâlâ kuyrukta bekleyenlere buğulu camdan baktı.</w:t>
+      </w:r>
+    </w:p>
+    <w:p/>
+    <w:p>
+      <w:r>
+        <w:t xml:space="preserve">Şükran Günü sipariş defteri duvar telefonunun altındaki arka masada açıktı ve ben daha tek kelime edemeden ahizeyi eline almış, parmağını sütunun başındaki ilk isme götürmüştü. — Martha? Ben Greta. Listede seni iki çikolatalı-pekanlı turta ve bir düzine çörekle kaydetmişim, bunları alacağını söylemek için arıyorum. — Kısa bir duraklama. Dudakları önce gerildi, sonra yumuşadı. — Hayır, tatlım. O işi benden başkası yapmıyor. — Telefonu kapattı, parmağını bir satır aşağı kaydırıp diğer numarayı tuşladı.</w:t>
       </w:r>
     </w:p>
     <w:p/>
@@ -7084,7 +7084,7 @@
     <w:p/>
     <w:p>
       <w:r>
-        <w:t>Ben ayrılırken elime bir turta sıkıştırdı. İstememiştim, aklımdan da geçmemişti ama çikolatalı-cevizli turtanın tamamını paketleyip kollarıma verdi, ardından unlu ellerini kutunun üzerindeki ellerimin üzerine bir anlığına bastırdı.</w:t>
+        <w:t xml:space="preserve">Ben ayrılırken elime bir turta sıkıştırdı. İstememiştim, aklımdan da geçmemişti ama çikolatalı-pekanlı turtanın tamamını paketleyip kollarıma verdi, ardından unlu ellerini kutunun üzerindeki ellerimin üzerine bir anlığına bastırdı.</w:t>
       </w:r>
     </w:p>
     <w:p/>
@@ -7131,7 +7131,7 @@
     <w:p/>
     <w:p>
       <w:r>
-        <w:t xml:space="preserve">Daha kolay bir yolu da vardı. Haftalar önce Bay Worthington bütün meblağı tek bir çekle ödemeyi teklif etmişti. Ona çekin kendisinde kalmasını söylemiş, eve yürürken o soğukta akıllıca mı davrandığımı yoksa sadece inatçılık mı ettiğimi düşünmüştüm. Şimdi biliyordum. Erken saatlerin griliğinde meydanın sertleşmiş karı üzerinde duruyordum, nefesim havaya beyaz buharlar halinde karışırken ilk kızaklar ve el arabaları cadde boyunca Cemiyetin yeşil kapısına doğru geliyordu. Kasaba masrafı karşılayamayacak durumda kalırsa teklifi hâlâ geçerliydi ve mecbur kalmadıkça ona haber göndermeye niyetim yoktu. Kasaba kendi çatısının parasını öderse, bina donmuş temellerine kadar tamamen kasabanın olacaktı. İşte bugün, ödemeyi yaptığımız sabahtı.</w:t>
+        <w:t xml:space="preserve">Daha kolay bir yolu da vardı. Haftalar önce Bay Worthington bütün meblağı tek bir çekle ödemeyi teklif etmişti. Ona çekin kendisinde kalmasını söylemiş, eve yürürken o soğukta akıllıca mı davrandığımı yoksa sadece inatçılık mı ettiğimi düşünmüştüm. Şimdi biliyordum. Erken saatlerin griliğinde meydanın sertleşmiş karı üzerinde duruyordum, nefesim havaya beyaz buharlar halinde karışırken ilk kızaklar ve el arabaları cadde boyunca Cemiyet'in yeşil kapısına doğru geliyordu. Kasaba masrafı karşılayamayacak durumda kalırsa teklifi hâlâ geçerliydi ve mecbur kalmadıkça ona haber göndermeye niyetim yoktu. Kasaba kendi çatısının parasını öderse, bina donmuş temellerine kadar tamamen kasabanın olacaktı. İşte bugün, ödemeyi yaptığımız sabahtı.</w:t>
       </w:r>
     </w:p>
     <w:p/>
@@ -7281,7 +7281,7 @@
     <w:p/>
     <w:p>
       <w:r>
-        <w:t xml:space="preserve">Camın ötesinde, çocukların yaptığı kardan adamlar sıra sıra meydanda duruyor, kömürden gözleriyle Cemiyete bakıyorlardı.</w:t>
+        <w:t xml:space="preserve">Camın ötesinde, çocukların yaptığı kardan adamlar sıra sıra meydanda duruyor, kömürden gözleriyle Cemiyet'e bakıyorlardı.</w:t>
       </w:r>
     </w:p>
     <w:p/>
@@ -7299,7 +7299,7 @@
     <w:p/>
     <w:p>
       <w:r>
-        <w:t xml:space="preserve">Cemiyet kapılarını bütün kasabaya açmıştı. İnsanlar düşen karın içinden içeri girip omuz omuza durdular, paltolarından buharlar tütüyordu; sedir kutunun açık durduğu yan masanın etrafında yavaş ve sakin bir halka oluşturdular. İlk sunulanlar hâlâ dibinde duruyordu: Bir çocuğun saat kulesi çizimi, preslenmiş akçaağaç yaprağı, Greta'nın çikolatalı-cevizli tarif kartı ve Bram'ın başparmaktan büyük olmayan iki minik eldiveni. Duvara, onun üzerine Claire Grange kampanyasının kartını iliştirmişti. </w:t>
+        <w:t xml:space="preserve">Cemiyet kapılarını bütün kasabaya açmıştı. İnsanlar düşen karın içinden içeri girip omuz omuza durdular, paltolarından buharlar tütüyordu; sedir kutunun açık durduğu yan masanın etrafında yavaş ve sakin bir halka oluşturdular. İlk sunulanlar hâlâ dibinde duruyordu: Bir çocuğun saat kulesi çizimi, preslenmiş akçaağaç yaprağı, Greta'nın çikolatalı-pekanlı tarif kartı ve Bram'ın başparmaktan büyük olmayan iki minik eldiveni. Duvara, onun üzerine Claire Grange kampanyasının kartını iliştirmişti. </w:t>
       </w:r>
       <w:r>
         <w:rPr>
@@ -7443,7 +7443,7 @@
     <w:p/>
     <w:p>
       <w:r>
-        <w:t xml:space="preserve">Oda sessizliğe büründü. Çizim kutunun içine konulmadı. Cemiyetin koleksiyonuna aitti.</w:t>
+        <w:t xml:space="preserve">Oda sessizliğe büründü. Çizim kutunun içine konulmadı. Cemiyet'in koleksiyonuna aitti.</w:t>
       </w:r>
     </w:p>
     <w:p/>
@@ -7604,7 +7604,7 @@
         <w:rPr>
           <w:i/>
         </w:rPr>
-        <w:t xml:space="preserve">Turtaya gelince. Yirmi beş yıldır kendimi onun benim olduğuna inandırdım. Annemin cevizleri, benim fikrim. Ama çekip gittiğim günden beri hiç pişirmedim ve sen her sabah pişirdin. Kartını kutunun içinde bırak.</w:t>
+        <w:t xml:space="preserve">Turtaya gelince. Yirmi beş yıldır kendimi onun benim olduğuna inandırdım. Annemin pekanları, benim fikrim. Ama çekip gittiğim günden beri hiç pişirmedim ve sen her sabah pişirdin. Kartını kutunun içinde bırak.</w:t>
       </w:r>
     </w:p>
     <w:p>
@@ -7732,7 +7732,7 @@
     <w:p/>
     <w:p>
       <w:r>
-        <w:t>Martha, yürüyüş yolunda beni yakaladı; Snowball bileğinin etrafında huysuzluk ediyor, Emma Redfern de arkasından sundurma basamaklarından sekerek iniyordu, soğuktan ve koşmaktan yanakları al al olmuştu.</w:t>
+        <w:t xml:space="preserve">Martha, yürüyüş yolunda beni yakaladı; Snowball bileğinin etrafında huysuzluk ediyor, Emma Redfern de arkasından veranda basamaklarından sekerek iniyordu, soğuktan ve koşmaktan yanakları al al olmuştu.</w:t>
       </w:r>
     </w:p>
     <w:p/>
@@ -7810,7 +7810,7 @@
     <w:p/>
     <w:p>
       <w:r>
-        <w:t xml:space="preserve">Avucumun altındaydı: Binlerce Noelin serbest kalmış o neşeli büyüsü, ocağına bir el boyu daha yaklaştırılmıştı. Atölye penceresinin ötesinde kar avlunun ve patikanın üzerine aralıksız yağıyordu. Kasabaya da yağıyordu, Cemiyet’teki kutuların ve meydandaki kardan adamların üzerine. Evergreen’de Greta, karanlığa karşı altı fırınını birden çalıştırıyordu.</w:t>
+        <w:t xml:space="preserve">Avucumun altındaydı: Binlerce Noel’in serbest kalmış o neşeli büyüsü, ocağına bir el boyu daha yaklaştırılmıştı. Atölye penceresinin ötesinde kar avlunun ve patikanın üzerine aralıksız yağıyordu. Kasabaya da yağıyordu, Cemiyet’teki kutuların ve meydandaki kardan adamların üzerine. Evergreen’de Greta, karanlığa karşı altı fırınını birden çalıştırıyordu.</w:t>
       </w:r>
     </w:p>
     <w:p/>
@@ -7870,17 +7870,17 @@
     </w:p>
     <w:p>
       <w:r>
-        <w:t xml:space="preserve">Ölmüş bir büyük halanın vasiyeti bir çıkış yolu sunuyordu — kartpostal gibi kusursuz Pinecrest kasabasında tozlu bir kitap ciltleme dükkânı, satıp unutması için ona kalmıştı. Ardından Tarih Cemiyeti başkanı, Ay Işığı Maskeli Balo’da küçük bir deri günlüğü avuçlarının arasında sıkarak yığılıverdi ve şerif Fiona’dan bunu incelemesini istedi.</w:t>
-      </w:r>
-    </w:p>
-    <w:p>
-      <w:r>
-        <w:t>Kitaba dokunduğu anda, hiçbir belgenin bilmemesi gereken şeyleri gösterdi ona: Korku, suçluluk, gizli bir gerçek. Meğer Pinecrest, Viktorya dönemine ait cazibesinden çok daha eski bir büyüyle ayakta duruyordu ve biri bunu insan öldürmek için kullanıyordu.</w:t>
-      </w:r>
-    </w:p>
-    <w:p>
-      <w:r>
-        <w:t xml:space="preserve">Fiona bir mirası halletmeye gelmişti. Açıklayamadığı ve kanıtlayamadığı bir yetenekle bunun yerine bir cinayeti çözmek zorunda kalacaktı.</w:t>
+        <w:t xml:space="preserve">Ölmüş bir büyük halanın vasiyeti bir çıkış yolu sunuyor — kartpostal gibi kusursuz Pinecrest kasabasında tozlu bir kitap ciltleme dükkânı, satıp unutması için ona kalmış. Ardından Tarih Cemiyeti başkanı, Ay Işığı Maskeli Balo’da küçük bir deri günlüğü avuçlarının arasında sıkarak yığılıveriyor ve şerif Fiona’dan bunu incelemesini istiyor.</w:t>
+      </w:r>
+    </w:p>
+    <w:p>
+      <w:r>
+        <w:t xml:space="preserve">Kitaba dokunduğu anda, hiçbir belgenin bilmemesi gereken şeyleri gösteriyor ona: Korku, suçluluk, gizli bir gerçek. Meğer Pinecrest, Viktorya dönemine ait cazibesinden çok daha eski bir büyüyle ayakta duruyormuş ve biri bunu insan öldürmek için kullanıyor.</w:t>
+      </w:r>
+    </w:p>
+    <w:p>
+      <w:r>
+        <w:t xml:space="preserve">Fiona bir mirası halletmeye geldi. Açıklayamadığı ve kanıtlayamadığı bir yetenekle, bunun yerine bir cinayeti çözmek zorunda kalacak.</w:t>
       </w:r>
     </w:p>
     <w:p>

</xml_diff>

<commit_message>
Full proofcheck Flour Play Turkish: SIGNIFICANT (109 edits)
Co-Authored-By: Claude Opus 5.5 <noreply@anthropic.com>
Claude-Session: https://claude.ai/code/session_012Cm8JxdqzjuttdUSdkQCUg
</commit_message>
<xml_diff>
--- a/translated/corrected/Flour Play - ASSEMBLED - FORMATTED_Turkish.docx
+++ b/translated/corrected/Flour Play - ASSEMBLED - FORMATTED_Turkish.docx
@@ -167,7 +167,7 @@
     <w:p/>
     <w:p>
       <w:r>
-        <w:t xml:space="preserve">Onun için yavaşladım. Üç dalı iskelete yerleştirdim, iki tur telle bağladım ve bir sonraki demeti ilkinin üzerine, bağı gizleyecek şekilde koydum. — Her biri balık pulu gibi bir öncekinin üzerine gelir. Hepsi de aynı yöne bakar.</w:t>
+        <w:t xml:space="preserve">Onun için yavaşladım. Üç dalı iskelete yerleştirdim, iki tur telle bağladım ve bir sonraki demeti ilkinin üzerine, bağı gizleyecek şekilde koydum. — Her biri balık pulu gibi bir öncekinin üzerine gelir. Hepsi de eve doğru bakar.</w:t>
       </w:r>
     </w:p>
     <w:p/>
@@ -203,13 +203,13 @@
     <w:p/>
     <w:p>
       <w:r>
-        <w:t xml:space="preserve">O sabah hepimiz oradaydık. Soğuğa yenik düşen ya da torun bakanlar hariç bütün çember oradaydı. Olivia, dükkânının başköşesinde, bir kışın isteyebileceği her renkte üst üste yığılmış yün çilelerinin arasında oturuyordu. Hemen yanında sade ve çevik Dot vardı. Sonra, Gazette için yazan Claire Bennett; sandalyesinin kolçağında açık duran defteriyle, çünkü Claire hiçbir zaman tam anlamıyla mesai dışı sayılmazdı. Bir satır karalamak için çelengini sürekli elinden bırakıyor, sonra bizlerin bir adım gerisinden yeniden eline alıyordu. Hemen yanında Ivy; gülüşü öyle gür ve öyle hazırdı ki onun varlığı bile dükkânı daha aydınlık gösteriyordu. Farkında bile olmadan saçına köknar reçinesi bulaştırmıştı. Martha, emekli öğretmen; eşini kaybedeli daha bir yıl olmamıştı, küçük beyaz köpeği Snowball ayak bileğine kıvrılmış uyuyordu. Ara sıra eli, köpeğin kulağına dokunmak için aşağı sarkıyordu. Hâlâ orada olduğundan emin olmak için. Ve Ellie; kibar ve acelecesiz, hastane gönüllülüğünü haftada üç güne çıkarmıştı. O sarsılmaz şefkati bir tel iskelete bile taşıyordu. Çelengi yapılmıştan ziyade adeta doğmuş gibi görünüyordu.</w:t>
-      </w:r>
-    </w:p>
-    <w:p/>
-    <w:p>
-      <w:r>
-        <w:t xml:space="preserve">Ve Pip; çemberden biri değildi ama kimlerin hazır bulunduğunun sayımında dışarıda bırakılmaya şiddetle alınırdı. Ön pencerenin altına, Kasım ayının o alçak güneşinin vurduğu tek noktaya yerleşmişti; Olivia’nın fark ettiğim kadarıyla geri almak için pek de uğraşmadığı yere düşmüş kırmızı bir yün çilesinden yaptığı yuvaya kurulmuştu. Orada pırıl pırıl ve memnun bir şekilde uzanıyordu, tek gözü yarı aralık halde hem olan biteni hem de parıldayan her şeyi kolluyordu. Parıldayan çok şey de vardı doğrusu. Olivia’nın masasının üzerinde yaldızlı kozalaklardan oluşan bir kavanoz, yanında da bir makara altın kurdele duruyordu. Pip ikisi için de uyarılmıştı. Hem de iki kez.</w:t>
+        <w:t xml:space="preserve">O sabah hepimiz oradaydık. Kimsenin soğuk algınlığıyla yatağa düşmediği ya da torun bakmadığı günlerdeki gibi, bütün çember oradaydı. Olivia, dükkânının başköşesinde, bir kışın isteyebileceği her renkte üst üste yığılmış yün çilelerinin arasında oturuyordu. Hemen yanında sade ve çevik Dot vardı. Sonra, Gazette için yazan Claire Bennett; sandalyesinin kolçağında açık duran defteriyle, çünkü Claire hiçbir zaman tam anlamıyla mesai dışı sayılmazdı. Bir satır karalamak için çelengini sürekli elinden bırakıyor, sonra bizlerin bir adım gerisinden yeniden eline alıyordu. Hemen yanında Ivy; gülüşü öyle gür ve öyle hazırdı ki onun varlığı bile dükkânı daha aydınlık gösteriyordu. Farkında bile olmadan saçına köknar reçinesi bulaştırmıştı. Martha, emekli öğretmen; eşini kaybedeli daha bir yıl olmamıştı, küçük beyaz köpeği Snowball ayak bileğine kıvrılmış uyuyordu. Ara sıra eli, köpeğin kulağına dokunmak için aşağı sarkıyordu. Hâlâ orada olduğundan emin olmak için. Ve Ellie; kibar ve acelecesiz, hastane gönüllülüğünü haftada üç güne çıkarmıştı. O sarsılmaz şefkati bir tel iskelete bile taşıyordu. Çelengi yapılmıştan ziyade adeta doğmuş gibi görünüyordu.</w:t>
+      </w:r>
+    </w:p>
+    <w:p/>
+    <w:p>
+      <w:r>
+        <w:t xml:space="preserve">Ve Pip; çemberden biri değildi ama kimlerin hazır bulunduğunun sayımında dışarıda bırakılmaya şiddetle alınırdı. Ön pencerenin altına, kasım ayının o alçak güneşinin vurduğu tek noktaya yerleşmişti; Olivia’nın fark ettiğim kadarıyla geri almak için pek de uğraşmadığı yere düşmüş kırmızı bir yün çilesinden yaptığı yuvaya kurulmuştu. Orada pırıl pırıl ve memnun bir şekilde uzanıyordu, tek gözü yarı aralık halde hem olan biteni hem de parıldayan her şeyi kolluyordu. Parıldayan çok şey de vardı doğrusu. Olivia’nın masasının üzerinde yaldızlı kozalaklardan oluşan bir kavanoz, yanında da bir makara altın kurdele duruyordu. Pip ikisi için de uyarılmıştı. Hem de iki kez.</w:t>
       </w:r>
     </w:p>
     <w:p/>
@@ -299,7 +299,7 @@
     <w:p/>
     <w:p>
       <w:r>
-        <w:t xml:space="preserve">O zaman sekiz kadın, bir kutu kek, bir penguen ve uyuyan bir köpekle cidden işe koyulduk. Sohbet, çember sohbetlerine mahsus olduğu üzere işin içine girip çıkıyor, dalları bağlamanın arasındaki boşluklarda bütün bir sabahın küçük haberleri paylaştırılıyordu. Ivy’nin kızının Concord’da yeni bir işi vardı. Claire’in Perşembe günü belediyenin kar küreme programıyla ilgili, kulağa geldiğinden çok daha ilginç olduğuna bizi yeminle inandırdığı bir yazısı çıkacaktı. Martha, günlerin o kadar hızlı kısaldığını, Emma’nın Snowball’u neredeyse karanlıkta yürütmeye geldiğini söyledi ve ben de çocuğa sevgilerimi iletmesini söyledim. Martha da Emma’nın her zaman Pip’i sorduğunu belirtti. Ve adını duyan, bunu övgü olarak haklı bir şekilde alan Pip tüylerini kabartıp memnun bir ifade takındı.</w:t>
+        <w:t xml:space="preserve">O zaman sekiz kadın, bir kutu kek, bir penguen ve uyuyan bir köpekle cidden işe koyulduk. Sohbet, çember sohbetlerine mahsus olduğu üzere işin içine girip çıkıyor, dalları bağlamanın arasındaki boşluklarda bütün bir sabahın küçük haberleri paylaştırılıyordu. Ivy’nin kızının Concord’da yeni bir işi vardı. Claire’in perşembe günü belediyenin kar küreme programıyla ilgili, kulağa geldiğinden çok daha ilginç olduğuna bizi yeminle inandırdığı bir yazısı çıkacaktı. Martha, günlerin o kadar hızlı kısaldığını, Emma’nın Snowball’u neredeyse karanlıkta yürütmeye geldiğini söyledi ve ben de çocuğa sevgilerimi iletmesini söyledim. Martha da Emma’nın her zaman Pip’i sorduğunu belirtti. Ve adını duyan, bunu övgü olarak haklı bir şekilde alan Pip tüylerini kabartıp memnun bir ifade takındı.</w:t>
       </w:r>
     </w:p>
     <w:p/>
@@ -329,7 +329,7 @@
     <w:p/>
     <w:p>
       <w:r>
-        <w:t xml:space="preserve">— Kahverengi kâğıtla, camların içinden. Hani bir yeri döşeyip hazırlarken kasabanın seni izlemesini istemediğinde yaptığın gibi. — Claire omuz silkti. — Önünde henüz tabela yok. Ama arka sokakta bir çöp konteyneri var ve Cumartesi günü orada bir minibüs duruyordu; bir yeri boşaltmıyorsan çöp konteyneri kiralamazsın.</w:t>
+        <w:t xml:space="preserve">— Kahverengi kâğıtla, camların içinden. Hani bir yeri döşeyip hazırlarken kasabanın seni izlemesini istemediğinde yaptığın gibi. — Claire omuz silkti. — Önünde henüz tabela yok. Ama arka sokakta bir çöp konteyneri var ve cumartesi günü orada bir minibüs duruyordu; bir yeri boşaltmıyorsan çöp konteyneri kiralamazsın.</w:t>
       </w:r>
     </w:p>
     <w:p/>
@@ -401,7 +401,7 @@
     <w:p/>
     <w:p>
       <w:r>
-        <w:t xml:space="preserve">— Arkalarından süpürmüşlerdir, dedi Dot. Ya da rüzgâr doldurmuştur. Bu bir şaka. Yapacak başka şeyi olmayan soğuk parmaklı bir çocuk. Hafta sonuna kalmadan hepsini döndürürler, nasıl olsa yapılabildiğini gördüler, görürsünüz.</w:t>
+        <w:t xml:space="preserve">— Arkalarından süpürmüşlerdir, dedi Dot. Ya da rüzgâr doldurmuştur. Bu bir şaka. Yapacak başka şeyi olmayan soğuk parmaklı bir çocuk. Hafta sonuna kalmaz bütün sıra dönmüş olur, görürsünüz; ötekiler bunun yapılabildiğini bir görsün.</w:t>
       </w:r>
     </w:p>
     <w:p/>
@@ -460,7 +460,7 @@
     <w:p/>
     <w:p>
       <w:r>
-        <w:t xml:space="preserve">— Duydum seni. — Hâlâ dönmedi. Omuzları kulaklarına kadar kalkmıştı; bunu onda daha önce hiç görmemiştim. Greta, Frost Falls’ta tanıdığım herkesden daha kolay gülerdi. Onu çalışma masasına kapanmış, içeride soğuk bir rüzgâr esiyormuş gibi kasılmış halde bulmak beni paspasın üstünde durdurdu.</w:t>
+        <w:t xml:space="preserve">— Duydum seni. — Hâlâ dönmedi. Omuzları kulaklarına kadar kalkmıştı; bunu onda daha önce hiç görmemiştim. Greta, Frost Falls’ta tanıdığım herkesten daha kolay gülerdi. Onu çalışma masasına kapanmış, içeride soğuk bir rüzgâr esiyormuş gibi kasılmış halde bulmak beni paspasın üstünde durdurdu.</w:t>
       </w:r>
     </w:p>
     <w:p/>
@@ -490,7 +490,7 @@
     <w:p/>
     <w:p>
       <w:r>
-        <w:t>Küçük bir parça koparıp yedim. Keşke yemeseydim. Parmağımın altında aynı yumuşak esnekliğiyle tıpkı onun çörekleri gibi görünüyordu, fakat Temmuz ayında dışarıda bir hafta beklemiş gibi ekşi ve yavan bir tadı vardı. Yüzümü buruşturmamaya çalıştım ama beceremedim. Greta bunu gördü ve omuzları gerildi.</w:t>
+        <w:t>Küçük bir parça koparıp yedim. Keşke yemeseydim. Parmağımın altında aynı yumuşak esnekliğiyle tıpkı onun çörekleri gibi görünüyordu, fakat temmuz ayında dışarıda bir hafta beklemiş gibi ekşi ve yavan bir tadı vardı. Yüzümü buruşturmamaya çalıştım ama beceremedim. Greta bunu gördü ve omuzları gerildi.</w:t>
       </w:r>
     </w:p>
     <w:p/>
@@ -532,7 +532,7 @@
     <w:p/>
     <w:p>
       <w:r>
-        <w:t>Pip tezgâhların altındaki zemini incelemekteydi. Şimdi yanımıza gelip Greta’nın bileğine yaslandı ki bunu normalde benden başkası için pek yapmazdı. Greta aşağıya doğru baktı ve omuzlarındaki gerginliğin bir kısmı uçup gitti.</w:t>
+        <w:t>Pip tezgâhların altındaki zemini incelemekteydi. Şimdi yanımıza gelip Greta’nın ayak bileğine yaslandı ki bunu normalde benden başkası için pek yapmazdı. Greta aşağıya doğru baktı ve omuzlarındaki gerginliğin bir kısmı uçup gitti.</w:t>
       </w:r>
     </w:p>
     <w:p/>
@@ -568,7 +568,7 @@
         <w:t xml:space="preserve">dikkat etmedin, herkes bir kez dikkatsizlik eder.</w:t>
       </w:r>
       <w:r>
-        <w:t xml:space="preserve"> Atıp baştan başladım, yine aynı şey oldu. Şükran Günü siparişleri şu defterde dururken o günden beri köşe bucağı koşturup duruyorum.</w:t>
+        <w:t xml:space="preserve"> Atıp baştan başladım, yine aynı şey oldu. Şükran Günü siparişleri şu defterde dururken o günden beri kendi kuyruğumu kovalayıp duruyorum.</w:t>
       </w:r>
     </w:p>
     <w:p/>
@@ -610,13 +610,13 @@
     <w:p/>
     <w:p>
       <w:r>
-        <w:t>Cevap vermek yerine ayağa kalktım. Greta kuru gıdalarını arka duvar boyunca uzanan uzun bidonlarda saklardı, her birinin kepçesi de hemen üstlerindeki çiviye asılıydı. Un bidonunun kapağını kaldırdım. İnce ve soluk, tıpkı un gibi görünüyordu. Aceleyle çarpan birinin döktüğü az bir kısım, aşağıdaki karoların üzerine dökülmüştü.</w:t>
-      </w:r>
-    </w:p>
-    <w:p/>
-    <w:p>
-      <w:r>
-        <w:t>Pip beni takip etmişti. Bir yere niyetlenerek gittiğimde, belki o niyet balıkla ilgilidir diye her zaman peşimden gelirdi. Bileklerimin etrafından dolaşarak karoların üzerindeki döküntüye vardı ve merakla gagasını oraya uzattı. Her şeyi önce burnuyla incelerdi.</w:t>
+        <w:t>Cevap vermek yerine ayağa kalktım. Greta kuru gıdalarını arka duvar boyunca uzanan uzun bidonlarda saklardı, her birinin kepçesi de hemen üstlerindeki çiviye asılıydı. Un bidonunun kapağını kaldırdım. İnce ve soluk, tıpkı un gibi görünüyordu. Aceleyle çarpan biri yüzünden birazı bidonun kenarından aşağıdaki karoların üzerine dökülmüştü.</w:t>
+      </w:r>
+    </w:p>
+    <w:p/>
+    <w:p>
+      <w:r>
+        <w:t>Pip beni takip etmişti. Bir yere niyetlenerek gittiğimde, belki o niyet balıkla ilgilidir diye her zaman peşimden gelirdi. Ayak bileklerimin etrafından dolaşarak karoların üzerindeki döküntüye vardı ve merakla gagasını oraya uzattı. Her şeyi önce burnuyla incelerdi.</w:t>
       </w:r>
     </w:p>
     <w:p/>
@@ -652,7 +652,7 @@
     <w:p/>
     <w:p>
       <w:r>
-        <w:t xml:space="preserve">Bir saat daha kaldım. Greta’ya bir fincan çay içirdim ve onunla birlikte ben de bir tane içtim. Mahvolmuş ekmekleri kucak kucak sokağa taşımasına, onun bunca emekle hazırladığı harika ürünlerin soğuğa gitmesine yardım ettim. İçeriye girdiğim son seferde, un bidonunun tepesindeki o bozuk undan, ona geri vermeyi planladığım boş reçel kavanozuna bir bardak dolusu doldurdum, kapağını sıkıca vidalayıp palto cebime attım; çünkü Pip o unun yanına bile yaklaşmıyordu. — Yarın yine geleceğim, dedim ona. Temizlik yapmayı bırak da biraz uyu. Sorunun ne olduğunu ikimiz çözeriz.</w:t>
+        <w:t xml:space="preserve">Bir saat daha kaldım. Greta’ya bir fincan çay içirdim ve onunla birlikte ben de bir tane içtim. Mahvolmuş ekmekleri kucak kucak arka sokaktaki çöp kutusuna taşımasına, onun bunca emekle hazırladığı harika ürünlerin soğuğa gitmesine yardım ettim. İçeriye girdiğim son seferde, un bidonunun tepesindeki o bozuk undan, ona geri vermeyi planladığım boş reçel kavanozuna bir bardak dolusu doldurdum, kapağını sıkıca vidalayıp palto cebime attım; çünkü Pip o unun yanına bile yaklaşmıyordu. — Yarın yine geleceğim, dedim ona. Temizlik yapmayı bırak da biraz uyu. Sorunun ne olduğunu ikimiz çözeriz.</w:t>
       </w:r>
     </w:p>
     <w:p/>
@@ -789,7 +789,7 @@
     <w:p/>
     <w:p>
       <w:r>
-        <w:t xml:space="preserve">— Sadece kulak misafiri olduklarım. — Renée serin ellerini tam bir şefkatle iki yana açtı. — Kapısı bütün sabah kapalıydı ve ekmekçiler kötü bir dönem geçirdiğini söylüyor. Partilerin bozulması, o tarz tatsızlıklar. Kadına gerçekten üzülüyorum. — Başını salladı. — Yine de size söyleyeyim, bu sektörde bir mutfağın adı bir kez lekelendi mi — bana dürüst ve hayıflanan bir ifadeyle, sanki bir dostuna sır veren bir meslektaş gibi baktı — insanlar konuşuyor, değil mi? Adil değil ama durum bu. Fırın adıyla yaşar. Bir kez şüphe düştü mü, onu söküp atmak şeytanla baş etmek gibidir. — Gülümsedi. — Ama bana bakın, siz sadece merhaba demeye gelmişken dükkan işlerinden bahsediyorum. İçeri gelin. Fırınları görmenizi istiyorum.</w:t>
+        <w:t xml:space="preserve">— Sadece kulak misafiri olduklarım. — Renée serin ellerini tam bir şefkatle iki yana açtı. — Kapısı bütün sabah kapalıydı ve ekmekçiler kötü bir dönem geçirdiğini söylüyor. Partilerin bozulması, o tarz tatsızlıklar. Kadına gerçekten üzülüyorum. — Başını iki yana salladı. — Yine de size söyleyeyim, bu sektörde bir mutfağın adı bir kez lekelendi mi — bana dürüst ve hayıflanan bir ifadeyle, sanki bir dostuna sır veren bir meslektaş gibi baktı — insanlar konuşuyor, değil mi? Adil değil ama durum bu. Fırın adıyla yaşar. Bir kez şüphe düştü mü, onu söküp atmak şeytanla baş etmek gibidir. — Gülümsedi. — Ama bana bakın, siz sadece merhaba demeye gelmişken dükkan işlerinden bahsediyorum. İçeri gelin. Fırınları görmenizi istiyorum.</w:t>
       </w:r>
     </w:p>
     <w:p/>
@@ -813,7 +813,7 @@
     <w:p/>
     <w:p>
       <w:r>
-        <w:t xml:space="preserve">— İki katlı fırın, dedi, buhar enjeksiyonlu, gazlı. Köy fırıncıları ne derse desin, o olmadan düzgün bir kabuk elde edemezsiniz. Laminasyon hamurları için şurada bir hamur açma makinesi. Ve bu ilçede tek bir mutfakta bile olmayan bir şok soğutucu, üstelik önlüğüm üzerine iddiaya girerim. — Elini çeliğin boyunca gezdirdi. — Lyon’da eğitim aldım. Sonra Montreal’de on bir yıl, ikisinde Noel’de şehrin yarısını besleyen bir pastane işlettim. Aralık ayının ne demek olduğunu bilirim, Jessica. Frost Falls — pırıl pırıl mutfağına gülümseyerek göz gezdirdi — Frost Falls bana tatil gibi gelecek.</w:t>
+        <w:t xml:space="preserve">— İki tane katlı fırın, dedi, buhar enjeksiyonlu, gazlı. Köy fırıncıları ne derse desin, o olmadan düzgün bir kabuk elde edemezsiniz. Laminasyon hamurları için şurada bir hamur açma makinesi. Ve bu ilçede tek bir mutfakta bile olmayan bir şok soğutucu, üstelik önlüğüm üzerine iddiaya girerim. — Elini çeliğin boyunca gezdirdi. — Lyon’da eğitim aldım. Sonra Montreal’de on bir yıl, ikisinde Noel’de şehrin yarısını besleyen bir pastane işlettim. Aralık ayının ne demek olduğunu bilirim, Jessica. Frost Falls — pırıl pırıl mutfağına gülümseyerek göz gezdirdi — Frost Falls bana tatil gibi gelecek.</w:t>
       </w:r>
     </w:p>
     <w:p/>
@@ -1049,7 +1049,7 @@
     <w:p/>
     <w:p>
       <w:r>
-        <w:t xml:space="preserve">Harika görünüyorlardı. Kabarmış ve düzgün, altın sarısı kızarmış bir düzine yumuşak çörek. Yükselen koku sıcak ve mayalıydı; eğer altında ekşimsi bir tat olsaydı bile ben bulamazdım. Greta rahat bir nefes alıp bunlardan birini koparmak için uzandı.</w:t>
+        <w:t xml:space="preserve">Harika görünüyorlardı. Kabarmış ve düzgün, altın sarısı kızarmış bir düzine yumuşak çörek. Yükselen koku sıcak ve mayalıydı; altında ekşimsi bir keskinlik varsa bile ben bulamadım. Greta rahat bir nefes alıp bunlardan birini koparmak için uzandı.</w:t>
       </w:r>
     </w:p>
     <w:p/>
@@ -1103,7 +1103,7 @@
     <w:p/>
     <w:p>
       <w:r>
-        <w:t xml:space="preserve">Mantomu giydim ve sesimdeki değişimi fark edip hemen gelen Pip'e seslendim. İkimiz Evergreen Caddesi'nden aşağı, fırına varana kadar beni nefes nefese bırakan meydandan esen sert, soğuk, ufak bir rüzgârın içinde yürüdük.</w:t>
+        <w:t xml:space="preserve">Mantomu giydim ve sesimdeki değişimi fark edip hemen gelen Pip'e seslendim. İkimiz Evergreen Caddesi'nden aşağı, fırına varmadan beni nefes nefese bırakan bir hızla, meydandan esen sert, soğuk, ufak bir rüzgârın içine doğru yürüdük.</w:t>
       </w:r>
     </w:p>
     <w:p/>
@@ -1313,7 +1313,7 @@
     <w:p/>
     <w:p>
       <w:r>
-        <w:t>İkisinin de söylediği sadece bu kadardı. Greta'nın arkasından Olivia radyatörden başını kaldırıp Ellie'ye baktı, Ellie de ona karşılık verdi.</w:t>
+        <w:t>İkisinin de söylediği sadece bu kadardı. Greta'nın arkasından Olivia radyatörden başını kaldırıp Ellie'ye baktı, Ellie de ona bakarak karşılık verdi.</w:t>
       </w:r>
     </w:p>
     <w:p/>
@@ -1474,7 +1474,7 @@
     <w:p/>
     <w:p>
       <w:r>
-        <w:t>Kapının yanındaki soğuk uçta değil, çemberin sıcak ortasında benim için ayırdıkları sandalyeye oturdum. Olivia hiç söylenmeden kucağıma yeni bir kasnak ve yanına bir avuç köknar dalı koydu. Dalları, uçları hep aynı yöne bakacak şekilde üst üste dizmeye koyuldum ve dinledim.</w:t>
+        <w:t>Kapının yanındaki soğuk uçta değil, çemberin sıcak ortasında benim için ayırdıkları sandalyeye oturdum. Olivia hiç söylenmeden kucağıma yeni bir kasnak ve yanına bir avuç köknar dalı koydu. Dalları, hepsi eve doğru bakacak şekilde üst üste dizmeye koyuldum ve dinledim.</w:t>
       </w:r>
     </w:p>
     <w:p/>
@@ -1672,7 +1672,7 @@
     <w:p/>
     <w:p>
       <w:r>
-        <w:t xml:space="preserve">— Çocuklar, diye onayladı Olivia ve çemberde genel bir rahatlama oldu; bu, kimsenin canını yakmayan bir ismin verdiği rahatlamaydı. — Boya olayı en azından. Bana çocuk işi gibi geliyor. Çalıntı bir kutu boyayla sıkılmış bir oğlan çocuğu, birkaç büyük çirkin kelime ve kimse görmeden kaçış. Hatırlarsanız iki yaz önce top sahasının çiti de böyle boyanmıştı. O işi yapan Petersen'ın oğlu ile bir arkadaşıydı. Biraz korku, biraz ovalama ve babalarıyla konuşulması işi tatlıya bağlamıştı.</w:t>
+        <w:t xml:space="preserve">— Çocuklar, diye onayladı Olivia ve çemberde genel bir rahatlama oldu; bu, kimsenin canını yakmayan bir ismin verdiği rahatlamaydı. — Boya olayı en azından. Bana çocuk işi gibi geliyor. Çalıntı bir kutu boyayla sıkılmış bir oğlan çocuğu, birkaç büyük çirkin kelime ve kimse görmeden kaçış. Hatırlarsanız iki yaz önce top sahasının çiti de böyle boyanmıştı. O işi yapan Petersen'in oğlu ile bir arkadaşıydı. Biraz korku, biraz ovalama ve babalarıyla konuşulması işi tatlıya bağlamıştı.</w:t>
       </w:r>
     </w:p>
     <w:p/>
@@ -1708,7 +1708,7 @@
     <w:p/>
     <w:p>
       <w:r>
-        <w:t xml:space="preserve">— Daha az kanıtla insanları suçladığım oldu geçmişte, dedim, ve yanıldım, üstelik sonrasında onlarla aynı sokakta yaşamak zorunda kaldım. — Çelengimi kaldırdım; bitmişti, bütün dallar aynı yöne bakıyordu. — Greta benden bir tahminden daha fazlasını hak ediyor. Hepimizden bunu hak ediyor.</w:t>
+        <w:t xml:space="preserve">— Daha az kanıtla insanları suçladığım oldu geçmişte, dedim, ve yanıldım, üstelik sonrasında onlarla aynı sokakta yaşamak zorunda kaldım. — Çelengimi kaldırdım; bitmişti, bütün dallar eve doğru bakıyordu. — Greta benden bir tahminden daha fazlasını hak ediyor. Hepimizden bunu hak ediyor.</w:t>
       </w:r>
     </w:p>
     <w:p/>
@@ -1809,7 +1809,7 @@
     <w:p/>
     <w:p>
       <w:r>
-        <w:t xml:space="preserve">Beni başta duymadı. Önünde çatlak çerçeveli eski bir çizim duruyordu ve hakkındaki her şeyi bilmeme rağmen beni bile şaşırtan bir özenle resmi birbirinden ayırıyordu. Küçük çivilerin her birini zorla değil, bir kuyumcu tornavidasıyla çevirerek çıkarıyordu. Dirseğinin yanındaki ahşap bir tepside bunun gibi yüzlerce küçük parça duruyordu: çiviler, köşe korumaları, boyuta göre kesilmiş asitsiz kağıt şeritleri. Cemiyet'i her seferinde bir çiviyle, bunun ne kadar süreceğini bilen ve sürenin uzunluğuyla barışmış bir adamın sabırlı, kambur duruşuyla onarıyordu.</w:t>
+        <w:t xml:space="preserve">Beni başta duymadı. Önünde çatlak çerçeveli eski bir çizim duruyordu ve onun hakkında bildiklerime rağmen beni şaşırtan bir özenle resmi birbirinden ayırıyordu. Küçük çivilerin her birini zorla değil, bir kuyumcu tornavidasıyla çevirerek çıkarıyordu. Dirseğinin yanındaki ahşap bir tepside bunun gibi yüzlerce küçük parça duruyordu: çiviler, köşe korumaları, boyuta göre kesilmiş asitsiz kağıt şeritleri. Cemiyet'i her seferinde bir çiviyle, bunun ne kadar süreceğini bilen ve sürenin uzunluğuyla barışmış bir adamın sabırlı, kambur duruşuyla onarıyordu.</w:t>
       </w:r>
     </w:p>
     <w:p/>
@@ -1827,7 +1827,7 @@
     <w:p/>
     <w:p>
       <w:r>
-        <w:t xml:space="preserve">— Bayan Claus. — Tornavidayı bezin üzerine düzgünce bırakıp ellerini sildi, oysa elleri temizdi. — Zili duymadım. Şef Tanaka, biri geldiğinde herkes bilsin diye zili faal tutmamı söyledi ama sesini dinlemeyi unuttum. — Yüzünde pişman bir ifade belirdi. — Küçük kuralların çoğunu unutuyorum. Onları öğreniyorum.</w:t>
+        <w:t xml:space="preserve">— Bayan Claus. — Tornavidayı bezin üzerine düzgünce bırakıp ellerini sildi, oysa elleri temizdi. — Zili duymadım. Şef Tanaka, biri geldiğinde herkes bilsin diye zili faal tutmamı söyledi ama sesine kulak vermeyi unutuyorum. — Yüzünde pişman bir ifade belirdi. — Küçük kuralların çoğunu unutuyorum. Onları öğreniyorum.</w:t>
       </w:r>
     </w:p>
     <w:p/>
@@ -1965,7 +1965,7 @@
     <w:p/>
     <w:p>
       <w:r>
-        <w:t xml:space="preserve">— Görmeye geliyorlar, dedi Theo gözlerimi takip ederek. — Yıllardır buraya adım atmamış insanlar. Soğuk sokaktan içeri giriyorlar. Kutunun önünde bir dakika durup sonra gidiyorlar. Emma Redfern bütün okul sınıfını getirdi, ipe tutunmuş iki sıra hâlinde, kilisedeki gibi sessiz; içinde kendilerine ait yüz yılın kapalı durduğunu biliyorlardı. — Başını salladı. — Bütün hayatım boyunca insanları bu binaya getirmek için çalıştım. Ve sonunda bunu yapan, mühürlü bir kutu ile eski bir çizimin arkasındaki kurucu cümlesi oldu. Ben değil.</w:t>
+        <w:t xml:space="preserve">— Görmeye geliyorlar, dedi Theo gözlerimi takip ederek. — Yıllardır buraya adım atmamış insanlar. Soğuk sokaktan içeri giriyorlar. Kutunun önünde bir dakika durup sonra gidiyorlar. Emma Redfern bütün okul sınıfını getirdi, ipe tutunmuş iki sıra hâlinde, kilisedeki gibi sessiz; içinde kendilerine ait yüz yılın kapalı durduğunu biliyorlardı. — Başını iki yana salladı. — Bütün hayatım boyunca insanları bu binaya getirmek için çalıştım. Ve sonunda bunu yapan, mühürlü bir kutu ile eski bir çizimin arkasındaki kurucu cümlesi oldu. Ben değil.</w:t>
       </w:r>
     </w:p>
     <w:p/>
@@ -2010,7 +2010,7 @@
         <w:t>Frost Falls güçlüler tarafından kurulmadı. Komşulukla kuruldu.</w:t>
       </w:r>
       <w:r>
-        <w:t xml:space="preserve"> İnsanlar bunu kesip alıyordu. Kelly kendi kupürünü Starlight tezgâhının arkasına, kasanın yanına yapıştırmıştı; kahve alan her ruh onu, çoğunlukla sesli olarak okuyor ve ardından bir an için sessizliğe gömülüyordu. Greta, kırpılmış haberi kapalı dükkanına götürdüğümde, benim yaptığım gibi iki kez okudu. Dudaklarını sıkıca birbirine bastırdı. — Şuna bak, dedi. Sadece bu kadarını söyledi; tam da hatırlatılmaya en çok ihtiyaç duyduğu anda bir şey hatırlatılan bir kadının ses tonuyla. Sonra da dışarıya bakan karanlık penceresinin içine yapıştırdı. Hani tahta kaplamalardaki PİS yazısı daha önce silindiği yere.</w:t>
+        <w:t xml:space="preserve"> İnsanlar bunu kesip alıyordu. Kelly kendi kupürünü Starlight tezgâhının arkasına, kasanın yanına yapıştırmıştı; kahve alan her ruh onu, çoğunlukla sesli olarak okuyor ve ardından bir an için sessizliğe gömülüyordu. Greta, kırpılmış haberi kapalı dükkanına götürdüğümde, benim yaptığım gibi iki kez okudu. Dudaklarını sıkıca birbirine bastırdı. — Şuna bak, dedi. Sadece bu kadarını söyledi; tam da hatırlatılmaya en çok ihtiyaç duyduğu anda bir şey hatırlatılan bir kadının ses tonuyla. Sonra da dışarıya bakan karanlık penceresinin içine yapıştırdı. Hani PİS yazısının kısa süre önce tahta kaplamadan silindiği yere.</w:t>
       </w:r>
     </w:p>
     <w:p/>
@@ -2028,7 +2028,7 @@
         <w:rPr>
           <w:i/>
         </w:rPr>
-        <w:t xml:space="preserve">Cemiyeti Koru</w:t>
+        <w:t xml:space="preserve">Cemiyet'i Koru</w:t>
       </w:r>
       <w:r>
         <w:t xml:space="preserve"> idi.</w:t>
@@ -2037,7 +2037,7 @@
     <w:p/>
     <w:p>
       <w:r>
-        <w:t xml:space="preserve">— Hem çatı hem de kazan, dedi. Kasaba bunu biliyor. Kimse doğrudan bakmak istemiyor, çünkü kasada para yok. Ama. — Sütunlara hafifçe vurdu. — İnsanlar kutuyu görmeye geliyor. Kurucunun cümlesi caddedeki her pencerede var. Dün Frosty'de, parayı elinde sıkı tutan iki kadının, açılması gereken yılda binanın kutunun etrafına yıkılmasına göz yummanın yazık olacağını söylediğini duydum. — Utangaç bir umutla başını kaldırdı. — Yani. Cemiyet için bir varil. İnsanların geçtiği bir yere konulacak. Kimse zorlanmayacak.</w:t>
+        <w:t xml:space="preserve">— Hem çatı hem de kazan, dedi. Kasaba bunu biliyor. Kimse doğrudan bakmak istemiyor, çünkü kasada para yok. Ama. — Sütunlara hafifçe vurdu. — İnsanlar kutuyu görmeye geliyor. Kurucunun cümlesi caddedeki her pencerede var. Dün Frosty's'te, parayı elinde sıkı tutan iki kadının, açılması gereken yılda binanın kutunun etrafına yıkılmasına göz yummanın yazık olacağını söylediğini duydum. — Utangaç bir umutla başını kaldırdı. — Yani. Cemiyet için bir varil. İnsanların geçtiği bir yere konulacak. Kimse zorlanmayacak.</w:t>
       </w:r>
     </w:p>
     <w:p/>
@@ -2108,7 +2108,7 @@
     <w:p/>
     <w:p>
       <w:r>
-        <w:t>Bu sözler onu tam da hedeflediğim yerden yakaladı ve Pete’in yüzü, mesleğinin verdiği katıksız memnuniyetle gevşedi. Tezgâhın etrafından dolaşıp mermersi bir bonfileyi hemen yanındaki gerdan etiyle tarttı, bir terazi kadar dürüsttü. Sonra beni daha ucuz olan kesime yönlendirdi; çünkü o işi daha iyi görecekti ve ucuz olan doğruyken bana pahalısını satmayacaktı. Arkamdan dükkâna girip bir penguenin ilgisini hak edecek bir şey kalmış mıdır diye talaşların arasında devriye gezen Pip, ortalığın acımasızca süpürülmüş olduğunu fark etti. Hizmetten hayal kırıklığına uğramış bir müşterinin havasıyla tezgâhın dibinde dikildi.</w:t>
+        <w:t>Bu sözler onu tam da hedeflediğim yerden yakaladı ve Pete’in yüzü, mesleğinin verdiği katıksız memnuniyetle gevşedi. Tezgâhın etrafından dolaşıp mermersi bir but parçasını hemen yanındaki gerdan etiyle tarttı, bir terazi kadar dürüsttü. Sonra beni daha ucuz olan kesime yönlendirdi; çünkü o işi daha iyi görecekti ve ucuz olan doğruyken bana pahalısını satmayacaktı. Arkamdan dükkâna girip bir penguenin ilgisini hak edecek bir şey kalmış mıdır diye talaşların arasında devriye gezen Pip, ortalığın acımasızca süpürülmüş olduğunu fark etti. Hizmetten hayal kırıklığına uğramış bir müşterinin havasıyla tezgâhın dibinde dikildi.</w:t>
       </w:r>
     </w:p>
     <w:p/>
@@ -2180,7 +2180,7 @@
     <w:p/>
     <w:p>
       <w:r>
-        <w:t xml:space="preserve">Ürküp ürkmediğini izledim. Aldığım tek şey burnundan sert bir soluk, gri kafasının bir sallayışı ve yanlış anlatılan bir hikâyeden yorulmuş bir adamın iğrenmesiydi.</w:t>
+        <w:t xml:space="preserve">Ürküp ürkmediğini izledim. Aldığım tek şey burnundan sert bir soluk, gri başını iki yana sallayışı ve yanlış anlatılan bir hikâyeden yorulmuş bir adamın iğrenmesiydi.</w:t>
       </w:r>
     </w:p>
     <w:p/>
@@ -2249,7 +2249,7 @@
     <w:p/>
     <w:p>
       <w:r>
-        <w:t xml:space="preserve">— Ortalık aydınlandığında basamağının etrafında bot izleri oluyor, dedi Pete. Kendi kendime bunların sevkiyatçılara, kendisine ya da üzerlerinden geçip giden bana ait olduğunu söyledim. Bu kadar hareketli bir avluda, iz izdir. — Bana baktı, net bir şekilde; başka hiçbir yere bırakamadığı bir yükü indiren bir adam gibi. — Ama her zaman işin yürütüldüğü yerde değildiler. Bazı sabahlar pencerenin altında, duvarına o kadar yakın yerlerdendiler ki, caddeden görülmemeye dikkat etmek dışında orada durmak için hiçbir neden yoktu. — Ağır bir hareketle omuz silkti. — Ya da arkada soğuk hava deposu olan ve paçayı kurtarmak için siluet uyduran kasap değilseniz. Nasıl duyulduğunu biliyorum. Son zamanlarda söylediğim her şeyin nasıl duyulduğunu çok iyi duydum.</w:t>
+        <w:t xml:space="preserve">— Ortalık aydınlandığında basamağının etrafında bot izleri oluyor, dedi Pete. Kendi kendime bunların sevkiyatçılara, kendisine ya da üzerlerinden geçip giden bana ait olduğunu söyledim. Bu kadar hareketli bir avluda, iz izdir. — Bana baktı, net bir şekilde; başka hiçbir yere bırakamadığı bir yükü indiren bir adam gibi. — Ama her zaman işin yürütüldüğü yerde değildiler. Bazı sabahlar pencerenin altında, duvarına o kadar yakın yerlerdendiler ki, caddeden görülmemeye dikkat etmek dışında orada durmak için hiçbir neden yoktu. — Ağır bir hareketle omuz silkti. — Tabii bir de bunu, arkada soğuk hava deposu olan ve paçayı kurtarmak için siluet uyduran kasap anlatıyorsa. Nasıl duyulduğunu biliyorum. Son zamanlarda söylediğim her şeyin nasıl duyulduğunu çok iyi duydum.</w:t>
       </w:r>
     </w:p>
     <w:p/>
@@ -2358,12 +2358,12 @@
     </w:p>
     <w:p>
       <w:r>
-        <w:t xml:space="preserve">Gece yarısı, Frost Falls’taki bütün kardan adamlar yer değiştirmişti.</w:t>
-      </w:r>
-    </w:p>
-    <w:p>
-      <w:r>
-        <w:t xml:space="preserve">Uzağa değil. Onu korkunç değil de komik kılan, sokaktaki insanlara kapılarını kilitletecekmiş gibi değil de güldürecek kılan şey de buydu zaten. Otuz santim, belki altmış. Meydandaki çocukların o tombul üçlüsü, yola bakan dost canlısı bir sıra halinde duruyorlardı. Gece vakti birbirlerine yanaşmışlar, o kaba saba omuzları birbirine değmişti. Sanki aralarında bir meseleyi konuşmak için kümelenmişlerdi de laflarını yarıda kesmezseniz pek memnun olurlardı. Savaş anıtının yanındaki, neredeyse bir insan boyundaki görkemli kardan adam, yerinden kallavi bir adım uzaklaşmıştı. Gövdesinin üzerine doğru öne eğilmişti. Biri ateşe doğru eğilir gibi. Kilisenin önündeki ikisi basamaklarından inmişti. Kapıların açılmasını bekleyen cemaat üyeleri gibi sabırlı duruyorlardı.</w:t>
+        <w:t xml:space="preserve">Bir gecede, Frost Falls’taki bütün kardan adamlar yer değiştirmişti.</w:t>
+      </w:r>
+    </w:p>
+    <w:p>
+      <w:r>
+        <w:t xml:space="preserve">Uzağa değil. Onu korkunç değil de komik kılan, sokaktaki insanlara kapılarını kilitletecekmiş gibi değil de güldürecek kılan şey de buydu zaten. Otuz santim, belki altmış. Meydandaki çocukların o tombul üçlüsü, yola bakan dost canlısı bir sıra halinde duruyorlardı. Gece vakti birbirlerine yanaşmışlar, o kaba saba omuzları birbirine değmişti. Sanki aralarında bir meseleyi konuşmak için kümelenmişlerdi de laflarını yarıda kesmezseniz pek memnun olurlardı. Savaş anıtının yanındaki, neredeyse bir insan boyundaki görkemli kardan adam, yerinden kallavi bir adım uzaklaşmıştı. Kaidesinin üzerinde öne eğilmişti. Biri ateşe doğru eğilir gibi. Kilisenin önündeki ikisi basamaklarından inmişti. Kapıların açılmasını bekleyen cemaat üyeleri gibi sabırlı duruyorlardı.</w:t>
       </w:r>
     </w:p>
     <w:p>
@@ -2398,22 +2398,22 @@
     </w:p>
     <w:p>
       <w:r>
-        <w:t>Böylece caddedeki herkes bu açıklamada karar kıldı. Çocukların ufak bir muzipliği. Erimenin bir oyunu. Hem harika bir şey değil miydi, bu kadar kafayı takmamak en iyisiydi ve acaba hiç kahve getiren olmuş muydu? Kelly getirmişti. Starlight’tan devasa bir kahvedanlığıyla çıkagelmiş, meraklı bir orduya ikmal yapan bir komutan gibi kahve dağıtmıştı. Olayın tamamı küçük bir festival havasına büründü. Komşular soğukta, gece kıyafetlerinin üzerine giydikleri mantolarıyla dışarı çıkmıştı.</w:t>
-      </w:r>
-    </w:p>
-    <w:p>
-      <w:r>
-        <w:t>Düzeltilmesi gereken bir yanlışlık yoktu. Kelly’nin kahvesiyle ellerini ısıtan bir kadına, kasabasının kardan adamlarının gece kalkıp bir şey aramaya çıktığını söyleyemezdiniz. Noel’in sihri sokaklara salınmıştı. Salınmıştı, yapayalnızdı ve henüz nasıl kıpırdamadan duracağını bilemiyordu. Bu yüzden kahvemi içip diğerleriyle birlikte hayret ettim ve her zaman yaptığımı yapıp saymaya başladım.</w:t>
-      </w:r>
-    </w:p>
-    <w:p>
-      <w:r>
-        <w:t>Ve sayarken buldum onları. Hepsi aynı yöne eğilmiyorlardı.</w:t>
-      </w:r>
-    </w:p>
-    <w:p>
-      <w:r>
-        <w:t>Kalabalık bunu fark etmedi. Kalabalık oldukları, neşeli oldukları ve saymakla işleri olmadığı için. Ama bardağımı bitirir bitirmez Pip topuklarımın dibinde, meydanı yavaşça turlayıp sırayla hepsine baktım. Çoğu hemfikirdi. Kâğıdın altına bir mıknatıs tuttuğunuzda bütün demir tozlarının aynı yöne yatması gibi, hepsi aynı yöne eğilmişti. Caddeye, kiliseye ya da birbirlerine doğru değil. Hollyhock Sokağı’na ve kasabanın tarlalara açılan en uç noktasına doğru, Nick’in atölyesini tuttuğu yere doğru. Bütün kömürden kör yüzler o tarafa dönmüş ve eğilmişti. Sabırlı ve umutlu. Hissedebildikleri fakat henüz göremedikleri bir ocağa çekilen yolcular gibi. Kime doğru eğildiklerini biliyordum. Bu beni korkutmadı.</w:t>
+        <w:t>Böylece caddedeki herkes bu açıklamada karar kıldı. Çocukların ufak bir muzipliği. Erimenin bir oyunu. Hem harika bir şey değil miydi, bu kadar kafayı takmamak en iyisiydi ve acaba hiç kahve getiren olmuş muydu? Kelly getirmişti. Starlight’tan devasa bir kahvedanlığıyla çıkagelmiş, meraklı bir orduya ikmal yapan bir komutan gibi kahve dağıtmıştı. Olayın tamamı küçük bir festival havasına büründü. Komşular soğukta, gece kıyafetlerinin üzerine giydikleri paltolarıyla dışarı çıkmıştı.</w:t>
+      </w:r>
+    </w:p>
+    <w:p>
+      <w:r>
+        <w:t>Düzeltilmesi gereken bir yanlışlık yoktu. Kelly’nin kahvesiyle ellerini ısıtan bir kadına, kasabasının kardan adamlarının gece kalkıp bir şey aramaya çıktığını söyleyemezdiniz. Noel’in büyüsü sokaklara salınmıştı. Salınmıştı, yapayalnızdı ve henüz nasıl kıpırdamadan duracağını bilemiyordu. Bu yüzden kahvemi içip diğerleriyle birlikte hayret ettim ve her zaman yaptığımı yapıp saymaya başladım.</w:t>
+      </w:r>
+    </w:p>
+    <w:p>
+      <w:r>
+        <w:t>Ve sayarken buldum: Hepsi aynı yöne eğilmiyordu.</w:t>
+      </w:r>
+    </w:p>
+    <w:p>
+      <w:r>
+        <w:t>Kalabalık bunu fark etmedi. Kalabalık oldukları, neşeli oldukları ve saymakla işleri olmadığı için. Ama bardağımı bitirir bitirmez Pip topuklarımın dibinde, meydanı yavaşça turlayıp sırayla hepsine baktım. Çoğu hemfikirdi. Kâğıdın altına bir mıknatıs tuttuğunuzda bütün demir tozlarının aynı yöne yatması gibi, hepsi aynı yöne eğilmişti. Caddeye, kiliseye ya da birbirlerine doğru değil. Hollyhock Sokağı’na ve kasabanın tarlalara açılan en uç noktasına doğru, Nick’in atölyesini tuttuğu yere doğru. Bütün kömürden kör yüzler o tarafa dönmüş ve eğilmişti. Sabırlı ve umutlu. Hissedebildikleri fakat henüz göremedikleri bir ocağa çekilen yolcular gibi. Bu eğilişin kimin işi olduğunu biliyordum. Bu beni korkutmadı.</w:t>
       </w:r>
     </w:p>
     <w:p>
@@ -2423,7 +2423,7 @@
     </w:p>
     <w:p>
       <w:r>
-        <w:t xml:space="preserve">Eczanenin ilerisinde, kalabalığın tamamen dağıldığı yerde, bir kardan adam tek başına dikiliyordu. Hiç de meydana gitmemişti. Tam tersi yöne, en uçtaki dükkânlara doğru gitmiş, geri kalanların hepsinin eğildiği sokağa sırtını dönmüş, o kaba saba yüzünü arkalarından geçen sokağın ağzına çevirmişti. Diğerlerinin grubundan üç metre kadar uzağa yürümüştü ve altında tek bir ayak izi yoktu. Kömürden gözleri binalar arasındaki karanlık boşluğa dikilmiş halde soğukta yapayalnız duruyordu.</w:t>
+        <w:t xml:space="preserve">Eczanenin ilerisinde, kalabalığın tamamen dağıldığı yerde, bir kardan adam tek başına dikiliyordu. Hiç de meydana gitmemişti. Tam tersi yöne, en uçtaki dükkânlara doğru gitmiş, geri kalanların hepsinin eğildiği sokağa sırtını dönmüş, o kaba saba yüzünü arkalarından geçen ara sokağın ağzına çevirmişti. Diğerlerinin grubundan üç metre kadar uzağa yürümüştü ve altında tek bir ayak izi yoktu. Kömürden gözleri binalar arasındaki karanlık boşluğa dikilmiş halde soğukta yapayalnız duruyordu.</w:t>
       </w:r>
     </w:p>
     <w:p>
@@ -2458,7 +2458,7 @@
     </w:p>
     <w:p>
       <w:r>
-        <w:t xml:space="preserve">Yanında durdum. Yuvarlak tarlataşlarından yapılma büyük şömine, soğuk ve boş ızgaranın üzerine yumuşak altın sarısı bir parıltı yayıyordu ve ızgaranın hemen üzerinde sihir, hatırladığımdan daha aşağıda ve daha yoğun, altın sarısı gevşek iplikler halinde asılı duruyordu. Sıcaktı. Odanın öbür ucunda kısık yanan odun sobasının sıcaklığıyla değil. İçten içe sıcaktı, bütün gün güneşte kalmış bir taş gibi. Sıcaklığı bana doğru uzandı ve beni geçerek kapıya doğru gitti. Pip doğrudan ızgaraya gitti ve gagası yukarı kalkık, altın iplikleri tabağın üzerindeki bir ringa balığını takip eder gibi takip ederek dikildi.</w:t>
+        <w:t xml:space="preserve">Yanında durdum. Yuvarlak tarlataşlarından yapılma büyük şömine, soğuk ve boş ızgaranın üzerine yumuşak altın sarısı bir parıltı yayıyordu ve ızgaranın hemen üzerinde büyü, hatırladığımdan daha aşağıda ve daha yoğun, altın sarısı gevşek iplikler halinde asılı duruyordu. Sıcaktı. Odanın öbür ucunda kısık yanan odun sobasının sıcaklığıyla değil. İçten içe sıcaktı, bütün gün güneşte kalmış bir taş gibi. Sıcaklığı bana doğru uzandı ve beni geçerek kapıya doğru gitti. Pip doğrudan ızgaraya gitti ve gagası yukarı kalkık, altın iplikleri tabağın üzerindeki bir ringa balığını takip eder gibi takip ederek dikildi.</w:t>
       </w:r>
     </w:p>
     <w:p>
@@ -2478,7 +2478,7 @@
     </w:p>
     <w:p>
       <w:r>
-        <w:t xml:space="preserve">— Bu, kardan adamları ödünç almaktan vazgeçmesi için ona inşa ettiğim yuva. — Yorgun, gerçek bir gülümseme. — Henüz hazır değil. Tamamlanmasına yıllar var. Ama bu bir başlangıç ve bitene kadar bir mumun alevini altına boyamaya ve çocukların kardan adamlarını karanlıkta yürütmeye devam edecek, çünkü burada olmak istiyor ve kendi bacakları yok. Bram fena hâlde bozuluyor. Sihrin kasabanın görebileceği şekilde halka açık numaralar yapmasını yakışıksız buluyor. Elinden gelse onu ren geyikleriyle birlikte ağıla kapatırdı, ki onu zapt etmekte de aynı derecede şansı olurdu.</w:t>
+        <w:t xml:space="preserve">— Bu, kardan adamları ödünç almaktan vazgeçmesi için ona inşa ettiğim yuva. — Yorgun, gerçek bir gülümseme. — Henüz hazır değil. Tamamlanmasına yıllar var. Ama bu bir başlangıç ve bitene kadar bir mumun alevini altına boyamaya ve çocukların kardan adamlarını karanlıkta yürütmeye devam edecek, çünkü burada olmak istiyor ve kendi bacakları yok. Bram fena hâlde bozuluyor. Büyünün kasabanın görebileceği şekilde halka açık numaralar yapmasını yakışıksız buluyor. Elinden gelse onu ren geyikleriyle birlikte ağıla kapatırdı, ki onu zapt etmekte de aynı derecede şansı olurdu.</w:t>
       </w:r>
     </w:p>
     <w:p>
@@ -2488,7 +2488,7 @@
     </w:p>
     <w:p>
       <w:r>
-        <w:t>Eczanenin oralarda tek başına duran, diğerlerinin eğildiği yönün tersine bakan o kardan adamı ona anlatacaktım. Sonra sabırlı ve içsel sıcaklığıyla parlayan ocağa baktım, ızgaranın üzerinde asılı duran, yuvaya doğru eğilen bütün o gevşek, kimsesiz sihre baktım ve o tek kardan adamın soğuk ve tuhaf gerçeğini tam ortasına bırakamadım. Kendim daha iyi anlayana dek. Bu yüzden onu henüz anlamlandıramadığım diğer şeylerle birlikte bıraktım ve kocamın ellerimi o tuhaf türdeki ateşinde ısıtmasına izin verdim.</w:t>
+        <w:t>Eczanenin oralarda tek başına duran, diğerlerinin eğildiği yönün tersine bakan o kardan adamı ona anlatacaktım. Sonra sabırlı ve içsel sıcaklığıyla parlayan ocağa baktım, ızgaranın üzerinde asılı duran, yuvaya doğru eğilen bütün o gevşek, kimsesiz büyüye baktım ve o tek kardan adamın soğuk ve tuhaf gerçeğini tam ortasına bırakamadım. Kendim daha iyi anlayana dek. Bu yüzden onu henüz anlamlandıramadığım diğer şeylerle birlikte bıraktım ve kocamın ellerimi o tuhaf türdeki ateşinde ısıtmasına izin verdim.</w:t>
       </w:r>
     </w:p>
     <w:p>
@@ -2503,7 +2503,7 @@
     </w:p>
     <w:p>
       <w:r>
-        <w:t xml:space="preserve">— Bana söyleyecek bir şeyin var, dedim ona alçak sesle, karla konuşan yaşlı bir kadın kadar safça. Ve yine de söyledim, çünkü bu sihrin yanında o kadar uzun süredir yaşıyordum ki onu açıkça dile getirecek zekâsı olmasa bile hiçbir şeyi nedensiz yere yapmadığını biliyordum. — Ötekilerin hepsi o yola doğru hayran hayran bakıyor, sen ise buraya çekilmiş bir ara sokağın ağzına bakıyorsun. Neden?</w:t>
+        <w:t xml:space="preserve">— Bana söyleyecek bir şeyin var, dedim ona alçak sesle, karla konuşan yaşlı bir kadın kadar safça. Ve yine de söyledim, çünkü bu büyünün yanında o kadar uzun süredir yaşıyordum ki onu açıkça dile getirecek zekâsı olmasa bile hiçbir şeyi nedensiz yere yapmadığını biliyordum. — Ötekilerin hepsi o yola doğru hayran hayran bakıyor, sen ise buraya çekilmiş bir ara sokağın ağzına bakıyorsun. Neden?</w:t>
       </w:r>
     </w:p>
     <w:p>
@@ -2518,7 +2518,7 @@
     </w:p>
     <w:p>
       <w:r>
-        <w:t xml:space="preserve">Kapanan karanlıkta eve doğru döndüm, bütün o sıcak kasaba arkamda, ters yöne eğilen soğuk bir kardan adam ve her yanımı saran, kendisinin heceleyemediği ve henüz benim de onun için heceleyemediğim kelimesiz, acil bir şefkatle dolu sihirle birlikte. Bloğun yarısına geldiğimizde Pip durup kardan adama geri baktı, sonra bana yetişmek için aceleyle yürümeye başladı.</w:t>
+        <w:t xml:space="preserve">Kapanan karanlıkta eve doğru döndüm, bütün o sıcak kasaba arkamda, ters yöne eğilen soğuk bir kardan adam ve her yanımı saran, kendisinin heceleyemediği ve henüz benim de onun için heceleyemediğim kelimesiz, acil bir şefkatle dolu büyüyle birlikte. Bloğun yarısına geldiğimizde Pip durup kardan adama geri baktı, sonra bana yetişmek için aceleyle yürümeye başladı.</w:t>
       </w:r>
     </w:p>
     <w:p>
@@ -2535,7 +2535,7 @@
     <w:p/>
     <w:p>
       <w:r>
-        <w:t xml:space="preserve">Kuyrukta sondan üçüncü sırada duruyordum; Pip vitrinin altındaki kırıntıları incelerken zil çaldı ve içeri soğuk havayla birlikte bir adam girdi. Şapkasını çıkarmadan önce bile onun yabancı olduğunu anlamıştım. Bir ilçe memurunun paltosu, koltuğunun altında düz deri bir evrak çantası ve derdi alışveriş yapmak olmayan bir adamın o bakışına sahipti. Kapının hemen eşiğinde durdu ve dükkânın sıcak kuyruğundaki herkesin sırayla susmasına neden olarak etrafındaki sessizliği soludu.</w:t>
+        <w:t xml:space="preserve">Kuyrukta üçüncü sıradaydım; Pip vitrinin altındaki kırıntıları incelerken zil çaldı ve içeri soğuk havayla birlikte bir adam girdi. Şapkasını çıkarmadan önce bile onun yabancı olduğunu anlamıştım. Bir ilçe memurunun paltosu, koltuğunun altında düz deri bir evrak çantası ve derdi alışveriş yapmak olmayan bir adamın o bakışına sahipti. Kapının hemen eşiğinde durdu ve dükkânın sıcak kuyruğundaki herkesin sırayla susmasına neden olarak etrafındaki sessizliği soludu.</w:t>
       </w:r>
     </w:p>
     <w:p/>
@@ -2559,7 +2559,7 @@
     <w:p/>
     <w:p>
       <w:r>
-        <w:t xml:space="preserve">Ben pek çok yüzün pek çok darbe alışına tanık olmuştum ve Greta’nın yüzünün de o darbeyi alışını izledim. Işık bir anda sönmedi. Pencereyi kaplayan kırağı gibi kenarlardan içeriye doğru yayıldı; öyle ki, köşelerinde yaklaşan felaketin izleri çoktan beliren bir yüzün ortasından adama hâlâ yarı yarıya gülümsemeye çalıştığı korkunç bir an yaşandı. Arkamdaki kuyruk tamamen sessizliğe gömülmüştü.</w:t>
+        <w:t xml:space="preserve">Ben pek çok yüzün pek çok darbe alışına tanık olmuştum ve Greta’nın yüzünün de o darbeyi alışını izledim. Işık bir anda sönmedi. Pencereyi kaplayan kırağı gibi kenarlardan içeriye doğru çekildi; öyle ki, köşelerinde yaklaşan felaketin izleri çoktan beliren bir yüzün ortasından adama hâlâ yarı yarıya gülümsemeye çalıştığı korkunç bir an yaşandı. Arkamdaki kuyruk tamamen sessizliğe gömülmüştü.</w:t>
       </w:r>
     </w:p>
     <w:p/>
@@ -2708,7 +2708,7 @@
     </w:p>
     <w:p>
       <w:r>
-        <w:t>Çöreklerin sonuncusunu kutuluyorduk ki zil çaldı. Siyah mantolu, en fazla yirmi yaşında genç bir kadın, her iki eliyle kurdeleye bağlanmış küçük altın rengi bir kutu tutarak paspasın üzerinde duruyordu. Onu daha önce hiç görmemiştim. İçeriye doğru bir adım bile atmadı.</w:t>
+        <w:t>Çöreklerin sonuncusunu kutuluyorduk ki zil çaldı. Siyah mantolu, en fazla yirmi yaşında genç bir kadın, her iki eliyle kurdeleyle bağlanmış küçük altın rengi bir kutu tutarak paspasın üzerinde duruyordu. Onu daha önce hiç görmemiştim. İçeriye doğru bir adım bile atmadı.</w:t>
       </w:r>
     </w:p>
     <w:p>
@@ -2772,7 +2772,7 @@
     </w:p>
     <w:p>
       <w:r>
-        <w:t xml:space="preserve">Onun adını dolambaçlı ve fısıltı hâlinde duydum. Duyulmasını istemeyen, duyulsaydı utancından yerin dibine girecek birinden. Ertesi sabah Frosty's'deydim; Pip teneke kutulardaki sardalyaların önünde sessiz bir yakarışla dikilirken, fırınları sönmüş olanlar için Hal'in ayırdığı unla bir torbayı dolduruyordum. Akşamüstü varil için mutfağımda Greta'nın kurabiyesinden bir kez daha pişirmeyi niyet etmiştim. Konserve reyonunun yakınındaki iki kadın, yakıt fiyatları üzerine baş başa vermişti. Biri, bilmediğim bir isim söyledi. Diğeri "Eh, bu yıl borçları çok birikti, çaresiz insanlar da çaresiz şeyler yapar," dedi. İlki "Ben bir şey demiyorum," diye karşılık verdi. Küçük gaddarlıklarını ortalıkta görünmeyecek şekilde içlerine tıkıştırarak çorba reyonuna doğru uzaklaştılar. Onu düşürdüklerinin farkında değildiler. Benim aldığımın da.</w:t>
+        <w:t xml:space="preserve">Onun adını dolambaçlı ve fısıltı hâlinde duydum. Duyulmasını istemeyen, duyulsaydı utancından yerin dibine girecek birinden. Ertesi sabah Frosty's'deydim; Pip teneke kutulardaki sardalyaların önünde sessiz bir yakarışla dikilirken, fırınları sönmüş olanlar için Hal'in ayırdığı unla bir torbayı dolduruyordum. Akşamüstü varil için mutfağımda Greta'nın kurabiyesinden bir kez daha pişirmeye niyetlenmiştim. Konserve reyonunun yakınındaki iki kadın, yakıt fiyatları üzerine baş başa vermişti. Biri, bilmediğim bir isim söyledi. Diğeri "Eh, bu yıl borçları çok birikti, çaresiz insanlar da çaresiz şeyler yapar," dedi. İlki "Ben bir şey demiyorum," diye karşılık verdi. Küçük gaddarlıklarını ortalıkta görünmeyecek şekilde içlerine tıkıştırarak çorba reyonuna doğru uzaklaştılar. Onu düşürdüklerinin farkında değildiler. Benim aldığımın da.</w:t>
       </w:r>
     </w:p>
     <w:p>
@@ -2936,7 +2936,7 @@
     </w:p>
     <w:p>
       <w:r>
-        <w:t xml:space="preserve">— Tertemiz bir zemin buldum. Ve bana ayıramayacağı çayı ikram eden bir kadın. — Adamla çocuğun dükkândan çıkışını, arkalarında varilin içine bırakılmış çorba konservelerini izledim. — Greta'ya bunu her kim yapıyorsa, üşüdükleri için yapmadı. Dükkânının boş, kendininkilerin ise dolu olmasını istedikleri için yaptılar. Bu aç bir el değil. Açlık kapar geçerdi. Bu el ise hedef alıyor.</w:t>
+        <w:t xml:space="preserve">— Tertemiz bir zemin buldum. Ve bana ayıramayacağı çayı ikram eden bir kadın. — Adamla çocuğun dükkândan çıkışını, arkalarında varilin içine bırakılmış çorba konservelerini izledim. — Greta'ya bunu her kim yapıyorsa, üşüdükleri için yapmadı. Onun dükkânının boşalmasını, kendi dükkânlarının dolmasını istedikleri için yaptılar. Bu aç bir el değil. Açlık kapar geçerdi. Bu el ise hedef alıyor.</w:t>
       </w:r>
     </w:p>
     <w:p>
@@ -3072,7 +3072,7 @@
     </w:p>
     <w:p>
       <w:r>
-        <w:t xml:space="preserve">Çünkü taşlar yerine oturuyordu. Nemli bir depo değil. Kötü şans değil. Ticari adı olan, çuvalın içine dozu saç teli kadar kesin bilen bir el tarafından karıştırılmış, çuvalda gizlenip kendini ancak fırından çıktıktan sonra, damakta gösteren satın alınmış bir toz. Doktor'un merdiveninde durup Frosty'nin orada yaptığım gibi eski gerçekleri arka arkaya dizdim, sadece şimdi daha yakın ve daha sert.</w:t>
+        <w:t xml:space="preserve">Çünkü taşlar yerine oturuyordu. Nemli bir depo değil. Kötü şans değil. Ticari adı olan, çuvalın içine dozu saç teli kadar kesin bilen bir el tarafından karıştırılmış, çuvalda gizlenip kendini ancak fırından çıktıktan sonra, damakta gösteren satın alınmış bir toz. Doktor'un merdiveninde durup Frosty's'te yaptığım gibi eski gerçekleri arka arkaya dizdim, sadece şimdi daha yakın ve daha sert.</w:t>
       </w:r>
     </w:p>
     <w:p>
@@ -3097,7 +3097,7 @@
     </w:p>
     <w:p>
       <w:r>
-        <w:t>Solan mavi ışıkta meydana doğru yürüyor, doğrudan eve gitmek istiyordum ki eczanenin önündeki kardan adam yine yer değiştirmişti. Meydandaki o büyük kalabalık, her zamanki gibi sabırlı bir şekilde sıcak ve görünmez ateşlerine doğru eğilmeye devam ediyordu. Fakat iki gündür sokağın ağzında yalnız başına duran o kardan adam, son günün karanlığında yerinden kaymış; diğerleriyle birlikte meydana doğru eğilmek yerine, bütün heybetli ve hantal ağırlığıyla Evergreen dükkânlarının arkasına doğru keskin bir şekilde öne eğilmişti.</w:t>
+        <w:t>Solan mavi ışıkta meydana doğru yürüyor, doğrudan eve gitmek istiyordum ki eczanenin önündeki kardan adam yine yer değiştirmişti. Meydandaki o büyük kalabalık, her zamanki gibi sabırlı bir şekilde sıcak ve görünmez ateşlerine doğru eğilmeye devam ediyordu. Fakat iki gündür ara sokağın ağzında yalnız başına duran o kardan adam, son günün karanlığında yerinden kaymış; diğerleriyle birlikte meydana doğru eğilmek yerine, bütün heybetli ve hantal ağırlığıyla Evergreen dükkânlarının arkasına doğru keskin bir şekilde öne eğilmişti.</w:t>
       </w:r>
     </w:p>
     <w:p>
@@ -3107,7 +3107,7 @@
     </w:p>
     <w:p>
       <w:r>
-        <w:t xml:space="preserve">Duruverdim ve onun baktığı yere, dükkânların karanlık arka cephelerine, kardan kapanmış merdivenlere ve kapalı kapılara baktım. Büyü bana bir isim veremezdi. Asla veremezdi. Akıldan çok kalbi vardı, Nick'im öyle derdi ve heceleyemezdi. İki gündür o sokağa bakarak durmuştu, şimdi de dükkânların arkasına doğru eğiliyordu ve bunun nedenini bir türlü düşünemiyordum.</w:t>
+        <w:t xml:space="preserve">Duruverdim ve onun baktığı yere, dükkânların karanlık arka cephelerine, kardan kapanmış merdivenlere ve kapalı kapılara baktım. Büyü bana bir isim veremezdi. Asla veremezdi. Akıldan çok kalbi vardı, Nick'im öyle derdi ve heceleyemezdi. İki gündür o ara sokağa bakarak durmuştu, şimdi de dükkânların arkasına doğru eğiliyordu ve bunun nedenini bir türlü düşünemiyordum.</w:t>
       </w:r>
     </w:p>
     <w:p>
@@ -3127,7 +3127,7 @@
     </w:p>
     <w:p>
       <w:r>
-        <w:t>Kardan adamı sokağın üzerindeki uzun ve sabırlı nöbetiyle baş başa bıraktım ve herhangi bir yeri işaret eden elimdeki tek sert nesneyle, kavanoz kabanımda ağır ağır eve yürüdüm.</w:t>
+        <w:t>Kardan adamı ara sokağın üzerindeki uzun ve sabırlı nöbetiyle baş başa bıraktım ve herhangi bir yeri işaret eden elimdeki tek sert nesneyle, kavanoz kabanımda ağır ağır eve yürüdüm.</w:t>
       </w:r>
     </w:p>
     <w:p>
@@ -3150,19 +3150,19 @@
     <w:p/>
     <w:p>
       <w:r>
-        <w:t xml:space="preserve">Greta’nın unu, müşterilerle birlikte ön kapıdan girmezdi. Hiçbir fırınınki girmezdi. Çuvallarla, bir arabadan indirilir, Evergreen dükkânlarının arkasındaki ortak ara sokağa bırakılırdı. Pete’in rostomu bağlarken söylenip durduğu, bir kamyonete yetecek kadar geniş, iki kişiye yetecekten fazla da husumet barındıran yükleme alanı. Dağıtım şoförü, şafak sökmeden önceki karanlık saatlerde minibüsünü rampaya yanaştırır, çuvalları ışığın zayıf ve soğuğun onları taze tuttuğu arka kapıdan içeri bırakırdı. Greta da sabah boyunca ihtiyacı oldukça bunları arka duvarındaki bidonlara taşırdı. Un, arabayla bidon arasında, Holly Jolly’nin hiçbir müşterinin görmediği, hiçbir sokak lambasının erişmediği o tek odasında, Greta onu kaldırana kadar öylece dururdu.</w:t>
-      </w:r>
-    </w:p>
-    <w:p/>
-    <w:p>
-      <w:r>
-        <w:t xml:space="preserve">Ve tuğla olayına kadar, arka kapısı o fırınlarken hep açık dururdu.</w:t>
-      </w:r>
-    </w:p>
-    <w:p/>
-    <w:p>
-      <w:r>
-        <w:t xml:space="preserve">Tek gereken buydu. Fincanımı çevirdim ve bunun bu kadar basit olmasını sevmedim. Greta saat dörtte uyanmış ve elleri unlanmış olurdu; elleri ya kabaran bir hamurda ya da sıcak bir tepsideydi, fırın gürler ve arka oda sıcaktan bunaltıcı olurdu. Geceden beri fırınların başındaki bir fırıncıya serin bir esintinin lütfu ve biraz hava olsun diye o kapıyı ara sokağa ardına kadar açardı. Bu, çalışan bir dükkânın sıradan işleyişinden ibaretti. Ne var ki tuğla olayına kadar bu, her karanlık sabahın iki saati boyunca o sokakta bir kapının açık durduğu anlamına geliyordu. Kapının diğer tarafında elleri hamur dolu, sırtını soğuğa vermiş bir kadın. Ve aralarında, hiç kimsenin gözünü dikip izlemediği bir un bidonu.</w:t>
+        <w:t xml:space="preserve">Greta’nın unu, müşterilerle birlikte ön kapıdan girmezdi. Hiçbir fırınınki girmezdi. Çuvallarla, bir arabadan indirilip Evergreen dükkânlarının arkasındaki ortak ara sokaktan gelirdi. Pete’in rostomu bağlarken söylenip durduğu, bir kamyonete yetecek kadar geniş, iki kişiye yetecekten fazla da husumet barındıran yükleme alanı. Dağıtım şoförü, şafak sökmeden önceki karanlık saatlerde minibüsünü rampaya yanaştırır, çuvalları ışığın zayıf ve soğuğun onları taze tuttuğu arka kapıdan içeri bırakırdı. Greta da sabah boyunca ihtiyacı oldukça bunları arka duvarındaki bidonlara taşırdı. Un, arabayla bidon arasında, Holly Jolly’nin hiçbir müşterinin görmediği, hiçbir sokak lambasının erişmediği o tek odasında, Greta onu kaldırana kadar öylece dururdu.</w:t>
+      </w:r>
+    </w:p>
+    <w:p/>
+    <w:p>
+      <w:r>
+        <w:t xml:space="preserve">Ve tuğla olayına kadar, Greta ekmek pişirirken arka kapısı hep açık dururdu.</w:t>
+      </w:r>
+    </w:p>
+    <w:p/>
+    <w:p>
+      <w:r>
+        <w:t xml:space="preserve">Tek gereken buydu. Fincanımı çevirdim ve bunun bu kadar basit olmasını sevmedim. Greta saat dörtte uyanmış ve elleri unlanmış olurdu; elleri ya kabaran bir hamurda ya da sıcak bir tepsideydi, fırın gürler ve arka oda sıcaktan bunaltıcı olurdu. Geceden beri fırınların başındaki bir fırıncıya serin bir esintinin lütfu ve biraz hava olsun diye o kapıyı ara sokağa ardına kadar açardı. Bu, çalışan bir dükkânın sıradan işleyişinden ibaretti. Ne var ki tuğla olayına kadar bu, her karanlık sabahın iki saati boyunca o ara sokakta bir kapının açık durduğu anlamına geliyordu. Kapının diğer tarafında elleri hamur dolu, sırtını soğuğa vermiş bir kadın. Ve aralarında, hiç kimsenin gözünü dikip izlemediği bir un bidonu.</w:t>
       </w:r>
     </w:p>
     <w:p/>
@@ -3210,13 +3210,13 @@
     <w:p/>
     <w:p>
       <w:r>
-        <w:t xml:space="preserve">— Demek öyle, dedim alçak sesle Pip’e. — Kilitli değil. Gözetlenmiyor. Tuğla olayına kadar her karanlık sabah sırtı dönük, havaya açık durmuş. Şafaktan önce bu sokakta işi olan herkes tam burada durabilirdi.</w:t>
-      </w:r>
-    </w:p>
-    <w:p/>
-    <w:p>
-      <w:r>
-        <w:t>Pip yanıt vermedi. Bileğimin dibinde kıpırtısız kesilmişti. Kendime itiraf edemeyeceğim kadar yakın bir bela olduğunda hep böyle yapardı. Arkama, üç kapı öteye, kasap kapısındaki parlak yeni asma kilide bakıyordu.</w:t>
+        <w:t xml:space="preserve">— Demek öyle, dedim alçak sesle Pip’e. — Kilitli değil. Gözetlenmiyor. Tuğla olayına kadar her karanlık sabah ardına kadar açık, Greta da ona sırtını dönmüş. Şafaktan önce bu ara sokakta işi olan herkes tam burada durabilirdi.</w:t>
+      </w:r>
+    </w:p>
+    <w:p/>
+    <w:p>
+      <w:r>
+        <w:t>Pip yanıt vermedi. Ayak bileğimin dibinde kıpırtısız kesilmişti. Kendime itiraf edemeyeceğim kadar yakın bir bela olduğunda hep böyle yapardı. Arkama, üç kapı öteye, kasap kapısındaki parlak yeni asma kilide bakıyordu.</w:t>
       </w:r>
     </w:p>
     <w:p/>
@@ -3389,7 +3389,7 @@
     <w:p/>
     <w:p>
       <w:r>
-        <w:t xml:space="preserve">Çaydanlığı ocaktan aldım. Kapısına kadar uzanan o soğuk çizgiyi sadece erişim mesafesine bakarak çizmiştim; sokakta kendi kendime söylediğim gibi, erişim dediğin şey bir hüküm değil, sadece bir kapı eşiğiydi. Evet, tam da eşikte duruyordu. Ama kapının ardındaki oda, onda bulunmayan bir mizaca ve bilmediği bir zanaata ev sahipliği yapıyordu.</w:t>
+        <w:t xml:space="preserve">Çaydanlığı ocaktan aldım. Kapısına kadar uzanan o soğuk çizgiyi sadece erişim mesafesine bakarak çizmiştim; ara sokakta kendi kendime söylediğim gibi, erişim dediğin şey bir hüküm değil, sadece bir kapı eşiğiydi. Evet, tam da eşikte duruyordu. Ama kapının ardındaki oda, onda bulunmayan bir mizaca ve bilmediği bir zanaata ev sahipliği yapıyordu.</w:t>
       </w:r>
     </w:p>
     <w:p/>
@@ -3413,7 +3413,7 @@
     <w:p/>
     <w:p>
       <w:r>
-        <w:t>Dükkân henüz açılmamışken onu kütüğünün başında sabahın karkasını parçalarken buldum; zil çaldığında doğruldu, bıçağını düzgünce ve destek alarak bıraktı —kapısından içeri girecek tek bir şeyi beklemeye alışmış bir adam gibi yine ilk seferindeki gibi kasılmıştı.</w:t>
+        <w:t>Dükkân henüz açılmamışken onu kütüğünün başında sabahın karkasını parçalarken buldum; zil çaldığında doğruldu, bıçağını düz bir şekilde bırakıp ilk seferindeki gibi kasıldı; kapısından içeri hep aynı tek şeyin gireceğini beklemeye alışmış bir adamdı.</w:t>
       </w:r>
     </w:p>
     <w:p/>
@@ -3467,13 +3467,13 @@
     <w:p/>
     <w:p>
       <w:r>
-        <w:t xml:space="preserve">— İki kez kovdum, evet, kıyısında köşesinde yakaladığımda. — Bunu homurdanarak, iyilik yaparken yakalanmış yarı utangaç bir adam tavrıyla söyledi. — Onu sevdiğimden değil, yanlış anlamayın. Konuşmuyoruz ve hâlâ sinirimin geçmediği o şeyi içime sindirene kadar da konuşmayacağız. Ama karanlıkta kapısının etrafında dolanan biri, kavga gürültü olsun ya da olmasın iyi niyetli olamaz; ben de bir avluda dikilip bunu izleyecek ve hiçbir şey yapmayacak değilim. — Paketlenmiş pirzolayı, aslında düzeltmeye gerek olmayan kenara doğru itti. — Bunu ona da hiç söylemedim. Benden geleceğine inanmazdı.</w:t>
-      </w:r>
-    </w:p>
-    <w:p/>
-    <w:p>
-      <w:r>
-        <w:t>Bir iyilik olduğunu söylemektense ölmeyi yeğleyeceği bir cümlede, adamın ta kendisi yatıyordu. Öğle vakti yüksek sesle dile getirilen husumet, ve onun altında, konuşmayacağı bir kadının kapısından bir silueti uzaklaştıran sert bir el; kimseye söylemeden, çünkü karanlıkta yaptığı iyiliğin bulutlar altında hiçbir karşılığı olmayacağını bilerek.</w:t>
+        <w:t xml:space="preserve">— İki kez kovdum, evet, kapıya yakınken yakaladığımda. — Bunu homurdanarak, iyilik yaparken yakalanmış yarı utangaç bir adam tavrıyla söyledi. — Onu sevdiğimden değil, yanlış anlamayın. Konuşmuyoruz ve hâlâ sinirimin geçmediği o şeyi içime sindirene kadar da konuşmayacağız. Ama karanlıkta kapısının etrafında dolanan biri, kavga gürültü olsun ya da olmasın iyi niyetli olamaz; ben de bir avluda dikilip bunu izleyecek ve hiçbir şey yapmayacak değilim. — Paketlenmiş pirzolayı, aslında düzeltmeye gerek olmayan kenara doğru itti. — Bunu ona da hiç söylemedim. Benden geleceğine inanmazdı.</w:t>
+      </w:r>
+    </w:p>
+    <w:p/>
+    <w:p>
+      <w:r>
+        <w:t>Bir iyilik olduğunu söylemektense ölmeyi yeğleyeceği bir cümlede, adamın ta kendisi yatıyordu. Öğle vakti yüksek sesle dile getirilen husumet, ve onun altında, konuşmayacağı bir kadının kapısından bir silueti uzaklaştıran sert bir el; kimseye söylemeden, çünkü zan altındayken karanlıkta yaptığı iyiliğin hiçbir karşılığı olmayacağını bilerek.</w:t>
       </w:r>
     </w:p>
     <w:p/>
@@ -3772,7 +3772,7 @@
     <w:p/>
     <w:p>
       <w:r>
-        <w:t>Ellie derin bir nefes alıp şapkasını örmeye geri döndü.</w:t>
+        <w:t>Ellie derin bir nefes verip şapkasını örmeye geri döndü.</w:t>
       </w:r>
     </w:p>
     <w:p/>
@@ -3820,7 +3820,7 @@
     <w:p/>
     <w:p>
       <w:r>
-        <w:t xml:space="preserve">Dot lastik örgü örerken başını kaldırmadı. — O altın dükkânında güzel olması beklenir zaten. Pencerelerdeki bütün o altınların parasını biri ödemeli.</w:t>
+        <w:t xml:space="preserve">Dot lastik örgü örerken başını kaldırmadı. — O altın dükkânında güzel olması beklenir zaten. Pencerelerdeki bütün o altınların parasını biri ödüyor ya.</w:t>
       </w:r>
     </w:p>
     <w:p/>
@@ -3921,7 +3921,7 @@
     <w:p/>
     <w:p>
       <w:r>
-        <w:t xml:space="preserve">İşi bittiğinde varillerin yanında altı kasa yığılı duruyordu. Kâğıtlarında hâlâ tazeliğini koruyan dünkü ekmekler, çavdarlılar ve çekirdekli yuvarlak ekmekler. Ivy alkışlamaya başladı; salonun o kısmı da hemen ona katıldı. Joyce ellerini parkasının ceplerine sokup gözlerini yere dikerek kalabalığın durulmasını bekledi.</w:t>
+        <w:t xml:space="preserve">İşi bittiğinde varillerin yanında altı kasa yığılı duruyordu. Hâlâ kâğıtlarının içinde duran dünkü ekmekler, çavdarlılar ve çekirdekli yuvarlak ekmekler. Ivy alkışlamaya başladı; salonun o kısmı da hemen ona katıldı. Joyce ellerini parkasının ceplerine sokup gözlerini yere dikerek kalabalığın durulmasını bekledi.</w:t>
       </w:r>
     </w:p>
     <w:p/>
@@ -4062,7 +4062,7 @@
     <w:p/>
     <w:p>
       <w:r>
-        <w:t xml:space="preserve">Çünkü o haftayı diğer tarafından da biliyordum. Greta'nın dükkânının mühürlendiğini, kakaolu çöreklerin arasına konulmuş sarı renkli ilçe evrakı üzerinde Varney'nin yorgun el yazısıyla okumuş ve onun ağzından dinlemiştim. </w:t>
+        <w:t xml:space="preserve">Çünkü o haftayı diğer tarafından da biliyordum. Greta'nın dükkânının kapatıldığını, kakaolu çöreklerin arasına konulmuş sarı renkli ilçe evrakı üzerinde Varney'nin yorgun el yazısıyla okumuş ve onun ağzından dinlemiştim. </w:t>
       </w:r>
       <w:r>
         <w:rPr>
@@ -4107,7 +4107,7 @@
     <w:p/>
     <w:p>
       <w:r>
-        <w:t xml:space="preserve">Herkes gibi o da bağış etkinliklerine gelmiş ve herkesi büyülemişti. Menü kartlarından birini altın yaldızlı yazılarıyla birlikte sedir kutuya bırakmıştı. — İnsan, demişti, yüz yıl sonra bile burada birinin financier’nin ne olduğunu bileceğini düşünüyor.</w:t>
+        <w:t xml:space="preserve">Herkes gibi o da bağış etkinliklerine gelmiş ve herkesi büyülemişti. Menü kartlarından birini altın yaldızlı yazılarıyla birlikte sedir kutuya bırakmıştı. — İnsan, demişti, yüz yıl sonra bile burada birinin financier’nin ne olduğunu bileceğini düşünmek istiyor.</w:t>
       </w:r>
     </w:p>
     <w:p/>
@@ -4155,7 +4155,7 @@
     <w:p/>
     <w:p>
       <w:r>
-        <w:t xml:space="preserve">Ben duydum. Elimin arasındaki broşür avucumda buruşurken onların kıyısında duruyordum ve kahverengi şişelerin arasındaki tezgâhından Doktor Mitchell'ın sesi onun sesinin üzerine çıktı. </w:t>
+        <w:t xml:space="preserve">Ben duydum. Elimdeki broşür avucumda buruşurken onların kıyısında duruyordum ve kahverengi şişelerin arasındaki tezgâhından Doktor Mitchell'ın sesi onun sesinin üzerine çıktı. </w:t>
       </w:r>
       <w:r>
         <w:rPr>
@@ -4239,7 +4239,7 @@
     <w:p/>
     <w:p>
       <w:r>
-        <w:t>Benden önce sıcak ortama daldı ve doğruca sıranın sonundaki ikinci varile yönelip sardalyaların üzerinde nöbet tuttu. Kapıda biri elime bir çuval patates tutuşturuverdi. Sedir kutunun ve kadınların arasında gülüşen Renée'nin yanından geçerek salonu boydan boya aştım ve Hal'in varillerine bıraktım, ona bakmadım bile.</w:t>
+        <w:t>Benden önce sıcak ortama daldı ve doğruca sıra boyunca ikinci varile yönelip sardalyaların üzerinde nöbet tuttu. Kapıda biri elime bir çuval patates tutuşturuverdi. Sedir kutunun ve kadınların arasında gülüşen Renée'nin yanından geçerek salonu boydan boya aştım ve Hal'in varillerine bıraktım, ona bakmadım bile.</w:t>
       </w:r>
     </w:p>
     <w:p>
@@ -4280,7 +4280,7 @@
     <w:p/>
     <w:p>
       <w:r>
-        <w:t xml:space="preserve">— Oldukça iyi, dedim, ve gerçekten de öyleydi. — Aslında bir teklifle geldim. Çember, cadde boyunca kapılara, isteyen her dükkâna çelenk yapar. Acaba Sugarplum'ınkini de ben yapabilir miyim diye merak etmiştim. Bloğa hoş geldin hediyesi.</w:t>
+        <w:t xml:space="preserve">— Çok güzel olmuş, dedim, ve gerçekten de öyleydi. — Aslında bir teklifle geldim. Çember, cadde boyunca kapılara, isteyen her dükkâna çelenk yapar. Acaba Sugarplum'ınkini de ben yapabilir miyim diye merak etmiştim. Bloğa hoş geldin hediyesi.</w:t>
       </w:r>
     </w:p>
     <w:p/>
@@ -4292,7 +4292,7 @@
     <w:p/>
     <w:p>
       <w:r>
-        <w:t xml:space="preserve">— Ne kadar kibar. — Koluma dokundu, o hafif, serin dokunuşuyla. — Köknar galiba, kır yeşili. Ön cepheyi ortaya çıkaracaktır. Eski dükkânların hepsinin kendi el yapımı küçük çelenkleri var. Büyüleyici. Ve ben de benimkilerin arasında, sanki hep buradaymışım gibi durmasını istiyorum. — "Hep buradaymışım" lafını düz ve kesin bir şekilde söyledi; kararlaştırılmış ve şüphe edilmeyecek bir şey gibi. — O halde kapıyı ölçün ve bir kahve için. Alışveriş yapmayan biriyle o kadar nadiren konuşabiliyorum ki.</w:t>
+        <w:t xml:space="preserve">— Ne kadar kibar. — Koluma dokundu, o hafif, serin dokunuşuyla. — Köknar galiba, kır yeşili. Ön cepheyi ortaya çıkaracaktır. Eski dükkânların hepsinin kendi el yapımı küçük çelenkleri var. Büyüleyici. Ben de benimkinin onların arasında, sanki hep buradaymışım gibi durmasını istiyorum. — "Hep buradaymışım" lafını düz ve kesin bir şekilde söyledi; kararlaştırılmış ve şüphe edilmeyecek bir şey gibi. — O halde kapıyı ölçün ve bir kahve için. Alışveriş yapmayan biriyle o kadar nadiren konuşabiliyorum ki.</w:t>
       </w:r>
     </w:p>
     <w:p/>
@@ -4376,7 +4376,7 @@
     <w:p/>
     <w:p>
       <w:r>
-        <w:t>Ve asıl sorun da buydu; bir yıldır tadına baktığım en iyi kahvenin önümde soğuduğu o sıcak ortamda otururken oradaydı. Yetkinlikten başka bir şey itiraf etmiyordu. Bir rakibin tökezlemesine sevinmiş ve gereken her yerde üzülmüş sert bir iş kadını. Bütün caddenin jürisi buna sert bir kadının dürüstlüğünden başka bir şey demezdi ve yarısı da bu yüzden onu daha çok severdi.</w:t>
+        <w:t>Ve asıl sorun da buydu; bir yıldır tadına baktığım en iyi kahvenin önümde soğuduğu o sıcak ortamda otururken oradaydı. Yetkinlikten başka bir şey itiraf etmiyordu. Bir rakibin tökezlemesine sevinmiş ve gereken her yerde üzülmüş sert bir iş kadını. Bütün caddeden oluşan bir jüri buna sert bir kadının dürüstlüğünden başka bir şey demezdi ve yarısı da bu yüzden onu daha çok severdi.</w:t>
       </w:r>
     </w:p>
     <w:p/>
@@ -4434,7 +4434,7 @@
     </w:p>
     <w:p>
       <w:r>
-        <w:t xml:space="preserve">Sugarplum için hazırladığım çelenk mutfak masamda yarı sarılmış hâlde duruyordu; köknar dalları kasnağın üçte birine sarılmış, tel iskeletten sarkıyordu; fiyonk için kestiğim altın rengi kurdele de hemen yanında bekliyordu. Dükkânından eve döndüğümden beri bir saattir bununla uğraşıyordum ve elime aldığım her dalda derz meselesini düşünmüştüm. Sonra paltomu yeniden giydim. İki gün önce, meydana bakan bankta Danny Ott tam olarak hatırlayamadığı bir anıyı zihninde yakalamaya çalışmıştı; ben de ona, zihni berraklaştığında bunu bana getirmesini söylemiştim. Artık onu daha fazla beklemek niyetinde değildim.</w:t>
+        <w:t xml:space="preserve">Sugarplum için hazırladığım çelenk mutfak masamda yarı sarılmış hâlde duruyordu; köknar dalları kasnağın üçte birine sarılmış, tel iskeletten sarkıyordu; fiyonk için kestiğim altın rengi kurdele de hemen yanında bekliyordu. Dükkânından eve döndüğümden beri bir saattir bununla uğraşıyordum ve elime aldığım her dalda derz meselesini düşünmüştüm. Sonra paltomu yeniden giydim. İki gün önce, meydandaki bir bankta Danny Ott tam olarak hatırlayamadığı bir anıyı zihninde yakalamaya çalışmıştı; ben de ona, zihni berraklaştığında bunu bana getirmesini söylemiştim. Artık onu daha fazla beklemek niyetinde değildim.</w:t>
       </w:r>
     </w:p>
     <w:p/>
@@ -4458,7 +4458,7 @@
     <w:p/>
     <w:p>
       <w:r>
-        <w:t>Yarım saati vardı. Babası evdeydi ve kızlarla birlikte oturuyordu. Onu Starlight’a götürdüm; Kelly sıcak çikolataları pencere kenarındaki masaya getirdi ve hiçbir şey sormadan tezgahına geri döndü. Pip masanın altında bileğine yaslanarak uzandı ve bal damlalarının kağıt torbası her hışırdadığında kafasını sesin geldiği yöne çevirdi.</w:t>
+        <w:t>Yarım saati vardı. Babası evdeydi ve kızlarla birlikte oturuyordu. Onu Starlight’a götürdüm; Kelly sıcak çikolataları pencere kenarındaki masaya getirdi ve hiçbir şey sormadan tezgahına geri döndü. Pip masanın altında ayak bileğine yaslanarak uzandı ve bal damlalarının kağıt torbası her hışırdadığında kafasını sesin geldiği yöne çevirdi.</w:t>
       </w:r>
     </w:p>
     <w:p/>
@@ -4518,7 +4518,7 @@
     <w:p/>
     <w:p>
       <w:r>
-        <w:t xml:space="preserve">Evergreen Caddesi’nde mallarını altın rengiyle paketleyen tek bir dükkân vardı. Kutularının üzerinde altın rengi el yazıları, financier keklerinde altın rengi kurdeleler olurdu. Ve o dükkân, karanlıkta soluk önlüklü zayıf ve çevik bir suretin ara sokaktan yukarı yürüdüğü yer olan eczaneyi geçince, caddenin en uzak ucunda yer alıyordu. Pete o sureti kamyonundan görmüş, Danny de mutfağından fark etmişti ve ikisi de birbirinin anlattığını duymamıştı bile.</w:t>
+        <w:t xml:space="preserve">Evergreen Caddesi’nde mallarını altın rengiyle paketleyen tek bir dükkân vardı. Kutularının üzerinde altın rengi el yazıları, financier keklerinde altın rengi kurdeleler olurdu. Ve o dükkân, karanlıkta soluk önlüklü zayıf ve çevik bir siluetin ara sokaktan yukarı yürüdüğü yer olan eczaneyi geçince, caddenin en uzak ucunda yer alıyordu. Pete o silueti kamyonundan görmüş, Danny de mutfağından fark etmişti ve ikisi de birbirinin anlattığını duymamıştı bile.</w:t>
       </w:r>
     </w:p>
     <w:p/>
@@ -4854,7 +4854,7 @@
     <w:p/>
     <w:p>
       <w:r>
-        <w:t>Greta’nın kapısında üzerinde altın rengi yazılar olan bir kutu ve karanlıkta ara sokaktan yukarı yürüyen zayıf bir suret hâlâ duruyordu. Öğle vakti her ikisinin de ne anlama geldiğini biliyordum. Artık bilmiyordum.</w:t>
+        <w:t>Greta’nın kapısında üzerinde altın rengi yazılar olan bir kutu ve karanlıkta ara sokaktan yukarı yürüyen zayıf bir siluet hâlâ duruyordu. Öğle vakti her ikisinin de ne anlama geldiğini biliyordum. Artık bilmiyordum.</w:t>
       </w:r>
     </w:p>
     <w:p/>
@@ -4866,7 +4866,7 @@
     <w:p/>
     <w:p>
       <w:r>
-        <w:t xml:space="preserve">Evde çelenk bıraktığım masanın üzerinde duruyordu. Paltom sırtımdayken masaya oturdum, teli çözdüm ve köknar dallarını kasnaktan birer birer, önümde çıplak çelik iskeletten başka bir şey kalmayana kadar söktüm. Pip altın rengi kurdelenin boştaki ucunu gagasından kaptığı gibi masanın altına doğru geri çekildi, ben de kurdeleyi ona bıraktım. Sonra yığındaki ilk dalı alıp kasnağın üzerine yerleştirdim.</w:t>
+        <w:t xml:space="preserve">Evde çelenk bıraktığım masanın üzerinde duruyordu. Paltom sırtımdayken masaya oturdum, teli çözdüm ve köknar dallarını kasnaktan birer birer, önümde çıplak çelik iskeletten başka bir şey kalmayana kadar söktüm. Pip altın rengi kurdelenin boştaki ucunu gagasıyla kaptığı gibi masanın altına doğru geri çekildi, ben de kurdeleyi ona bıraktım. Sonra yığındaki ilk dalı alıp kasnağın üzerine yerleştirdim.</w:t>
       </w:r>
     </w:p>
     <w:p>
@@ -5068,7 +5068,7 @@
     </w:p>
     <w:p>
       <w:r>
-        <w:t xml:space="preserve">— Tuğla, dedim. Bir yüzünde eski, gri harç vardı; yani bir duvardan sökülmüştü. Cadılar Bayramı’ndan beri Evergreen’de kar var. Hiç kimse o caddeden yerden gevşek bir tuğla almaz. Bütün blokta eski tuğlalardan oluşan tek bir yığın var. — Şekerliğin kapağını biberliğin arkasına koydum. — Fenwick’in yerinin arkasındaki çöp konteynerinde, fırınları yerleştirmek için kadının binanın içini söktüğü yerde.</w:t>
+        <w:t xml:space="preserve">— Tuğla, dedim. Bir yüzünde eski, gri harç vardı; yani bir duvardan sökülmüştü. Cadılar Bayramı’ndan beri Evergreen’de kar var. Hiç kimse o caddeden yerden gevşek bir tuğla almadı. Bütün blokta eski tuğlalardan oluşan tek bir yığın var. — Şekerliğin kapağını biberliğin arkasına koydum. — Fenwick’in yerinin arkasındaki çöp konteynerinde, fırınları yerleştirmek için kadının binanın içini söktüğü yerde.</w:t>
       </w:r>
     </w:p>
     <w:p>
@@ -5078,7 +5078,7 @@
     </w:p>
     <w:p>
       <w:r>
-        <w:t xml:space="preserve">— Kadının duvarından çıkmıştı. Yemin edebileceğim tek şey bu. — Parmağımı, aradan geçen sokağın üzerindeki kaşığın üzerine koydum. — O konteyner halka açık bir sokakta açık duruyor. Kapağı yok, kilidi yok. Pete oradan geçip gidiyor. Nakliyeciler arabayı oraya yanaştırıyor. Bir çocuk bile oradan bir tuğla alıp kaldırabilir. O tuğlanın üzerinde onun molozunu gördüm ve onun adını okudum. Tersinden düşün. Eğer kasabanın Sugarplum’a bakmasını isteseydin, tuğlayı nereden alırdın?</w:t>
+        <w:t xml:space="preserve">— Kadının duvarından çıkmıştı. Yemin edebileceğim tek şey bu. — Parmağımı, dükkânların arkasından geçen ara sokak yerindeki kaşığın üzerine koydum. — O konteyner halka açık bir ara sokakta açık duruyor. Kapağı yok, kilidi yok. Pete oradan geçip gidiyor. Nakliyeciler arabayı oraya yanaştırıyor. Bir çocuk bile oradan bir tuğla alıp kaldırabilir. O tuğlanın üzerinde onun molozunu gördüm ve onun adını okudum. Tersinden düşün. Eğer kasabanın Sugarplum’a bakmasını isteseydin, tuğlayı nereden alırdın?</w:t>
       </w:r>
     </w:p>
     <w:p>
@@ -5163,7 +5163,7 @@
     </w:p>
     <w:p>
       <w:r>
-        <w:t xml:space="preserve">— Olabilir. Ama bir minibüsü ne yapsın ki o? Arka basamağı o sokağa açılıyor. Kapısından çıkıp Greta’nın eşiğine yürüyebilir, oradan da evine dönebilir ve caddede kendini asla göstermezdi. — Parmağımı biberliğin üzerinde tuttum. — Farları sönük bir minibüs, bir yerden gelip gün ağarmadan oraya geri dönmesi gereken birine aittir.</w:t>
+        <w:t xml:space="preserve">— Olabilir. Ama bir minibüsü ne yapsın ki o? Arka basamağı o ara sokağa açılıyor. Kapısından çıkıp Greta’nın eşiğine yürüyebilir, oradan da evine dönebilir ve caddede kendini asla göstermezdi. — Parmağımı biberliğin üzerinde tuttum. — Farları sönük bir minibüs, bir yerden gelip gün ağarmadan oraya geri dönmesi gereken birine aittir.</w:t>
       </w:r>
     </w:p>
     <w:p>
@@ -5178,12 +5178,12 @@
     </w:p>
     <w:p>
       <w:r>
-        <w:t>Ekmek tahtasından bir parça kabuk koparıp biberliğin hemen ötesine, sokağın açık araziye açıldığı kaşığın en ucuna koydum.</w:t>
-      </w:r>
-    </w:p>
-    <w:p>
-      <w:r>
-        <w:t xml:space="preserve">— Hepsinin yürüdüğü o sabah, diğerleri meydana gidip yoldan yukarı, senin ocağına doğru eğildi. O kardan adam diğer yöne gitti, arkadaşlarından üç metre öteye, eczaneyi geçip sokağın sonuna vardı. Önünde durup neye baktığını sordum ona. — Tek başına durduğu o kabuk parçasına dokundum. — Bir şeye baktığına kafayı takmıştım. Nerede durduğunu hiç sormadım. O ucun, bir minibüsün caddeden yanaşıp durabileceği ve Greta’nın tarafındaki hiç kimsenin onu göremeyeceği tek noktası üzerindeydi.</w:t>
+        <w:t>Ekmek tahtasından bir parça kabuk koparıp biberliğin hemen ötesine, ara sokağın açık araziye açıldığı kaşığın en ucuna koydum.</w:t>
+      </w:r>
+    </w:p>
+    <w:p>
+      <w:r>
+        <w:t xml:space="preserve">— Hepsinin yürüdüğü o sabah, diğerleri meydana gidip yoldan yukarı, senin ocağına doğru eğildi. O kardan adam diğer yöne gitti, arkadaşlarından üç metre öteye, eczaneyi geçip ara sokağın sonuna vardı. Önünde durup neye baktığını sordum ona. — Tek başına durduğu o kabuk parçasına dokundum. — Bir şeye baktığına kafayı takmıştım. Nerede durduğunu hiç sormadım. O ucun, bir minibüsün caddeden yanaşıp durabileceği ve Greta’nın tarafındaki hiç kimsenin onu göremeyeceği tek noktası üzerindeydi.</w:t>
       </w:r>
     </w:p>
     <w:p>
@@ -5289,7 +5289,7 @@
     </w:p>
     <w:p>
       <w:r>
-        <w:t xml:space="preserve">— Aklımı kaçırdığımı asla söylemedim, dedi Martha. Tuhaf dedim sadece. — Telefonu bana doğru çevirdi, böylece aydınlık ekrandaki arama kaydını görebildim. — Dün akşamüstü bir kadın aradı beni. Hoş sohbet, işine bağlı biri gibiydi. Bridgton'daki Wendt's Bakehouse'dan aradığını, Holly Jolly kapalı olduğundan Holly Jolly siparişimi seve seve temin edebileceklerini söyledi. İki çikolatalı-pekanlı turta ve bir düzine çörek, Şükran Günü'nden önceki çarşamba hazır olacakmış. — Telefonu indirdi. — Siparişimin aynısı. Çöreğine kadar.</w:t>
+        <w:t xml:space="preserve">— Aklımı kaçırdığımı asla söylemedim, dedi Martha. Tuhaf dedim sadece. — Telefonu bana doğru çevirdi, böylece aydınlık ekrandaki arama kaydını görebildim. — Dün akşamüstü bir kadın aradı beni. Kibar, iş bilir bir tavırla konuşuyordu. Bridgton'daki Wendt's Bakehouse'dan aradığını, Holly Jolly kapalı olduğundan Holly Jolly siparişimi seve seve temin edebileceklerini söyledi. İki çikolatalı-pekanlı turta ve bir düzine çörek, Şükran Günü'nden önceki çarşamba hazır olacakmış. — Telefonu indirdi. — Siparişimin aynısı. Çöreğine kadar.</w:t>
       </w:r>
     </w:p>
     <w:p>
@@ -5384,7 +5384,7 @@
     </w:p>
     <w:p>
       <w:r>
-        <w:t>Sipariş defteri, lambanın altında, üzerinde bir kurşun kalem ve yanında bir bloknotla tezgahta açık duruyordu. Yuvarlak büyük harfleriyle yarım sayfa dolusu telefon numarasını kopyalıyormuş meğer.</w:t>
+        <w:t>Sipariş defteri, lambanın altında, üzerinde bir kurşun kalem ve yanında bir bloknotla tezgahta açık duruyordu. İri, yuvarlak el yazısıyla yarım sayfa dolusu telefon numarasını kopyalıyormuş meğer.</w:t>
       </w:r>
     </w:p>
     <w:p>
@@ -5474,7 +5474,7 @@
     </w:p>
     <w:p>
       <w:r>
-        <w:t xml:space="preserve">— Pete çok şey söyler. — Greta, elinin ayasıyla gözünü hızla sildi, tıpkı üzerinden un siler gibiydi. — Bazı sabahlar kilidi asma zincirden sallanır halde buluyorum, tekrar yerine takıyorum. Onun yaptığını sandım. Ufaklık yapıp gıcıklık olsun diye. Sürgü kancama laf sokmak için söküp alıyor zannettim.</w:t>
+        <w:t xml:space="preserve">— Pete çok şey söyler. — Greta, elinin ayasıyla gözünü hızla sildi, tıpkı üzerinden un siler gibiydi. — Bazı sabahlar kilidi açık hâlde sallanırken buluyorum, tekrar zincire takıyorum. Onun yaptığını sandım. Ufaklık yapıp gıcıklık olsun diye. Sürgü kancama laf sokmak için söküp alıyor zannettim.</w:t>
       </w:r>
     </w:p>
     <w:p>
@@ -5494,7 +5494,7 @@
     </w:p>
     <w:p>
       <w:r>
-        <w:t>Geri döndüğümde tabureden hiç kıpırdamamıştı. Pip bütün ağırlığıyla Greta'nın bileğine yaslanmıştı, Greta ise boşta kalan elini hiç bakmadan kuşun sırtına koymuştu.</w:t>
+        <w:t>Geri döndüğümde tabureden hiç kıpırdamamıştı. Pip bütün ağırlığıyla Greta'nın ayak bileğine yaslanmıştı, Greta ise boşta kalan elini hiç bakmadan kuşun sırtına koymuştu.</w:t>
       </w:r>
     </w:p>
     <w:p>
@@ -5514,7 +5514,7 @@
     </w:p>
     <w:p>
       <w:r>
-        <w:t xml:space="preserve">— Bu işi sürdüremeyecek kadar yaşlı olduğumuzu. — Durdu ve devam etmeden önce yutkundu. — Pazartesi günü bana ton balıklı erişte getirdi. Annesinin tarifidir. İçinde bezelye ve üstünde ufalanmış patates cipsi vardır. Gittiğinden beri hiç tadına bakmamıştım. Gittikten hemen sonra tam burada dikilip yarısını doğrudan kaptan kaşıkladım ve bir aptal gibi içine doğru ağladım, dün akşam da kabı yıkayıp ona geri götürmek üzere kapının yanına koymuştum. — Kaba bakmadı bile. — Arabaya atlayıp bizzat Bridgton'a götürecektim. Kapısını çalacaktım.</w:t>
+        <w:t xml:space="preserve">— Bu küslüğü sürdüremeyecek kadar yaşlı olduğumuzu. — Durdu ve devam etmeden önce yutkundu. — Pazartesi günü bana ton balıklı erişte getirdi. Annesinin tarifidir. İçinde bezelye ve üstünde ufalanmış patates cipsi vardır. Gittiğinden beri hiç tadına bakmamıştım. Gittikten hemen sonra tam burada dikilip yarısını doğrudan kaptan kaşıkladım ve bir aptal gibi içine doğru ağladım, dün akşam da kabı yıkayıp ona geri götürmek üzere kapının yanına koymuştum. — Kaba bakmadı bile. — Arabaya atlayıp bizzat Bridgton'a götürecektim. Kapısını çalacaktım.</w:t>
       </w:r>
     </w:p>
     <w:p>
@@ -5544,7 +5544,7 @@
     </w:p>
     <w:p>
       <w:r>
-        <w:t>Pip olduğu yerde, bileğine yaslanmış vaziyette kaldı.</w:t>
+        <w:t>Pip olduğu yerde, ayak bileğine yaslanmış vaziyette kaldı.</w:t>
       </w:r>
     </w:p>
     <w:p>
@@ -5717,7 +5717,7 @@
     </w:p>
     <w:p>
       <w:r>
-        <w:t xml:space="preserve">— Deneyebilirim. — Yazıcı gürültülü bir sesle çalışmaya başladı ve kayıt sayfasını yavaşça dışarı itmeye koyuldu; Pip masanın altından kalkıp kâğıdın uç kısmını gagasından tuttu. Kâğıt çıktıkça gerisingeri yürüdü ve Claire ben geleli beri ilk kez gülmekten kendisini alamadı.</w:t>
+        <w:t xml:space="preserve">— Deneyebilirim. — Yazıcı gürültülü bir sesle çalışmaya başladı ve kayıt sayfasını yavaşça dışarı itmeye koyuldu; Pip masanın altından kalkıp kâğıdın uç kısmını gagasıyla tuttu. Kâğıt çıktıkça gerisingeri yürüdü ve Claire ben geleli beri ilk kez gülmekten kendisini alamadı.</w:t>
       </w:r>
     </w:p>
     <w:p>
@@ -5732,7 +5732,7 @@
     </w:p>
     <w:p>
       <w:r>
-        <w:t xml:space="preserve">Meydanı geçerken ortalık kararmıştı. Pete talaşları kapısına doğru süpürüyordu, tabela çoktan ters çevrilmişti ve son bir müşteri koltuğunun altında bir paketle ayrılıyordu. Beni içeri alıp süpürmeye devam etti.</w:t>
+        <w:t xml:space="preserve">Meydanı geçerken ortalık kararmaya başlamıştı. Pete talaşları kapısına doğru süpürüyordu, tabela çoktan ters çevrilmişti ve son bir müşteri koltuğunun altında bir paketle ayrılıyordu. Beni içeri alıp süpürmeye devam etti.</w:t>
       </w:r>
     </w:p>
     <w:p>
@@ -6028,7 +6028,7 @@
     </w:p>
     <w:p>
       <w:r>
-        <w:t xml:space="preserve">— Danny Ott, sabahın köründe Greta’nın eşiğinde ince, çevik bir siluet görmüş, uzak uca doğru gidiyormuş. Başka bir sabah kapısının önünde etiketinde altın yaldız olan bir koli görmüş. Claire’in kâğıdı, Greta’nın ağustos ayında yırtıp attığı avukat mektubunun arkasında Joyce’un olduğunu gösteriyor. — Kucağımda katlı duran kâğıda dokundum. — Renée’nin açılış haftası broşürünün taslağı ekim ayı boyunca kendi tezgahında dururken, Joyce ona numunelerle uğramış ve şikayet tam da o hafta gelmiş. Broşür Grange panosuna otuzundan önce asılmadı. Pelkey’in çuvalı yirmi yedisinde Bridgton’a gitti. Ve Doktor’un notu, kavanozumdaki tozun ekşitici bazla her testte birebir uyuştuğunu söylüyor.</w:t>
+        <w:t xml:space="preserve">— Danny Ott, sabahın köründe Greta’nın eşiğinde ince, çevik bir siluet görmüş, uzak uca doğru gidiyormuş. Başka bir sabah kapısının önünde etiketinde altın yaldız olan bir koli görmüş. Claire’in kâğıdı, Greta’nın ağustos ayında yırtıp attığı avukat mektubunun arkasında Joyce’un olduğunu gösteriyor. — Kucağımda katlı duran kâğıda dokundum. — Renée’nin açılış haftası broşürünün prova baskısı ekim ayı boyunca kendi tezgahında dururken, Joyce ona numunelerle uğramış ve şikayet tam da o hafta gelmiş. Broşür Grange panosuna otuzundan önce asılmadı. Pelkey’in çuvalı yirmi yedisinde Bridgton’a gitti. Ve Doktor’un notu, kavanozumdaki tozun ekşitici bazla her testte birebir uyuştuğunu söylüyor.</w:t>
       </w:r>
     </w:p>
     <w:p>
@@ -6078,7 +6078,7 @@
     </w:p>
     <w:p>
       <w:r>
-        <w:t xml:space="preserve">— Sugarplum’ın arkasındaki çöp konteynerinden olmalı, tuğlayla aynı yerden. Bloktaki herkesin eli uzanabilir oraya. — Sonraki kısmı açıkça söyledim, çünkü bunu borçluydum ve perşembe günü olsaydı bunu yapamazdım. — Renée Duval’ın bütün bunlarla uzaktan yakından bir ilgisi yoktu.</w:t>
+        <w:t xml:space="preserve">— Sugarplum’ın arkasındaki çöp konteynerinden olmalı, tuğlayla aynı yerden. Bloktaki herkesin eli uzanabilir oraya. — Sonraki kısmı açıkça söyledim, çünkü bunu borçluydum ve perşembe günü olsaydı bunu söylemezdim. — Renée Duval’ın bütün bunlarla uzaktan yakından bir ilgisi yoktu.</w:t>
       </w:r>
     </w:p>
     <w:p>
@@ -6093,7 +6093,7 @@
     </w:p>
     <w:p>
       <w:r>
-        <w:t xml:space="preserve">— Geçen seferki gibi. Tuzak kurmadan. — Faturalara parmağıyla hafifçe vurdu. — Kimse karanlıkta sokakta oturup onun çuvalla geri dönmesini beklemeyecek. Onu suçüstü yakalamama gerek yok. Kendisini öğleden sonra buraya çağıracağım, her şeyi açıkça önüne sereceğim ve o da cevap verecek.</w:t>
+        <w:t xml:space="preserve">— Geçen seferki gibi. Tuzak kurmadan. — Faturalara parmağıyla hafifçe vurdu. — Kimse karanlıkta ara sokakta oturup onun çuvalla geri dönmesini beklemeyecek. Onu suçüstü yakalamama gerek yok. Kendisini öğleden sonra buraya çağıracağım, her şeyi açıkça önüne sereceğim ve o da cevap verecek.</w:t>
       </w:r>
     </w:p>
     <w:p>
@@ -6375,7 +6375,7 @@
     <w:p/>
     <w:p>
       <w:r>
-        <w:t>Joyce içeri girdiğinden beri ağzını açmamıştı ve Joyce sustu.</w:t>
+        <w:t>Greta, Joyce içeri girdiğinden beri ağzını açmamıştı; Joyce sustu.</w:t>
       </w:r>
     </w:p>
     <w:p/>
@@ -6641,13 +6641,13 @@
     <w:p/>
     <w:p>
       <w:r>
-        <w:t xml:space="preserve">Her şey, daha önce söylediği gibi sessiz sedasız halledilmişti. Ne bir kalabalık vardı ne de gürültü. Doktor’un kilitli dolabından un kavanozumu, yanında kendi imzalı notuyla birlikte bizzat o almış, Danny’nin ifadesini de usulca, bir kenarda almış ve attığı her adımı o anda kaydetmişti.</w:t>
-      </w:r>
-    </w:p>
-    <w:p/>
-    <w:p>
-      <w:r>
-        <w:t>Küçük odası sobadan sıcacıktı. Pip, kapının yanındaki çöp sepetini es geçip pırıldayan bir şey bulma ümidiyle başını içeri uzattı.</w:t>
+        <w:t xml:space="preserve">Her şey, daha önce söylediği gibi sessiz sedasız halledilmişti. Ne bir salon vardı ne de kalabalık. Doktor’un kilitli dolabından un kavanozumu, yanında kendi imzalı notuyla birlikte bizzat o almış, Danny’nin ifadesini de usulca, bir kenarda almış ve attığı her adımı o anda kaydetmişti.</w:t>
+      </w:r>
+    </w:p>
+    <w:p/>
+    <w:p>
+      <w:r>
+        <w:t>Küçük odası sobadan sıcacıktı. Pip sıcağı bir kenara bırakıp kapının yanındaki çöp sepetine yöneldi ve pırıldayan bir şey bulma ümidiyle başını içine soktu.</w:t>
       </w:r>
     </w:p>
     <w:p/>
@@ -6725,7 +6725,7 @@
     <w:p/>
     <w:p>
       <w:r>
-        <w:t>Pip çöp sepetinden elinde bir ataçla çıkıp Tanaka’nın defterinin yanındaki kurutma kağıdının üzerine bıraktı.</w:t>
+        <w:t>Pip çöp sepetinden gagasında bir ataçla çıkıp Tanaka’nın defterinin yanındaki kurutma kağıdının üzerine bıraktı.</w:t>
       </w:r>
     </w:p>
     <w:p/>
@@ -6875,7 +6875,7 @@
     <w:p/>
     <w:p>
       <w:r>
-        <w:t xml:space="preserve">— Haksız olduğumu söyledi, geldiğim için teşekkür etti ve başka bir şey olup olmadığını sordu.</w:t>
+        <w:t xml:space="preserve">— Yanıldığımı söyledi, geldiğim için teşekkür etti ve başka bir şey olup olmadığını sordu.</w:t>
       </w:r>
     </w:p>
     <w:p/>
@@ -6928,7 +6928,7 @@
     <w:p/>
     <w:p>
       <w:r>
-        <w:t xml:space="preserve">Aynı sade haliyle, koltuğunun altında yassı deri dosyası, sırtında aynı ilçe kabanıyla geldi. Fakat Holly Jolly'nin kapısında ilk gelişinde üzerinde olmayan bir hafiflik vardı; ilk kez bir yere gönderilmiş olmaktan memnun görünen bir adamın haliydi bu. Tanaka kavanozu ve asılsız şikayeti ilçeye götürmüş, oradaki memurlar ellerindeki kağıtla ne kadar kurnazca oynandığını görüp düğüm düğüm çözmüştü. Geçici tedbir kararı kaldırılmıştı. Zaten o hafta yeniden denetim için uğraması gerekiyordu. Lavabonun parçası o sabah gelmiş, Tom da o daha gelmeden yerine takmıştı. Greta'nın mutfağındaki üç aşınmış dikiş yeri, caddedeki her eski mutfakta bulunan dikişlerle aynıydı ve artık onların da esamesi okunmuyordu. Varney kapı eşiğinde durup bunu yüksek sesle, bunu duymaya gelen insanlarla yarı yarıya dolmuş dükkanın ortasında söyledi.</w:t>
+        <w:t xml:space="preserve">Aynı sade haliyle, koltuğunun altında yassı deri dosyası, sırtında aynı ilçe kabanıyla geldi. Fakat Holly Jolly'nin kapısında ilk gelişinde üzerinde olmayan bir hafiflik vardı; bir kez olsun gönderildiği yerden memnun olan bir adamın haliydi bu. Tanaka kavanozu ve asılsız şikayeti ilçeye götürmüş, oradaki memurlar ellerindeki kağıtla ne kadar kurnazca oynandığını görüp düğüm düğüm çözmüştü. Geçici tedbir kararı kaldırılmıştı. Zaten o hafta yeniden denetim için uğraması gerekiyordu. Lavabonun parçası o sabah gelmiş, Tom da o daha gelmeden yerine takmıştı. Greta'nın mutfağındaki üç aşınmış dikiş yeri, caddedeki her eski mutfakta bulunan dikişlerle aynıydı ve artık onların da esamesi okunmuyordu. Varney kapı eşiğinde durup bunu yüksek sesle, bunu duymaya gelen insanlarla yarı yarıya dolmuş dükkanın ortasında söyledi.</w:t>
       </w:r>
     </w:p>
     <w:p/>
@@ -7090,7 +7090,7 @@
     <w:p/>
     <w:p>
       <w:r>
-        <w:t xml:space="preserve">— Onların bunu benim unum yapmasına izin vermedin, dedi. Hepsi bu kadardı. Gerisini şefin masasından Joyce'a söylemişti, bana bir daha tekrarlamasına gerek yoktu.</w:t>
+        <w:t xml:space="preserve">— Bunu benim unumun suçu yapmalarına izin vermedin, dedi. Hepsi bu kadardı. Gerisini şefin masasından Joyce'a söylemişti, bana bir daha tekrarlamasına gerek yoktu.</w:t>
       </w:r>
     </w:p>
     <w:p/>
@@ -7125,7 +7125,7 @@
     <w:p/>
     <w:p>
       <w:r>
-        <w:t xml:space="preserve">Cemiyeti ertesi gün kurtardık, hem de en zor yoldan.</w:t>
+        <w:t xml:space="preserve">Cemiyet'i ertesi gün kurtardık, hem de en zor yoldan.</w:t>
       </w:r>
     </w:p>
     <w:p/>
@@ -7461,7 +7461,7 @@
     <w:p/>
     <w:p>
       <w:r>
-        <w:t>Sonra Pip hamlesini yaptı. Kabanımın cebinde bir sardalya balığı olduğunu bilen bir kuşun parlak gözleriyle bütün akşam masanın etrafında turlayıp durmuştu. Gagasını cebe soktu, sardalyayı çıkardı ve ben onu ortasından kavrayıp yukarı kaldırana kadar kutunun kenarından içeri atmıştı bile.</w:t>
+        <w:t>Sonra Pip hamlesini yaptı. Kabanımın cebinde bir sardalya balığı olduğunu bilen bir kuşun parlak gözleriyle bütün akşam masanın etrafında turlayıp durmuştu. Gagasını cebe soktu, sardalyayı çıkardı ve ben onu ortasından kavrayıp yukarı kaldırana kadar sardalyayı kutunun kenarından içeri sarkıtmıştı bile.</w:t>
       </w:r>
     </w:p>
     <w:p/>
@@ -7732,7 +7732,7 @@
     <w:p/>
     <w:p>
       <w:r>
-        <w:t xml:space="preserve">Martha, yürüyüş yolunda beni yakaladı; Snowball bileğinin etrafında huysuzluk ediyor, Emma Redfern de arkasından veranda basamaklarından sekerek iniyordu, soğuktan ve koşmaktan yanakları al al olmuştu.</w:t>
+        <w:t xml:space="preserve">Martha, yürüyüş yolunda beni yakaladı; Snowball ayak bileğinin etrafında huysuzluk ediyor, Emma Redfern de arkasından veranda basamaklarından sekerek iniyordu, soğuktan ve koşmaktan yanakları al al olmuştu.</w:t>
       </w:r>
     </w:p>
     <w:p/>
@@ -7798,7 +7798,7 @@
     <w:p/>
     <w:p>
       <w:r>
-        <w:t xml:space="preserve">Paketlerimi yere bırakıp yanına gittim. Elimi tuttu ve yuvarlak tarla taşlarının üzerine düzce koydu. Avucumun altında sıcaktı ve bana gösterdiği günden beri olduğu gibi altın sarısı görünüyordu; ışık çıplak taşın ta kendisinden yükseliyordu. Ve ocağın içinde, daha önce hiçbir şeyin konulmadığı yerde, havadan aşağı inen birkaç altın iplik, kimsenin yakmadığı bir ateşin ilk közleri gibi alçak ve istikrarlı bir şekilde demir çubukların boyunca uzanıyordu.</w:t>
+        <w:t xml:space="preserve">Paketlerimi yere bırakıp yanına gittim. Elimi tuttu ve yuvarlak tarla taşlarının üzerine düzce koydu. Avucumun altında sıcaktı ve bana gösterdiği geceden beri olduğu gibi altın sarısı görünüyordu; ışık çıplak taşın ta kendisinden yükseliyordu. Ve ocağın içinde, daha önce hiçbir şeyin konulmadığı yerde, havadan aşağı inen birkaç altın iplik, kimsenin yakmadığı bir ateşin ilk közleri gibi alçak ve istikrarlı bir şekilde demir çubukların boyunca uzanıyordu.</w:t>
       </w:r>
     </w:p>
     <w:p/>
@@ -7973,7 +7973,7 @@
     </w:p>
     <w:p>
       <w:r>
-        <w:t>Demir anahtarı kilide sokarken elim titredi. Kilit kullanılmamaktan kaynaklanan iç sızlatan bir iniltiyle döndü ve ağır meşe kapı içeri doğru savrularak başının üzerindeki küçük pirinç zili çaldı. Çıngırak, kalın ve bekleyen sessizlik içinde neşeli, uyumsuz bir ses çıkardı.</w:t>
+        <w:t>Demir anahtarı kilide sokarken elim titredi. Kilit kullanılmamaktan kaynaklanan iç sızlatan bir iniltiyle döndü ve ağır meşe kapı içeri doğru savrularak başımın üzerindeki küçük pirinç zili çaldı. Çıngırak, kalın ve bekleyen sessizlik içinde neşeli, uyumsuz bir ses çıkardı.</w:t>
       </w:r>
     </w:p>
     <w:p>
@@ -7993,7 +7993,7 @@
     </w:p>
     <w:p>
       <w:r>
-        <w:t xml:space="preserve">Dükkan biriken tarihin bir felaketiydi. Kitaplar ulaşılabilir her yüzeyde tehlikeli kuleler halinde yığılmış, en ufak bir titreşimde çığ gibi düşmekle tehdit ediyordu. Geniş tahta döşemeli ve koyu renkli yer tahtaları makul botlarımın altında gıcırdıyordu. Sağımda, devasa dökme demir kitap presi orta çağ işkence aleti gibi dikiliyor, büyük tekerleği sessiz ve sabırlı duruyordu. Solumda uzun bir çalışma tezgahı; kemik katlayıcılar, ciltçi bizleri, sıyırma bıçakları gibi tanıdığım aletlerin bulanık sıvı kavanozları ve mermer kâğıt tabakalarıyla birlikte durduğu kaotik bir manzaraydı. Sanki neredeyse hiç hatırlamadığım büyük halam Maeve, işin ortasında buharlaşıp gitmişti.</w:t>
+        <w:t xml:space="preserve">Dükkan biriken tarihin bir felaketiydi. Kitaplar ulaşılabilir her yüzeyde tehlikeli kuleler halinde yığılmış, en ufak bir titreşimde çığ gibi düşmekle tehdit ediyordu. Geniş tahta döşemeli ve koyu renkli yer tahtaları makul botlarımın altında gıcırdıyordu. Sağımda, devasa dökme demir kitap presi orta çağ işkence aleti gibi dikiliyor, büyük tekerleği sessiz ve sabırlı duruyordu. Solumda uzun bir çalışma tezgahı; kemik katlayıcılar, ciltçi bizleri, sıyırma bıçakları gibi tanıdığım aletlerin bulanık sıvı kavanozları ve ebru kâğıdı tabakalarıyla birlikte durduğu kaotik bir manzaraydı. Sanki neredeyse hiç hatırlamadığım büyük halam Maeve, işin ortasında buharlaşıp gitmişti.</w:t>
       </w:r>
     </w:p>
     <w:p>
@@ -8003,7 +8003,7 @@
     </w:p>
     <w:p>
       <w:r>
-        <w:t>Yukarı çıkarken formüle ettiğim derli toplu ve düzenli bir liste olan planım gülünç derecede yetersiz geliyordu. Birinci Gün: Yüksek değerli eşyaların ilk değerlendirmesi ve envanteri. Bu kalabalık denizinde yüksek değeri ne oluşturuyordu? Bir hafta boyunca bir patika açmadan herhangi bir şeyi nasıl değerlendirebilirdim?</w:t>
+        <w:t>Arabayla buraya gelirken formüle ettiğim derli toplu ve düzenli bir liste olan planım gülünç derecede yetersiz geliyordu. Birinci Gün: Yüksek değerli eşyaların ilk değerlendirmesi ve envanteri. Bu dağınıklık denizinde yüksek değeri ne oluşturuyordu? Bir hafta boyunca bir patika açmadan herhangi bir şeyi nasıl değerlendirebilirdim?</w:t>
       </w:r>
     </w:p>
     <w:p>
@@ -8103,7 +8103,7 @@
     </w:p>
     <w:p>
       <w:r>
-        <w:t xml:space="preserve">— Tabii ki yapacaksın. Maeve tanıdığı en düzenli, mantıklı insan olduğunu söylerdi. Adli belge inceleyicisi! Büyüleyici. Bilim ve tarih hepsi bir arada. Varsayılan olarak neredeyse bir Pinecrest mesleği. — Işıldadı. — Tam da bu yüzden bu akşam gelmek zorundasın.</w:t>
+        <w:t xml:space="preserve">— Tabii ki yapacaksın. Maeve senin tanıdığı en düzenli, en mantıklı insan olduğunu söylerdi. Adli belge inceleyicisi! Büyüleyici. Bilim ve tarih hepsi bir arada. Varsayılan olarak neredeyse bir Pinecrest mesleği. — Işıldadı. — Tam da bu yüzden bu akşam gelmek zorundasın.</w:t>
       </w:r>
     </w:p>
     <w:p>
@@ -8113,7 +8113,7 @@
     </w:p>
     <w:p>
       <w:r>
-        <w:t xml:space="preserve">— Ay Işığı Maskeli Balosu’na! dedi, sanki dünyanın en bariz şeyiymiş gibi. Yıllık tarih cemiyeti balosu. Yılın en büyük olayı. Kim varsa orada olacak. Kendini kasabaya yeniden tanıtmanın, bilirsin, mükemmel yolu.</w:t>
+        <w:t xml:space="preserve">— Ay Işığı Maskeli Balosu’na! dedi, sanki dünyanın en bariz şeyiymiş gibi. Tarih Cemiyeti’nin yıllık balosu. Yılın en büyük olayı. Kim varsa orada olacak. Kendini kasabaya yeniden tanıtmanın, bilirsin, mükemmel yolu.</w:t>
       </w:r>
     </w:p>
     <w:p>

</xml_diff>